<commit_message>
v2: correct labels to S-palmitoyl cysteine only; rebuild splits, results, manuscript
</commit_message>
<xml_diff>
--- a/manuscript/PalmDL_manuscript.docx
+++ b/manuscript/PalmDL_manuscript.docx
@@ -79,7 +79,7 @@
         <w:t>Results.</w:t>
       </w:r>
       <w:r>
-        <w:t xml:space="preserve"> We assembled a versioned, evidence-stratified dataset from UniProt release 2026_03 comprising 71,594 labelled cysteine sites (6,805 S-palmitoyl sites, of which 477 are experimentally supported; 1,425 organisms; 572 human sites in 316 proteins) with explicitly separated hard (same-protein) and background negatives. Using a single model across four splitting protocols we show that conventional benchmarks leak severely: 43.7% of test positives share an identical 31-residue window with a training positive under a random site-level split and 40.2% under a protein-level split, inflating AUC from 0.950 to 0.990 and MCC from 0.745 to 0.843. We then developed PalmDL, a two-view ensemble that combines ESM-2 protein-language-model embeddings with motif/physicochemical features through a random forest. Under cluster-held-out cross-validation PalmDL reaches AUC 0.956 (95% CI 0.953–0.959), AUPR 0.849 and MCC 0.753; on held-out human sites it reaches AUC 0.901 (0.885–0.915), MCC 0.355 and balanced MCC 0.691; on a strict cross-species holdout, where no human data and no human-homologous cluster are seen during training, AUC is 0.822. PalmDL outperforms a CSS-Palm-style PWM, logistic regression, a multi-kernel CNN and each single view (ΔAUC +0.011 to +0.015 versus the best single model, paired bootstrap). Probabilities are Platt-calibrated (ECE 0.040 at natural prevalence). Two further analyses frame the biology rather than the algorithm: a cross-species transfer matrix shows that the palmitoylation code is eukaryotic rather than species-specific (mammalian models reach AUC 0.94–0.97 on other mammals and on plants, whereas bacterial lipidation is a different code, AUC ≈0.55), and calibrated scores support FDR-controlled shortlists (at 5% estimated FDR, precision 0.94 at 61% recall). In-silico mutagenesis recovers the known cysteine-cluster rule and exposes annotation errors in the training labels. Finally, a literature-mined external set of 136 sites from 91 papers — 98% of them outside UniProt — carries no canonical motif (PWM AUC 0.54); manual curation of 99 unambiguous sites and a ±2-residue numbering control leave the model at AUC 0.62 against same-protein cysteines, exposing a domain-shift limitation of annotation-trained predictors. Applied proteome-wide, the model yields a target–decoy-controlled shortlist of 322 human cysteines at 5% FDR (227 of them novel) that is enriched 16-fold for cytoplasmic topology. Adding AlphaFold-derived pLDDT and packing features lifts human-site AUC from 0.890 to 0.910 and the full model from 0.946 to 0.949 (5/5 folds), although it does not rescue the motif-atypical literature sites.</w:t>
+        <w:t xml:space="preserve"> We assembled a versioned, evidence-stratified dataset from UniProt release 2026_03 comprising 67,266 labelled cysteine sites (4,424 S-palmitoyl cysteine sites, of which 449 are experimentally supported; 786 organisms; 557 human sites in 312 proteins) with explicitly separated hard (same-protein) and background negatives. Restricting positives to S-palmitoyl cysteine excluded 2,381 N-/O-palmitoyl annotations that a permissive text filter had admitted, and the corrected folds share no identical 31-residue window between training and test. Using a single model across four protocols we show that conventional benchmarks leak severely: 41.1% of test positives share an identical window with a training positive under a random site-level split and 45.2% under a protein-level split, inflating AUC from 0.944 to 0.985 and MCC from 0.720 to 0.810. PalmDL, a two-view ensemble of ESM-2 embeddings and motif/physicochemical features, reaches AUC 0.944 (95% CI 0.940–0.948), AUPR 0.730 and MCC 0.611 under cluster-held-out cross-validation; on held-out human sites it reaches 0.914 (0.900–0.927), marginally above the best published human value of 0.900, and 0.885 on a strict species holdout. It outperforms a CSS-Palm-style PWM, logistic regression, a multi-kernel CNN and both single views (ΔAUC +0.013). Probabilities are Platt-calibrated (ECE 0.025 at natural prevalence). A six-species transfer matrix shows that the code is shared almost losslessly across mammals and partly with plants, whereas bacterial lipidation is a different modification and is excluded by construction. In-silico mutagenesis recovers the cysteine-cluster rule, and FDR-controlled operating points support shortlists for experimental follow-up. A literature-mined external set of 136 sites from 91 papers remains motif-atypical (AUC ≈0.59), which we report as a domain-shift limitation rather than as validation.</w:t>
       </w:r>
     </w:p>
     <w:p>
@@ -129,7 +129,7 @@
     </w:p>
     <w:p>
       <w:r>
-        <w:t>Three problems limit the comparability and credibility of this literature. First, negatives are almost always "all other cysteines" of the same proteins or random cysteines from unannotated proteins; the ratio and difficulty of negatives differ between studies, and accuracy or AUC computed on easy background negatives is not comparable across papers. Second, split protocols are rarely protein- or family-disjoint. Palmitoylation annotations are heavily propagated by similarity: in UniProt, 93% of S-palmitoyl cysteine annotations are inferred rather than experimentally determined, and orthologues across species carry identical 31-residue windows. A random site-level split therefore places the same peptide in training and test, and even a protein-level split does so whenever annotations were propagated between species. Third, no palmitoylation predictor has been tested on a species that was entirely absent from training, so it is unknown whether learned motifs transfer or whether they memorise species- and family-specific sequence context.</w:t>
+        <w:t>Three problems limit the comparability and credibility of this literature. First, negatives are almost always "all other cysteines" of the same proteins or random cysteines from unannotated proteins; the ratio and difficulty of negatives differ between studies, and accuracy or AUC computed on easy background negatives is not comparable across papers. Second, split protocols are rarely protein- or family-disjoint. Palmitoylation annotations are heavily propagated by similarity: in UniProt, 90% of S-palmitoyl cysteine annotations are inferred rather than experimentally determined, and orthologues across species carry identical 31-residue windows. A random site-level split therefore places the same peptide in training and test, and even a protein-level split does so whenever annotations were propagated between species. Third, no palmitoylation predictor has been tested on a species that was entirely absent from training, so it is unknown whether learned motifs transfer or whether they memorise species- and family-specific sequence context.</w:t>
       </w:r>
     </w:p>
     <w:p>
@@ -165,16 +165,25 @@
     </w:p>
     <w:p>
       <w:r>
-        <w:t xml:space="preserve">We queried UniProt release 2026_03 for all Swiss-Prot entries carrying at least one lipidation feature (9,089 entries) and parsed every feature whose description was "S-palmitoyl cysteine". After removing duplicates and sites outside the canonical sequence, the dataset contains </w:t>
+        <w:t xml:space="preserve">We queried UniProt release 2026_03 for all Swiss-Prot entries carrying at least one lipidation feature (9,089 entries) and kept only features whose note is </w:t>
       </w:r>
       <w:r>
         <w:rPr>
           <w:b/>
         </w:rPr>
-        <w:t>6,805 positive sites</w:t>
+        <w:t>S-palmitoyl cysteine</w:t>
       </w:r>
       <w:r>
-        <w:t>: 477 supported by experimental evidence codes and 6,328 inferred (mostly by similarity), distributed over 1,425 organisms, with human (572 sites in 316 proteins) and mouse (524) the largest contributors (Figure 1a,b). Most sites (4,155) have no annotated topology; of the annotated ones, 2,445 are cytoplasmic and only 42 extracellular (Figure 1c).</w:t>
+        <w:t xml:space="preserve"> on a cysteine residue. The first version of this filter matched any note containing "palmitoyl" and therefore admitted N-palmitoyl cysteine, N6-palmitoyl lysine and O-palmitoyl Ser/Thr; the corrected dataset contains </w:t>
+      </w:r>
+      <w:r>
+        <w:rPr>
+          <w:b/>
+        </w:rPr>
+        <w:t>4,424 positive sites</w:t>
+      </w:r>
+      <w:r>
+        <w:t>, 449 supported by experimental evidence codes and 3,975 inferred (mostly by similarity, 89.9%), from 786 organisms. Human (557 sites in 312 proteins) and mouse (511) are the largest contributors (Figure 1a,b). Of the annotated positives, 2,445 are cytoplasmic and only 27 extracellular (Figure 1c).</w:t>
       </w:r>
     </w:p>
     <w:p>
@@ -188,7 +197,7 @@
         <w:t>Hard negatives</w:t>
       </w:r>
       <w:r>
-        <w:t xml:space="preserve"> are unannotated cysteines of the same proteins whose ±15-residue windows do not overlap an annotated site (10,567 sites). </w:t>
+        <w:t xml:space="preserve"> are unannotated cysteines of the same proteins whose ±15-residue windows do not overlap any palmitoylation annotation, whatever its chemistry (8,620 sites). </w:t>
       </w:r>
       <w:r>
         <w:rPr>
@@ -197,7 +206,7 @@
         <w:t>Background negatives</w:t>
       </w:r>
       <w:r>
-        <w:t xml:space="preserve"> are cysteines sampled from 19,622 reviewed human proteins that carry no lipidation feature at all (54,222 sites). The final labelled set contains 71,594 cysteine sites from 23,897 proteins, with 64,143 distinct 31-residue windows. Metrics are stable when evaluation is restricted to the harder same-protein negatives (AUC 0.965 versus 0.956 on the full set; Table 3), so model ranking is not an artefact of easy background negatives.</w:t>
+        <w:t xml:space="preserve"> are cysteines sampled from 19,622 reviewed human proteins that carry no lipidation feature at all (54,222 sites). The final labelled set contains 67,266 cysteine sites from 21,568 proteins and 61,183 distinct 31-residue windows. Metrics remain high on the harder same-protein negatives alone (AUC 0.956; Table 3), so model ranking is not an artefact of easy background negatives.</w:t>
       </w:r>
     </w:p>
     <w:p>
@@ -221,24 +230,33 @@
         <w:rPr>
           <w:b/>
         </w:rPr>
-        <w:t>43.7% of test positives had an identical 31-residue window among the training positives</w:t>
+        <w:t>41.1% of test positives had an identical 31-residue window among the training positives</w:t>
       </w:r>
       <w:r>
-        <w:t xml:space="preserve">, and AUC reached 0.990 (MCC 0.843). A protein-level split, which is the most common precaution in the field, still leaked </w:t>
+        <w:t xml:space="preserve">, and AUC reached 0.980 (MCC 0.843). A protein-level split, the most common precaution in the field, still leaked </w:t>
       </w:r>
       <w:r>
         <w:rPr>
           <w:b/>
         </w:rPr>
-        <w:t>40.2%</w:t>
+        <w:t>45.2%</w:t>
       </w:r>
       <w:r>
-        <w:t xml:space="preserve"> of test windows and gave AUC 0.988. Cluster-level splitting removed the overlap entirely (0%) and reduced AUC to 0.950 and MCC to 0.745. Holding out an entire species reduced AUC to 0.822.</w:t>
+        <w:t xml:space="preserve"> of test windows and gave AUC 0.985 (MCC 0.810). Cluster-level splitting removed the overlap entirely — </w:t>
+      </w:r>
+      <w:r>
+        <w:rPr>
+          <w:b/>
+        </w:rPr>
+        <w:t>0% of any test row, positives and background negatives alike, shares a window with training</w:t>
+      </w:r>
+      <w:r>
+        <w:t xml:space="preserve"> — and reduced AUC to 0.944 and MCC to 0.720. Holding out an entire species gave AUC 0.885.</w:t>
       </w:r>
     </w:p>
     <w:p>
       <w:r>
-        <w:t>This audit has two consequences. First, headline numbers from site-level or protein-level splits cannot be compared with numbers from homology-controlled splits; a model reporting AUC &gt; 0.98 is likely measuring peptide memorisation. Second, the widely used CD-HIT 60% cut-off is insufficient on its own when 93% of labels are propagated by similarity, because identical windows can survive clustering if they are carried by short or partially covered proteins. We therefore report every result in this paper under cluster-level splits, and additionally under a species holdout.</w:t>
+        <w:t>This audit has two consequences. First, headline numbers from site-level or protein-level splits cannot be compared with numbers from homology-controlled splits; a model reporting AUC &gt; 0.97 is likely measuring peptide memorisation. Second, exact-window deduplication must cover the negative pool as well: in the first version of our splits, background proteins were not clustered and 751 windows (2,012 rows, almost all background negatives) crossed folds. Clustering every protein in the dataset and merging groups that share a window removes that residue. We therefore report every result in this paper under cluster-level splits, and additionally under a species holdout.</w:t>
       </w:r>
     </w:p>
     <w:p>
@@ -256,21 +274,21 @@
     </w:p>
     <w:p>
       <w:r>
-        <w:t>We compared five model families under identical cluster-held-out folds (Table 1, Figure 3). A CSS-Palm-style position-specific log-odds matrix, the classical baseline, reached AUC 0.862 and MCC 0.516. Logistic regression on the flattened one-hot window reached AUC 0.879. A multi-kernel CNN (kernel sizes 3, 5, 7 and 11; 32 filters; protein-context features) reached AUC 0.894. A random forest on one-hot and physicochemical channels reached AUC 0.945 and MCC 0.707. The strongest single view was a small MLP on frozen ESM-2 (35M) embeddings, computed separately for the mean of the window and for the central cysteine: AUC 0.941, MCC 0.741, AUPR 0.820.</w:t>
+        <w:t>We compared five model families under identical cluster-held-out folds (Table 1, Figure 3). A CSS-Palm-style position-specific log-odds matrix reached AUC 0.799 and MCC 0.344. Logistic regression on the flattened one-hot window reached AUC 0.829. A multi-kernel CNN reached AUC 0.854 and MCC 0.439. A random forest on one-hot and physicochemical channels reached AUC 0.931 and MCC 0.595. An MLP on frozen ESM-2 (35M) embeddings reached AUC 0.931 and MCC 0.612. After the label correction the two strongest views are therefore tied on discrimination, with ESM-2 better at fixing a decision threshold.</w:t>
       </w:r>
     </w:p>
     <w:p>
       <w:r>
-        <w:t xml:space="preserve">The two strongest views make different errors: the forest captures exact positional chemistry and local motif syntax, whereas ESM-2 embeddings capture evolutionary and structural context. A rank-average of the two, followed by Platt calibration, was selected on validation AUC among all 31 non-empty member subsets and reached </w:t>
+        <w:t xml:space="preserve">The two views make different errors: the forest captures exact positional chemistry and local motif syntax, whereas ESM-2 embeddings capture evolutionary and structural context. A rank-average of the two, followed by Platt calibration, was selected among all 31 non-empty member subsets by pooled validation AUC — never by test performance — and reached </w:t>
       </w:r>
       <w:r>
         <w:rPr>
           <w:b/>
         </w:rPr>
-        <w:t>AUC 0.956 (95% CI 0.953–0.959), AUPR 0.849, MCC 0.753, balanced MCC 0.767</w:t>
+        <w:t>AUC 0.944 (95% CI 0.940–0.948), AUPR 0.730, MCC 0.611 and balanced MCC 0.766</w:t>
       </w:r>
       <w:r>
-        <w:t xml:space="preserve"> (Table 1). Paired bootstrap over sites gives ΔAUC = +0.015 (95% CI 0.013–0.017) over ESM-2 alone and +0.011 (0.010–0.013) over the forest; both exclude zero. Adding the CNN to the ensemble did not improve validation AUC (0.9517 versus 0.9513) and reduced test AUC, so the simpler two-view model was retained.</w:t>
+        <w:t xml:space="preserve"> (Table 1). Paired bootstrap over sites gives ΔAUC = +0.013 (95% CI 0.012–0.016) over either single view; the interval excludes zero. Adding the CNN to the ensemble lowered validation AUC (0.9420 versus 0.9487), so the two-view model was retained.</w:t>
       </w:r>
     </w:p>
     <w:p>
@@ -294,10 +312,10 @@
         <w:rPr>
           <w:b/>
         </w:rPr>
-        <w:t>AUC 0.901 (0.885–0.915), AUPR 0.279, MCC 0.355 and balanced MCC 0.691</w:t>
+        <w:t>AUC 0.914 (0.900–0.927), AUPR 0.318, MCC 0.314 and balanced MCC 0.689</w:t>
       </w:r>
       <w:r>
-        <w:t>. A 4,000-replicate bootstrap against the best published human value, 0.900, gives P(AUC ≤ 0.900) = 0.46, so the two are statistically indistinguishable; the published general (multi-species) AUC of 0.855 is exceeded with P &lt; 0.001. We therefore claim parity with the state of the art on human sites, not superiority, and the protocol we used is stricter (zero shared windows, cluster-held-out). Training on human data alone gives essentially the same AUC (0.897), showing that the additional 6,233 non-human sites add little once homology is controlled — consistent with the fact that most non-human annotations are propagated from the same experimentally characterised proteins. On the strict species holdout, in which no human protein and no cluster containing a human protein is seen during training and every human-propagated annotation is removed, the best single model (random forest) reaches AUC 0.822 and balanced MCC 0.411. This 0.13 AUC gap between within-species and cross-species evaluation is, to our knowledge, the first direct measurement of how much palmitoylation predictors rely on species-specific context.</w:t>
+        <w:t>. A 4,000-replicate within-fold bootstrap against the best published human value, 0.900, gives P(AUC ≤ 0.900) = 0.025: the estimate is marginally above the published value, but its interval touches it, so we describe PalmDL as matching, not surpassing, the state of the art. Training on human data alone is, by validation AUC, best served by the ESM-2 view alone (0.892; random forest 0.879), showing that non-human sites add little once homology is controlled. On the strict species holdout, in which no human protein and no cluster containing a human protein is seen during training and every human-propagated annotation is removed, the random forest reaches AUC 0.885 and balanced MCC 0.614. The 0.029 AUC gap between within-species and cross-species evaluation is much smaller than the 0.13 gap we measured before the label correction, because the N-palmitoyl bacterial sites that previously dominated the non-human training set are gone; what remains is a modest, measurable cost of species-specific context.</w:t>
       </w:r>
     </w:p>
     <w:p>
@@ -315,7 +333,7 @@
     </w:p>
     <w:p>
       <w:r>
-        <w:t>Probabilities from the calibrated ensemble are reliable at natural prevalence (expected calibration error 0.040; Figure 5), whereas the uncalibrated forest has ECE ≈ 0.12 and over-confident tails. On the hard-negative benchmark (positives plus same-protein cysteines only, 1:1.55 ratio), PalmDL reaches AUC 0.965 and MCC 0.755, compared with 0.868/0.570 for the PWM baseline (Table 3), so the advantage is not an artefact of easy background negatives.</w:t>
+        <w:t>Probabilities from the calibrated ensemble are reliable at natural prevalence (ECE 0.025; Figure 5), whereas the uncalibrated forest has ECE ≈ 0.12 and over-confident tails. On the hard-negative benchmark (positives plus same-protein cysteines only, 1:1.95 ratio), PalmDL reaches AUC 0.956 and MCC 0.678, compared with 0.810/0.414 for the PWM baseline (Table 3), so the advantage is not an artefact of easy background negatives.</w:t>
       </w:r>
     </w:p>
     <w:p>
@@ -338,7 +356,7 @@
     </w:p>
     <w:p>
       <w:r>
-        <w:t>Table 4 places our results next to the numbers reported by previous methods. Three patterns are visible. First, the classical MCC values (0.45–0.67) were obtained under protocols that either reuse the training literature or do not hold out proteins, and the only classical tool that reported an independent test (CSS-Palm 2.0) dropped from MCC 0.671 to 0.523 when it did so. Second, the two deep-learning systems with published AUCs (GPS-Palm 0.900, pCysMod 0.807) report no cross-species and no explicit protein-disjoint evaluation, so their operating point is unknown. Third, the highest published number (Deep-Palm, 0.931) comes from a site-level 80/20 split, precisely the protocol that our audit shows to leak ~44% of windows. PalmDL's 0.956 is obtained with zero shared windows, and its human-only estimate, 0.901, is on a par with the best published human AUC while being the only one accompanied by a leakage audit, a calibration analysis and a cross-species holdout. Because we could not rerun GPS-Palm or the retired classical tools on our folds, Table 4 compares protocols as much as algorithms; the released fold files remove this obstacle for future work.</w:t>
+        <w:t>Table 4 places our results next to the numbers reported by previous methods. Three patterns are visible. First, classical MCC values (0.45–0.67) were obtained under protocols that either reuse the training literature or do not hold out proteins, and the only classical tool with an independent test (CSS-Palm 2.0) dropped from MCC 0.671 to 0.523 when it did so. Second, the deep-learning systems with published AUCs (GPS-Palm 0.900, pCysMod 0.807) report neither cross-species nor explicit protein-disjoint evaluation. Third, the highest published number (Deep-Palm 0.931) comes from a site-level split, precisely the protocol that our audit shows to leak 41–45% of windows. PalmDL's 0.944 is obtained with zero shared windows, and its human estimate, 0.914, is marginally above the best published human AUC while being the only one accompanied by a leakage audit, a calibration analysis and a cross-species holdout. Because we could not rerun GPS-Palm or the retired classical tools on our folds, Table 4 compares protocols as much as algorithms; the released fold files remove this obstacle for future work.</w:t>
       </w:r>
     </w:p>
     <w:p>
@@ -1229,7 +1247,7 @@
               <w:rPr>
                 <w:sz w:val="16"/>
               </w:rPr>
-              <w:t>cluster-held-out CV, 6,805 sites</w:t>
+              <w:t>cluster-held-out CV, 4,424 sites</w:t>
             </w:r>
           </w:p>
         </w:tc>
@@ -1248,7 +1266,7 @@
                 <w:b/>
                 <w:sz w:val="16"/>
               </w:rPr>
-              <w:t>AUC 0.956, MCC 0.753</w:t>
+              <w:t>AUC 0.944, MCC 0.611</w:t>
             </w:r>
           </w:p>
         </w:tc>
@@ -1342,7 +1360,7 @@
                 <w:b/>
                 <w:sz w:val="16"/>
               </w:rPr>
-              <w:t>AUC 0.901, balanced MCC 0.691</w:t>
+              <w:t>AUC 0.914, balanced MCC 0.689</w:t>
             </w:r>
           </w:p>
         </w:tc>
@@ -1435,7 +1453,7 @@
               <w:rPr>
                 <w:sz w:val="16"/>
               </w:rPr>
-              <w:t>AUC 0.822, balanced MCC 0.411</w:t>
+              <w:t>AUC 0.885, balanced MCC 0.614</w:t>
             </w:r>
           </w:p>
         </w:tc>
@@ -1470,17 +1488,21 @@
           <w:color w:val="000000"/>
           <w:sz w:val="22"/>
         </w:rPr>
-        <w:t>2.7 The palmitoylation code is eukaryotic, not species-specific</w:t>
+        <w:t>2.7 The palmitoylation code is shared across mammals and partly with plants</w:t>
       </w:r>
     </w:p>
     <w:p>
       <w:r>
-        <w:t>The species holdout in §2.4 removes every human-homologous cluster and therefore measures transfer to genuinely novel families. To separate that from ordinary cross-species transfer we trained a separate PalmDL model on each of eight species with at least 85 annotated sites and evaluated every model on every species (Figure 7, Table 5). Three regimes emerge.</w:t>
+        <w:t xml:space="preserve">The species holdout in §2.4 removes every human-homologous cluster and therefore measures transfer to genuinely novel families. To separate that from ordinary cross-species transfer we trained a separate PalmDL model on each of the six species with at least 85 S-palmitoyl cysteine sites (human, mouse, rat, cattle, pig, </w:t>
       </w:r>
-    </w:p>
-    <w:p>
       <w:r>
-        <w:t xml:space="preserve">First, </w:t>
+        <w:rPr>
+          <w:i/>
+        </w:rPr>
+        <w:t>A. thaliana</w:t>
+      </w:r>
+      <w:r>
+        <w:t xml:space="preserve">) and evaluated every model on every species, excluding target rows whose cluster appears in training (Figure 7, Table 5). Two regimes emerge. First, </w:t>
       </w:r>
       <w:r>
         <w:rPr>
@@ -1489,16 +1511,16 @@
         <w:t>mammals share one code</w:t>
       </w:r>
       <w:r>
-        <w:t xml:space="preserve">. Models trained on human, mouse, rat, cattle or pig reach AUC 0.86–0.98 on the other mammals, with a mean of 0.943 that is indistinguishable from the mean within-species diagonal (0.944). Second, </w:t>
+        <w:t xml:space="preserve">: models trained on human, mouse, rat, cattle or pig reach 0.85–0.95 on the other mammals, comparable to the within-species diagonal. Second, </w:t>
       </w:r>
       <w:r>
         <w:rPr>
           <w:b/>
         </w:rPr>
-        <w:t>the code extends to plants</w:t>
+        <w:t>the code extends in part to plants</w:t>
       </w:r>
       <w:r>
-        <w:t xml:space="preserve">: mammalian models reach 0.965 on </w:t>
+        <w:t xml:space="preserve">: mammalian models reach 0.96–0.98 on </w:t>
       </w:r>
       <w:r>
         <w:rPr>
@@ -1507,39 +1529,12 @@
         <w:t>A. thaliana</w:t>
       </w:r>
       <w:r>
-        <w:t xml:space="preserve">, and in the reverse direction the plant model reaches 0.763 on mammals — lower, but far above chance. Third, </w:t>
-      </w:r>
-      <w:r>
-        <w:rPr>
-          <w:b/>
-        </w:rPr>
-        <w:t>bacterial lipidation is a different modification</w:t>
-      </w:r>
-      <w:r>
-        <w:t xml:space="preserve">: </w:t>
-      </w:r>
-      <w:r>
-        <w:rPr>
-          <w:i/>
-        </w:rPr>
-        <w:t>E. coli</w:t>
-      </w:r>
-      <w:r>
-        <w:t xml:space="preserve"> and </w:t>
-      </w:r>
-      <w:r>
-        <w:rPr>
-          <w:i/>
-        </w:rPr>
-        <w:t>B. subtilis</w:t>
-      </w:r>
-      <w:r>
-        <w:t xml:space="preserve"> models are at chance on mammalian sites (0.551), and mammalian models transfer only weakly to bacteria (0.671), while the two bacterial models transfer to each other almost perfectly (0.95–1.00). This is biologically expected — bacterial lipoproteins are N-acylated at the LipoBox rather than S-palmitoylated at a cysteine — and it confirms that the model has learned a eukaryotic motif rather than a generic "hydrophobic cysteine" rule.</w:t>
+        <w:t xml:space="preserve"> in the held-out-cluster setting, whereas the plant model reaches 0.70–0.85 on mammals — lower, but far above chance. Bacterial lipidation no longer enters the analysis, because after the label correction the bacterial positives are N-palmitoyl cysteines, a different modification that cannot be used to study the S-palmitoylation code.</w:t>
       </w:r>
     </w:p>
     <w:p>
       <w:r>
-        <w:t>The contrast with §2.4 is the key point. Cross-species transfer with orthologues available is essentially free (0.94), but transfer to human families absent from training is much harder (0.822). Most of the apparent generality of palmitoylation predictors therefore comes from orthologue coverage, not from an abstract motif grammar.</w:t>
+        <w:t>The contrast with §2.4 is the key point. Cross-species transfer with orthologues available is essentially free (≈0.94), whereas transfer to human families absent from training is 0.885; most of the apparent generality of palmitoylation predictors therefore comes from orthologue coverage, not from an abstract motif grammar.</w:t>
       </w:r>
     </w:p>
     <w:p>
@@ -1559,20 +1554,18 @@
         <w:tblLook w:firstColumn="1" w:firstRow="1" w:lastColumn="0" w:lastRow="0" w:noHBand="0" w:noVBand="1" w:val="04A0"/>
       </w:tblPr>
       <w:tblGrid>
-        <w:gridCol w:w="1058"/>
-        <w:gridCol w:w="1058"/>
-        <w:gridCol w:w="1058"/>
-        <w:gridCol w:w="1058"/>
-        <w:gridCol w:w="1058"/>
-        <w:gridCol w:w="1058"/>
-        <w:gridCol w:w="1058"/>
-        <w:gridCol w:w="1058"/>
-        <w:gridCol w:w="1058"/>
+        <w:gridCol w:w="1360"/>
+        <w:gridCol w:w="1360"/>
+        <w:gridCol w:w="1360"/>
+        <w:gridCol w:w="1360"/>
+        <w:gridCol w:w="1360"/>
+        <w:gridCol w:w="1360"/>
+        <w:gridCol w:w="1360"/>
       </w:tblGrid>
       <w:tr>
         <w:tc>
           <w:tcPr>
-            <w:tcW w:type="dxa" w:w="1058"/>
+            <w:tcW w:type="dxa" w:w="1360"/>
           </w:tcPr>
           <w:p>
             <w:r/>
@@ -1587,7 +1580,7 @@
         </w:tc>
         <w:tc>
           <w:tcPr>
-            <w:tcW w:type="dxa" w:w="1058"/>
+            <w:tcW w:type="dxa" w:w="1360"/>
           </w:tcPr>
           <w:p>
             <w:r/>
@@ -1602,7 +1595,7 @@
         </w:tc>
         <w:tc>
           <w:tcPr>
-            <w:tcW w:type="dxa" w:w="1058"/>
+            <w:tcW w:type="dxa" w:w="1360"/>
           </w:tcPr>
           <w:p>
             <w:r/>
@@ -1617,7 +1610,7 @@
         </w:tc>
         <w:tc>
           <w:tcPr>
-            <w:tcW w:type="dxa" w:w="1058"/>
+            <w:tcW w:type="dxa" w:w="1360"/>
           </w:tcPr>
           <w:p>
             <w:r/>
@@ -1632,7 +1625,7 @@
         </w:tc>
         <w:tc>
           <w:tcPr>
-            <w:tcW w:type="dxa" w:w="1058"/>
+            <w:tcW w:type="dxa" w:w="1360"/>
           </w:tcPr>
           <w:p>
             <w:r/>
@@ -1647,7 +1640,7 @@
         </w:tc>
         <w:tc>
           <w:tcPr>
-            <w:tcW w:type="dxa" w:w="1058"/>
+            <w:tcW w:type="dxa" w:w="1360"/>
           </w:tcPr>
           <w:p>
             <w:r/>
@@ -1662,7 +1655,7 @@
         </w:tc>
         <w:tc>
           <w:tcPr>
-            <w:tcW w:type="dxa" w:w="1058"/>
+            <w:tcW w:type="dxa" w:w="1360"/>
           </w:tcPr>
           <w:p>
             <w:r/>
@@ -1671,37 +1664,7 @@
                 <w:b/>
                 <w:sz w:val="16"/>
               </w:rPr>
-              <w:t>*A. thaliana*</w:t>
-            </w:r>
-          </w:p>
-        </w:tc>
-        <w:tc>
-          <w:tcPr>
-            <w:tcW w:type="dxa" w:w="1058"/>
-          </w:tcPr>
-          <w:p>
-            <w:r/>
-            <w:r>
-              <w:rPr>
-                <w:b/>
-                <w:sz w:val="16"/>
-              </w:rPr>
-              <w:t>*E. coli*</w:t>
-            </w:r>
-          </w:p>
-        </w:tc>
-        <w:tc>
-          <w:tcPr>
-            <w:tcW w:type="dxa" w:w="1058"/>
-          </w:tcPr>
-          <w:p>
-            <w:r/>
-            <w:r>
-              <w:rPr>
-                <w:b/>
-                <w:sz w:val="16"/>
-              </w:rPr>
-              <w:t>*B. subtilis*</w:t>
+              <w:t>A. thaliana</w:t>
             </w:r>
           </w:p>
         </w:tc>
@@ -1709,7 +1672,7 @@
       <w:tr>
         <w:tc>
           <w:tcPr>
-            <w:tcW w:type="dxa" w:w="1058"/>
+            <w:tcW w:type="dxa" w:w="1360"/>
           </w:tcPr>
           <w:p>
             <w:r>
@@ -1727,145 +1690,109 @@
         </w:tc>
         <w:tc>
           <w:tcPr>
-            <w:tcW w:type="dxa" w:w="1058"/>
-          </w:tcPr>
-          <w:p>
-            <w:r>
-              <w:rPr>
-                <w:sz w:val="16"/>
-              </w:rPr>
-            </w:r>
-            <w:r>
-              <w:rPr>
-                <w:sz w:val="16"/>
-              </w:rPr>
-              <w:t>0.914</w:t>
-            </w:r>
-          </w:p>
-        </w:tc>
-        <w:tc>
-          <w:tcPr>
-            <w:tcW w:type="dxa" w:w="1058"/>
-          </w:tcPr>
-          <w:p>
-            <w:r>
-              <w:rPr>
-                <w:sz w:val="16"/>
-              </w:rPr>
-            </w:r>
-            <w:r>
-              <w:rPr>
-                <w:sz w:val="16"/>
-              </w:rPr>
-              <w:t>0.963</w:t>
-            </w:r>
-          </w:p>
-        </w:tc>
-        <w:tc>
-          <w:tcPr>
-            <w:tcW w:type="dxa" w:w="1058"/>
-          </w:tcPr>
-          <w:p>
-            <w:r>
-              <w:rPr>
-                <w:sz w:val="16"/>
-              </w:rPr>
-            </w:r>
-            <w:r>
-              <w:rPr>
-                <w:sz w:val="16"/>
-              </w:rPr>
-              <w:t>0.966</w:t>
-            </w:r>
-          </w:p>
-        </w:tc>
-        <w:tc>
-          <w:tcPr>
-            <w:tcW w:type="dxa" w:w="1058"/>
-          </w:tcPr>
-          <w:p>
-            <w:r>
-              <w:rPr>
-                <w:sz w:val="16"/>
-              </w:rPr>
-            </w:r>
-            <w:r>
-              <w:rPr>
-                <w:sz w:val="16"/>
-              </w:rPr>
-              <w:t>0.973</w:t>
-            </w:r>
-          </w:p>
-        </w:tc>
-        <w:tc>
-          <w:tcPr>
-            <w:tcW w:type="dxa" w:w="1058"/>
-          </w:tcPr>
-          <w:p>
-            <w:r>
-              <w:rPr>
-                <w:sz w:val="16"/>
-              </w:rPr>
-            </w:r>
-            <w:r>
-              <w:rPr>
-                <w:sz w:val="16"/>
-              </w:rPr>
-              <w:t>0.968</w:t>
-            </w:r>
-          </w:p>
-        </w:tc>
-        <w:tc>
-          <w:tcPr>
-            <w:tcW w:type="dxa" w:w="1058"/>
-          </w:tcPr>
-          <w:p>
-            <w:r>
-              <w:rPr>
-                <w:sz w:val="16"/>
-              </w:rPr>
-            </w:r>
-            <w:r>
-              <w:rPr>
-                <w:sz w:val="16"/>
-              </w:rPr>
-              <w:t>0.973</w:t>
-            </w:r>
-          </w:p>
-        </w:tc>
-        <w:tc>
-          <w:tcPr>
-            <w:tcW w:type="dxa" w:w="1058"/>
-          </w:tcPr>
-          <w:p>
-            <w:r>
-              <w:rPr>
-                <w:sz w:val="16"/>
-              </w:rPr>
-            </w:r>
-            <w:r>
-              <w:rPr>
-                <w:sz w:val="16"/>
-              </w:rPr>
-              <w:t>0.599</w:t>
-            </w:r>
-          </w:p>
-        </w:tc>
-        <w:tc>
-          <w:tcPr>
-            <w:tcW w:type="dxa" w:w="1058"/>
-          </w:tcPr>
-          <w:p>
-            <w:r>
-              <w:rPr>
-                <w:sz w:val="16"/>
-              </w:rPr>
-            </w:r>
-            <w:r>
-              <w:rPr>
-                <w:sz w:val="16"/>
-              </w:rPr>
-              <w:t>0.759</w:t>
+            <w:tcW w:type="dxa" w:w="1360"/>
+          </w:tcPr>
+          <w:p>
+            <w:r>
+              <w:rPr>
+                <w:sz w:val="16"/>
+              </w:rPr>
+            </w:r>
+            <w:r>
+              <w:rPr>
+                <w:sz w:val="16"/>
+              </w:rPr>
+              <w:t>0.926</w:t>
+            </w:r>
+          </w:p>
+        </w:tc>
+        <w:tc>
+          <w:tcPr>
+            <w:tcW w:type="dxa" w:w="1360"/>
+          </w:tcPr>
+          <w:p>
+            <w:r>
+              <w:rPr>
+                <w:sz w:val="16"/>
+              </w:rPr>
+            </w:r>
+            <w:r>
+              <w:rPr>
+                <w:sz w:val="16"/>
+              </w:rPr>
+              <w:t>0.900</w:t>
+            </w:r>
+          </w:p>
+        </w:tc>
+        <w:tc>
+          <w:tcPr>
+            <w:tcW w:type="dxa" w:w="1360"/>
+          </w:tcPr>
+          <w:p>
+            <w:r>
+              <w:rPr>
+                <w:sz w:val="16"/>
+              </w:rPr>
+            </w:r>
+            <w:r>
+              <w:rPr>
+                <w:sz w:val="16"/>
+              </w:rPr>
+              <w:t>0.896</w:t>
+            </w:r>
+          </w:p>
+        </w:tc>
+        <w:tc>
+          <w:tcPr>
+            <w:tcW w:type="dxa" w:w="1360"/>
+          </w:tcPr>
+          <w:p>
+            <w:r>
+              <w:rPr>
+                <w:sz w:val="16"/>
+              </w:rPr>
+            </w:r>
+            <w:r>
+              <w:rPr>
+                <w:sz w:val="16"/>
+              </w:rPr>
+              <w:t>0.920</w:t>
+            </w:r>
+          </w:p>
+        </w:tc>
+        <w:tc>
+          <w:tcPr>
+            <w:tcW w:type="dxa" w:w="1360"/>
+          </w:tcPr>
+          <w:p>
+            <w:r>
+              <w:rPr>
+                <w:sz w:val="16"/>
+              </w:rPr>
+            </w:r>
+            <w:r>
+              <w:rPr>
+                <w:sz w:val="16"/>
+              </w:rPr>
+              <w:t>—</w:t>
+            </w:r>
+          </w:p>
+        </w:tc>
+        <w:tc>
+          <w:tcPr>
+            <w:tcW w:type="dxa" w:w="1360"/>
+          </w:tcPr>
+          <w:p>
+            <w:r>
+              <w:rPr>
+                <w:sz w:val="16"/>
+              </w:rPr>
+            </w:r>
+            <w:r>
+              <w:rPr>
+                <w:sz w:val="16"/>
+              </w:rPr>
+              <w:t>0.983</w:t>
             </w:r>
           </w:p>
         </w:tc>
@@ -1873,7 +1800,7 @@
       <w:tr>
         <w:tc>
           <w:tcPr>
-            <w:tcW w:type="dxa" w:w="1058"/>
+            <w:tcW w:type="dxa" w:w="1360"/>
           </w:tcPr>
           <w:p>
             <w:r>
@@ -1891,145 +1818,109 @@
         </w:tc>
         <w:tc>
           <w:tcPr>
-            <w:tcW w:type="dxa" w:w="1058"/>
-          </w:tcPr>
-          <w:p>
-            <w:r>
-              <w:rPr>
-                <w:sz w:val="16"/>
-              </w:rPr>
-            </w:r>
-            <w:r>
-              <w:rPr>
-                <w:sz w:val="16"/>
-              </w:rPr>
-              <w:t>0.958</w:t>
-            </w:r>
-          </w:p>
-        </w:tc>
-        <w:tc>
-          <w:tcPr>
-            <w:tcW w:type="dxa" w:w="1058"/>
-          </w:tcPr>
-          <w:p>
-            <w:r>
-              <w:rPr>
-                <w:sz w:val="16"/>
-              </w:rPr>
-            </w:r>
-            <w:r>
-              <w:rPr>
-                <w:sz w:val="16"/>
-              </w:rPr>
-              <w:t>0.888</w:t>
-            </w:r>
-          </w:p>
-        </w:tc>
-        <w:tc>
-          <w:tcPr>
-            <w:tcW w:type="dxa" w:w="1058"/>
-          </w:tcPr>
-          <w:p>
-            <w:r>
-              <w:rPr>
-                <w:sz w:val="16"/>
-              </w:rPr>
-            </w:r>
-            <w:r>
-              <w:rPr>
-                <w:sz w:val="16"/>
-              </w:rPr>
-              <w:t>0.976</w:t>
-            </w:r>
-          </w:p>
-        </w:tc>
-        <w:tc>
-          <w:tcPr>
-            <w:tcW w:type="dxa" w:w="1058"/>
-          </w:tcPr>
-          <w:p>
-            <w:r>
-              <w:rPr>
-                <w:sz w:val="16"/>
-              </w:rPr>
-            </w:r>
-            <w:r>
-              <w:rPr>
-                <w:sz w:val="16"/>
-              </w:rPr>
-              <w:t>0.974</w:t>
-            </w:r>
-          </w:p>
-        </w:tc>
-        <w:tc>
-          <w:tcPr>
-            <w:tcW w:type="dxa" w:w="1058"/>
-          </w:tcPr>
-          <w:p>
-            <w:r>
-              <w:rPr>
-                <w:sz w:val="16"/>
-              </w:rPr>
-            </w:r>
-            <w:r>
-              <w:rPr>
-                <w:sz w:val="16"/>
-              </w:rPr>
-              <w:t>0.963</w:t>
-            </w:r>
-          </w:p>
-        </w:tc>
-        <w:tc>
-          <w:tcPr>
-            <w:tcW w:type="dxa" w:w="1058"/>
-          </w:tcPr>
-          <w:p>
-            <w:r>
-              <w:rPr>
-                <w:sz w:val="16"/>
-              </w:rPr>
-            </w:r>
-            <w:r>
-              <w:rPr>
-                <w:sz w:val="16"/>
-              </w:rPr>
-              <w:t>0.970</w:t>
-            </w:r>
-          </w:p>
-        </w:tc>
-        <w:tc>
-          <w:tcPr>
-            <w:tcW w:type="dxa" w:w="1058"/>
-          </w:tcPr>
-          <w:p>
-            <w:r>
-              <w:rPr>
-                <w:sz w:val="16"/>
-              </w:rPr>
-            </w:r>
-            <w:r>
-              <w:rPr>
-                <w:sz w:val="16"/>
-              </w:rPr>
-              <w:t>0.389</w:t>
-            </w:r>
-          </w:p>
-        </w:tc>
-        <w:tc>
-          <w:tcPr>
-            <w:tcW w:type="dxa" w:w="1058"/>
-          </w:tcPr>
-          <w:p>
-            <w:r>
-              <w:rPr>
-                <w:sz w:val="16"/>
-              </w:rPr>
-            </w:r>
-            <w:r>
-              <w:rPr>
-                <w:sz w:val="16"/>
-              </w:rPr>
-              <w:t>0.604</w:t>
+            <w:tcW w:type="dxa" w:w="1360"/>
+          </w:tcPr>
+          <w:p>
+            <w:r>
+              <w:rPr>
+                <w:sz w:val="16"/>
+              </w:rPr>
+            </w:r>
+            <w:r>
+              <w:rPr>
+                <w:sz w:val="16"/>
+              </w:rPr>
+              <w:t>0.901</w:t>
+            </w:r>
+          </w:p>
+        </w:tc>
+        <w:tc>
+          <w:tcPr>
+            <w:tcW w:type="dxa" w:w="1360"/>
+          </w:tcPr>
+          <w:p>
+            <w:r>
+              <w:rPr>
+                <w:sz w:val="16"/>
+              </w:rPr>
+            </w:r>
+            <w:r>
+              <w:rPr>
+                <w:sz w:val="16"/>
+              </w:rPr>
+              <w:t>0.874</w:t>
+            </w:r>
+          </w:p>
+        </w:tc>
+        <w:tc>
+          <w:tcPr>
+            <w:tcW w:type="dxa" w:w="1360"/>
+          </w:tcPr>
+          <w:p>
+            <w:r>
+              <w:rPr>
+                <w:sz w:val="16"/>
+              </w:rPr>
+            </w:r>
+            <w:r>
+              <w:rPr>
+                <w:sz w:val="16"/>
+              </w:rPr>
+              <w:t>0.909</w:t>
+            </w:r>
+          </w:p>
+        </w:tc>
+        <w:tc>
+          <w:tcPr>
+            <w:tcW w:type="dxa" w:w="1360"/>
+          </w:tcPr>
+          <w:p>
+            <w:r>
+              <w:rPr>
+                <w:sz w:val="16"/>
+              </w:rPr>
+            </w:r>
+            <w:r>
+              <w:rPr>
+                <w:sz w:val="16"/>
+              </w:rPr>
+              <w:t>0.912</w:t>
+            </w:r>
+          </w:p>
+        </w:tc>
+        <w:tc>
+          <w:tcPr>
+            <w:tcW w:type="dxa" w:w="1360"/>
+          </w:tcPr>
+          <w:p>
+            <w:r>
+              <w:rPr>
+                <w:sz w:val="16"/>
+              </w:rPr>
+            </w:r>
+            <w:r>
+              <w:rPr>
+                <w:sz w:val="16"/>
+              </w:rPr>
+              <w:t>0.906</w:t>
+            </w:r>
+          </w:p>
+        </w:tc>
+        <w:tc>
+          <w:tcPr>
+            <w:tcW w:type="dxa" w:w="1360"/>
+          </w:tcPr>
+          <w:p>
+            <w:r>
+              <w:rPr>
+                <w:sz w:val="16"/>
+              </w:rPr>
+            </w:r>
+            <w:r>
+              <w:rPr>
+                <w:sz w:val="16"/>
+              </w:rPr>
+              <w:t>0.977</w:t>
             </w:r>
           </w:p>
         </w:tc>
@@ -2037,7 +1928,7 @@
       <w:tr>
         <w:tc>
           <w:tcPr>
-            <w:tcW w:type="dxa" w:w="1058"/>
+            <w:tcW w:type="dxa" w:w="1360"/>
           </w:tcPr>
           <w:p>
             <w:r>
@@ -2055,145 +1946,109 @@
         </w:tc>
         <w:tc>
           <w:tcPr>
-            <w:tcW w:type="dxa" w:w="1058"/>
-          </w:tcPr>
-          <w:p>
-            <w:r>
-              <w:rPr>
-                <w:sz w:val="16"/>
-              </w:rPr>
-            </w:r>
-            <w:r>
-              <w:rPr>
-                <w:sz w:val="16"/>
-              </w:rPr>
-              <w:t>0.943</w:t>
-            </w:r>
-          </w:p>
-        </w:tc>
-        <w:tc>
-          <w:tcPr>
-            <w:tcW w:type="dxa" w:w="1058"/>
-          </w:tcPr>
-          <w:p>
-            <w:r>
-              <w:rPr>
-                <w:sz w:val="16"/>
-              </w:rPr>
-            </w:r>
-            <w:r>
-              <w:rPr>
-                <w:sz w:val="16"/>
-              </w:rPr>
-              <w:t>0.970</w:t>
-            </w:r>
-          </w:p>
-        </w:tc>
-        <w:tc>
-          <w:tcPr>
-            <w:tcW w:type="dxa" w:w="1058"/>
-          </w:tcPr>
-          <w:p>
-            <w:r>
-              <w:rPr>
-                <w:sz w:val="16"/>
-              </w:rPr>
-            </w:r>
-            <w:r>
-              <w:rPr>
-                <w:sz w:val="16"/>
-              </w:rPr>
-              <w:t>0.948</w:t>
-            </w:r>
-          </w:p>
-        </w:tc>
-        <w:tc>
-          <w:tcPr>
-            <w:tcW w:type="dxa" w:w="1058"/>
-          </w:tcPr>
-          <w:p>
-            <w:r>
-              <w:rPr>
-                <w:sz w:val="16"/>
-              </w:rPr>
-            </w:r>
-            <w:r>
-              <w:rPr>
-                <w:sz w:val="16"/>
-              </w:rPr>
-              <w:t>0.972</w:t>
-            </w:r>
-          </w:p>
-        </w:tc>
-        <w:tc>
-          <w:tcPr>
-            <w:tcW w:type="dxa" w:w="1058"/>
-          </w:tcPr>
-          <w:p>
-            <w:r>
-              <w:rPr>
-                <w:sz w:val="16"/>
-              </w:rPr>
-            </w:r>
-            <w:r>
-              <w:rPr>
-                <w:sz w:val="16"/>
-              </w:rPr>
-              <w:t>0.968</w:t>
-            </w:r>
-          </w:p>
-        </w:tc>
-        <w:tc>
-          <w:tcPr>
-            <w:tcW w:type="dxa" w:w="1058"/>
-          </w:tcPr>
-          <w:p>
-            <w:r>
-              <w:rPr>
-                <w:sz w:val="16"/>
-              </w:rPr>
-            </w:r>
-            <w:r>
-              <w:rPr>
-                <w:sz w:val="16"/>
-              </w:rPr>
-              <w:t>0.972</w:t>
-            </w:r>
-          </w:p>
-        </w:tc>
-        <w:tc>
-          <w:tcPr>
-            <w:tcW w:type="dxa" w:w="1058"/>
-          </w:tcPr>
-          <w:p>
-            <w:r>
-              <w:rPr>
-                <w:sz w:val="16"/>
-              </w:rPr>
-            </w:r>
-            <w:r>
-              <w:rPr>
-                <w:sz w:val="16"/>
-              </w:rPr>
-              <w:t>0.833</w:t>
-            </w:r>
-          </w:p>
-        </w:tc>
-        <w:tc>
-          <w:tcPr>
-            <w:tcW w:type="dxa" w:w="1058"/>
-          </w:tcPr>
-          <w:p>
-            <w:r>
-              <w:rPr>
-                <w:sz w:val="16"/>
-              </w:rPr>
-            </w:r>
-            <w:r>
-              <w:rPr>
-                <w:sz w:val="16"/>
-              </w:rPr>
-              <w:t>0.879</w:t>
+            <w:tcW w:type="dxa" w:w="1360"/>
+          </w:tcPr>
+          <w:p>
+            <w:r>
+              <w:rPr>
+                <w:sz w:val="16"/>
+              </w:rPr>
+            </w:r>
+            <w:r>
+              <w:rPr>
+                <w:sz w:val="16"/>
+              </w:rPr>
+              <w:t>0.894</w:t>
+            </w:r>
+          </w:p>
+        </w:tc>
+        <w:tc>
+          <w:tcPr>
+            <w:tcW w:type="dxa" w:w="1360"/>
+          </w:tcPr>
+          <w:p>
+            <w:r>
+              <w:rPr>
+                <w:sz w:val="16"/>
+              </w:rPr>
+            </w:r>
+            <w:r>
+              <w:rPr>
+                <w:sz w:val="16"/>
+              </w:rPr>
+              <w:t>0.922</w:t>
+            </w:r>
+          </w:p>
+        </w:tc>
+        <w:tc>
+          <w:tcPr>
+            <w:tcW w:type="dxa" w:w="1360"/>
+          </w:tcPr>
+          <w:p>
+            <w:r>
+              <w:rPr>
+                <w:sz w:val="16"/>
+              </w:rPr>
+            </w:r>
+            <w:r>
+              <w:rPr>
+                <w:sz w:val="16"/>
+              </w:rPr>
+              <w:t>0.933</w:t>
+            </w:r>
+          </w:p>
+        </w:tc>
+        <w:tc>
+          <w:tcPr>
+            <w:tcW w:type="dxa" w:w="1360"/>
+          </w:tcPr>
+          <w:p>
+            <w:r>
+              <w:rPr>
+                <w:sz w:val="16"/>
+              </w:rPr>
+            </w:r>
+            <w:r>
+              <w:rPr>
+                <w:sz w:val="16"/>
+              </w:rPr>
+              <w:t>0.953</w:t>
+            </w:r>
+          </w:p>
+        </w:tc>
+        <w:tc>
+          <w:tcPr>
+            <w:tcW w:type="dxa" w:w="1360"/>
+          </w:tcPr>
+          <w:p>
+            <w:r>
+              <w:rPr>
+                <w:sz w:val="16"/>
+              </w:rPr>
+            </w:r>
+            <w:r>
+              <w:rPr>
+                <w:sz w:val="16"/>
+              </w:rPr>
+              <w:t>0.954</w:t>
+            </w:r>
+          </w:p>
+        </w:tc>
+        <w:tc>
+          <w:tcPr>
+            <w:tcW w:type="dxa" w:w="1360"/>
+          </w:tcPr>
+          <w:p>
+            <w:r>
+              <w:rPr>
+                <w:sz w:val="16"/>
+              </w:rPr>
+            </w:r>
+            <w:r>
+              <w:rPr>
+                <w:sz w:val="16"/>
+              </w:rPr>
+              <w:t>0.984</w:t>
             </w:r>
           </w:p>
         </w:tc>
@@ -2201,7 +2056,7 @@
       <w:tr>
         <w:tc>
           <w:tcPr>
-            <w:tcW w:type="dxa" w:w="1058"/>
+            <w:tcW w:type="dxa" w:w="1360"/>
           </w:tcPr>
           <w:p>
             <w:r>
@@ -2219,145 +2074,109 @@
         </w:tc>
         <w:tc>
           <w:tcPr>
-            <w:tcW w:type="dxa" w:w="1058"/>
-          </w:tcPr>
-          <w:p>
-            <w:r>
-              <w:rPr>
-                <w:sz w:val="16"/>
-              </w:rPr>
-            </w:r>
-            <w:r>
-              <w:rPr>
-                <w:sz w:val="16"/>
-              </w:rPr>
-              <w:t>0.900</w:t>
-            </w:r>
-          </w:p>
-        </w:tc>
-        <w:tc>
-          <w:tcPr>
-            <w:tcW w:type="dxa" w:w="1058"/>
-          </w:tcPr>
-          <w:p>
-            <w:r>
-              <w:rPr>
-                <w:sz w:val="16"/>
-              </w:rPr>
-            </w:r>
-            <w:r>
-              <w:rPr>
-                <w:sz w:val="16"/>
-              </w:rPr>
-              <w:t>0.930</w:t>
-            </w:r>
-          </w:p>
-        </w:tc>
-        <w:tc>
-          <w:tcPr>
-            <w:tcW w:type="dxa" w:w="1058"/>
-          </w:tcPr>
-          <w:p>
-            <w:r>
-              <w:rPr>
-                <w:sz w:val="16"/>
-              </w:rPr>
-            </w:r>
-            <w:r>
-              <w:rPr>
-                <w:sz w:val="16"/>
-              </w:rPr>
-              <w:t>0.941</w:t>
-            </w:r>
-          </w:p>
-        </w:tc>
-        <w:tc>
-          <w:tcPr>
-            <w:tcW w:type="dxa" w:w="1058"/>
-          </w:tcPr>
-          <w:p>
-            <w:r>
-              <w:rPr>
-                <w:sz w:val="16"/>
-              </w:rPr>
-            </w:r>
-            <w:r>
-              <w:rPr>
-                <w:sz w:val="16"/>
-              </w:rPr>
-              <w:t>0.856</w:t>
-            </w:r>
-          </w:p>
-        </w:tc>
-        <w:tc>
-          <w:tcPr>
-            <w:tcW w:type="dxa" w:w="1058"/>
-          </w:tcPr>
-          <w:p>
-            <w:r>
-              <w:rPr>
-                <w:sz w:val="16"/>
-              </w:rPr>
-            </w:r>
-            <w:r>
-              <w:rPr>
-                <w:sz w:val="16"/>
-              </w:rPr>
-              <w:t>0.964</w:t>
-            </w:r>
-          </w:p>
-        </w:tc>
-        <w:tc>
-          <w:tcPr>
-            <w:tcW w:type="dxa" w:w="1058"/>
-          </w:tcPr>
-          <w:p>
-            <w:r>
-              <w:rPr>
-                <w:sz w:val="16"/>
-              </w:rPr>
-            </w:r>
-            <w:r>
-              <w:rPr>
-                <w:sz w:val="16"/>
-              </w:rPr>
-              <w:t>0.963</w:t>
-            </w:r>
-          </w:p>
-        </w:tc>
-        <w:tc>
-          <w:tcPr>
-            <w:tcW w:type="dxa" w:w="1058"/>
-          </w:tcPr>
-          <w:p>
-            <w:r>
-              <w:rPr>
-                <w:sz w:val="16"/>
-              </w:rPr>
-            </w:r>
-            <w:r>
-              <w:rPr>
-                <w:sz w:val="16"/>
-              </w:rPr>
-              <w:t>0.754</w:t>
-            </w:r>
-          </w:p>
-        </w:tc>
-        <w:tc>
-          <w:tcPr>
-            <w:tcW w:type="dxa" w:w="1058"/>
-          </w:tcPr>
-          <w:p>
-            <w:r>
-              <w:rPr>
-                <w:sz w:val="16"/>
-              </w:rPr>
-            </w:r>
-            <w:r>
-              <w:rPr>
-                <w:sz w:val="16"/>
-              </w:rPr>
-              <w:t>0.721</w:t>
+            <w:tcW w:type="dxa" w:w="1360"/>
+          </w:tcPr>
+          <w:p>
+            <w:r>
+              <w:rPr>
+                <w:sz w:val="16"/>
+              </w:rPr>
+            </w:r>
+            <w:r>
+              <w:rPr>
+                <w:sz w:val="16"/>
+              </w:rPr>
+              <w:t>0.877</w:t>
+            </w:r>
+          </w:p>
+        </w:tc>
+        <w:tc>
+          <w:tcPr>
+            <w:tcW w:type="dxa" w:w="1360"/>
+          </w:tcPr>
+          <w:p>
+            <w:r>
+              <w:rPr>
+                <w:sz w:val="16"/>
+              </w:rPr>
+            </w:r>
+            <w:r>
+              <w:rPr>
+                <w:sz w:val="16"/>
+              </w:rPr>
+              <w:t>0.898</w:t>
+            </w:r>
+          </w:p>
+        </w:tc>
+        <w:tc>
+          <w:tcPr>
+            <w:tcW w:type="dxa" w:w="1360"/>
+          </w:tcPr>
+          <w:p>
+            <w:r>
+              <w:rPr>
+                <w:sz w:val="16"/>
+              </w:rPr>
+            </w:r>
+            <w:r>
+              <w:rPr>
+                <w:sz w:val="16"/>
+              </w:rPr>
+              <w:t>0.908</w:t>
+            </w:r>
+          </w:p>
+        </w:tc>
+        <w:tc>
+          <w:tcPr>
+            <w:tcW w:type="dxa" w:w="1360"/>
+          </w:tcPr>
+          <w:p>
+            <w:r>
+              <w:rPr>
+                <w:sz w:val="16"/>
+              </w:rPr>
+            </w:r>
+            <w:r>
+              <w:rPr>
+                <w:sz w:val="16"/>
+              </w:rPr>
+              <w:t>0.863</w:t>
+            </w:r>
+          </w:p>
+        </w:tc>
+        <w:tc>
+          <w:tcPr>
+            <w:tcW w:type="dxa" w:w="1360"/>
+          </w:tcPr>
+          <w:p>
+            <w:r>
+              <w:rPr>
+                <w:sz w:val="16"/>
+              </w:rPr>
+            </w:r>
+            <w:r>
+              <w:rPr>
+                <w:sz w:val="16"/>
+              </w:rPr>
+              <w:t>0.915</w:t>
+            </w:r>
+          </w:p>
+        </w:tc>
+        <w:tc>
+          <w:tcPr>
+            <w:tcW w:type="dxa" w:w="1360"/>
+          </w:tcPr>
+          <w:p>
+            <w:r>
+              <w:rPr>
+                <w:sz w:val="16"/>
+              </w:rPr>
+            </w:r>
+            <w:r>
+              <w:rPr>
+                <w:sz w:val="16"/>
+              </w:rPr>
+              <w:t>0.970</w:t>
             </w:r>
           </w:p>
         </w:tc>
@@ -2365,7 +2184,7 @@
       <w:tr>
         <w:tc>
           <w:tcPr>
-            <w:tcW w:type="dxa" w:w="1058"/>
+            <w:tcW w:type="dxa" w:w="1360"/>
           </w:tcPr>
           <w:p>
             <w:r>
@@ -2383,145 +2202,109 @@
         </w:tc>
         <w:tc>
           <w:tcPr>
-            <w:tcW w:type="dxa" w:w="1058"/>
-          </w:tcPr>
-          <w:p>
-            <w:r>
-              <w:rPr>
-                <w:sz w:val="16"/>
-              </w:rPr>
-            </w:r>
-            <w:r>
-              <w:rPr>
-                <w:sz w:val="16"/>
-              </w:rPr>
-              <w:t>0.857</w:t>
-            </w:r>
-          </w:p>
-        </w:tc>
-        <w:tc>
-          <w:tcPr>
-            <w:tcW w:type="dxa" w:w="1058"/>
-          </w:tcPr>
-          <w:p>
-            <w:r>
-              <w:rPr>
-                <w:sz w:val="16"/>
-              </w:rPr>
-            </w:r>
-            <w:r>
-              <w:rPr>
-                <w:sz w:val="16"/>
-              </w:rPr>
-              <w:t>0.878</w:t>
-            </w:r>
-          </w:p>
-        </w:tc>
-        <w:tc>
-          <w:tcPr>
-            <w:tcW w:type="dxa" w:w="1058"/>
-          </w:tcPr>
-          <w:p>
-            <w:r>
-              <w:rPr>
-                <w:sz w:val="16"/>
-              </w:rPr>
-            </w:r>
-            <w:r>
-              <w:rPr>
-                <w:sz w:val="16"/>
-              </w:rPr>
-              <w:t>0.882</w:t>
-            </w:r>
-          </w:p>
-        </w:tc>
-        <w:tc>
-          <w:tcPr>
-            <w:tcW w:type="dxa" w:w="1058"/>
-          </w:tcPr>
-          <w:p>
-            <w:r>
-              <w:rPr>
-                <w:sz w:val="16"/>
-              </w:rPr>
-            </w:r>
-            <w:r>
-              <w:rPr>
-                <w:sz w:val="16"/>
-              </w:rPr>
-              <w:t>0.918</w:t>
-            </w:r>
-          </w:p>
-        </w:tc>
-        <w:tc>
-          <w:tcPr>
-            <w:tcW w:type="dxa" w:w="1058"/>
-          </w:tcPr>
-          <w:p>
-            <w:r>
-              <w:rPr>
-                <w:sz w:val="16"/>
-              </w:rPr>
-            </w:r>
-            <w:r>
-              <w:rPr>
-                <w:sz w:val="16"/>
-              </w:rPr>
-              <w:t>0.998</w:t>
-            </w:r>
-          </w:p>
-        </w:tc>
-        <w:tc>
-          <w:tcPr>
-            <w:tcW w:type="dxa" w:w="1058"/>
-          </w:tcPr>
-          <w:p>
-            <w:r>
-              <w:rPr>
-                <w:sz w:val="16"/>
-              </w:rPr>
-            </w:r>
-            <w:r>
-              <w:rPr>
-                <w:sz w:val="16"/>
-              </w:rPr>
-              <w:t>0.946</w:t>
-            </w:r>
-          </w:p>
-        </w:tc>
-        <w:tc>
-          <w:tcPr>
-            <w:tcW w:type="dxa" w:w="1058"/>
-          </w:tcPr>
-          <w:p>
-            <w:r>
-              <w:rPr>
-                <w:sz w:val="16"/>
-              </w:rPr>
-            </w:r>
-            <w:r>
-              <w:rPr>
-                <w:sz w:val="16"/>
-              </w:rPr>
-              <w:t>0.536</w:t>
-            </w:r>
-          </w:p>
-        </w:tc>
-        <w:tc>
-          <w:tcPr>
-            <w:tcW w:type="dxa" w:w="1058"/>
-          </w:tcPr>
-          <w:p>
-            <w:r>
-              <w:rPr>
-                <w:sz w:val="16"/>
-              </w:rPr>
-            </w:r>
-            <w:r>
-              <w:rPr>
-                <w:sz w:val="16"/>
-              </w:rPr>
-              <w:t>0.632</w:t>
+            <w:tcW w:type="dxa" w:w="1360"/>
+          </w:tcPr>
+          <w:p>
+            <w:r>
+              <w:rPr>
+                <w:sz w:val="16"/>
+              </w:rPr>
+            </w:r>
+            <w:r>
+              <w:rPr>
+                <w:sz w:val="16"/>
+              </w:rPr>
+              <w:t>0.812</w:t>
+            </w:r>
+          </w:p>
+        </w:tc>
+        <w:tc>
+          <w:tcPr>
+            <w:tcW w:type="dxa" w:w="1360"/>
+          </w:tcPr>
+          <w:p>
+            <w:r>
+              <w:rPr>
+                <w:sz w:val="16"/>
+              </w:rPr>
+            </w:r>
+            <w:r>
+              <w:rPr>
+                <w:sz w:val="16"/>
+              </w:rPr>
+              <w:t>0.850</w:t>
+            </w:r>
+          </w:p>
+        </w:tc>
+        <w:tc>
+          <w:tcPr>
+            <w:tcW w:type="dxa" w:w="1360"/>
+          </w:tcPr>
+          <w:p>
+            <w:r>
+              <w:rPr>
+                <w:sz w:val="16"/>
+              </w:rPr>
+            </w:r>
+            <w:r>
+              <w:rPr>
+                <w:sz w:val="16"/>
+              </w:rPr>
+              <w:t>0.849</w:t>
+            </w:r>
+          </w:p>
+        </w:tc>
+        <w:tc>
+          <w:tcPr>
+            <w:tcW w:type="dxa" w:w="1360"/>
+          </w:tcPr>
+          <w:p>
+            <w:r>
+              <w:rPr>
+                <w:sz w:val="16"/>
+              </w:rPr>
+            </w:r>
+            <w:r>
+              <w:rPr>
+                <w:sz w:val="16"/>
+              </w:rPr>
+              <w:t>0.881</w:t>
+            </w:r>
+          </w:p>
+        </w:tc>
+        <w:tc>
+          <w:tcPr>
+            <w:tcW w:type="dxa" w:w="1360"/>
+          </w:tcPr>
+          <w:p>
+            <w:r>
+              <w:rPr>
+                <w:sz w:val="16"/>
+              </w:rPr>
+            </w:r>
+            <w:r>
+              <w:rPr>
+                <w:sz w:val="16"/>
+              </w:rPr>
+              <w:t>0.976</w:t>
+            </w:r>
+          </w:p>
+        </w:tc>
+        <w:tc>
+          <w:tcPr>
+            <w:tcW w:type="dxa" w:w="1360"/>
+          </w:tcPr>
+          <w:p>
+            <w:r>
+              <w:rPr>
+                <w:sz w:val="16"/>
+              </w:rPr>
+            </w:r>
+            <w:r>
+              <w:rPr>
+                <w:sz w:val="16"/>
+              </w:rPr>
+              <w:t>0.957</w:t>
             </w:r>
           </w:p>
         </w:tc>
@@ -2529,7 +2312,7 @@
       <w:tr>
         <w:tc>
           <w:tcPr>
-            <w:tcW w:type="dxa" w:w="1058"/>
+            <w:tcW w:type="dxa" w:w="1360"/>
           </w:tcPr>
           <w:p>
             <w:r>
@@ -2548,475 +2331,109 @@
         </w:tc>
         <w:tc>
           <w:tcPr>
-            <w:tcW w:type="dxa" w:w="1058"/>
-          </w:tcPr>
-          <w:p>
-            <w:r>
-              <w:rPr>
-                <w:sz w:val="16"/>
-              </w:rPr>
-            </w:r>
-            <w:r>
-              <w:rPr>
-                <w:sz w:val="16"/>
-              </w:rPr>
-              <w:t>0.693</w:t>
-            </w:r>
-          </w:p>
-        </w:tc>
-        <w:tc>
-          <w:tcPr>
-            <w:tcW w:type="dxa" w:w="1058"/>
-          </w:tcPr>
-          <w:p>
-            <w:r>
-              <w:rPr>
-                <w:sz w:val="16"/>
-              </w:rPr>
-            </w:r>
-            <w:r>
-              <w:rPr>
-                <w:sz w:val="16"/>
-              </w:rPr>
-              <w:t>0.771</w:t>
-            </w:r>
-          </w:p>
-        </w:tc>
-        <w:tc>
-          <w:tcPr>
-            <w:tcW w:type="dxa" w:w="1058"/>
-          </w:tcPr>
-          <w:p>
-            <w:r>
-              <w:rPr>
-                <w:sz w:val="16"/>
-              </w:rPr>
-            </w:r>
-            <w:r>
-              <w:rPr>
-                <w:sz w:val="16"/>
-              </w:rPr>
-              <w:t>0.787</w:t>
-            </w:r>
-          </w:p>
-        </w:tc>
-        <w:tc>
-          <w:tcPr>
-            <w:tcW w:type="dxa" w:w="1058"/>
-          </w:tcPr>
-          <w:p>
-            <w:r>
-              <w:rPr>
-                <w:sz w:val="16"/>
-              </w:rPr>
-            </w:r>
-            <w:r>
-              <w:rPr>
-                <w:sz w:val="16"/>
-              </w:rPr>
-              <w:t>0.788</w:t>
-            </w:r>
-          </w:p>
-        </w:tc>
-        <w:tc>
-          <w:tcPr>
-            <w:tcW w:type="dxa" w:w="1058"/>
-          </w:tcPr>
-          <w:p>
-            <w:r>
-              <w:rPr>
-                <w:sz w:val="16"/>
-              </w:rPr>
-            </w:r>
-            <w:r>
-              <w:rPr>
-                <w:sz w:val="16"/>
-              </w:rPr>
-              <w:t>0.775</w:t>
-            </w:r>
-          </w:p>
-        </w:tc>
-        <w:tc>
-          <w:tcPr>
-            <w:tcW w:type="dxa" w:w="1058"/>
-          </w:tcPr>
-          <w:p>
-            <w:r>
-              <w:rPr>
-                <w:sz w:val="16"/>
-              </w:rPr>
-            </w:r>
-            <w:r>
-              <w:rPr>
-                <w:sz w:val="16"/>
-              </w:rPr>
-              <w:t>1.000</w:t>
-            </w:r>
-          </w:p>
-        </w:tc>
-        <w:tc>
-          <w:tcPr>
-            <w:tcW w:type="dxa" w:w="1058"/>
-          </w:tcPr>
-          <w:p>
-            <w:r>
-              <w:rPr>
-                <w:sz w:val="16"/>
-              </w:rPr>
-            </w:r>
-            <w:r>
-              <w:rPr>
-                <w:sz w:val="16"/>
-              </w:rPr>
-              <w:t>0.767</w:t>
-            </w:r>
-          </w:p>
-        </w:tc>
-        <w:tc>
-          <w:tcPr>
-            <w:tcW w:type="dxa" w:w="1058"/>
-          </w:tcPr>
-          <w:p>
-            <w:r>
-              <w:rPr>
-                <w:sz w:val="16"/>
-              </w:rPr>
-            </w:r>
-            <w:r>
-              <w:rPr>
-                <w:sz w:val="16"/>
-              </w:rPr>
-              <w:t>0.812</w:t>
-            </w:r>
-          </w:p>
-        </w:tc>
-      </w:tr>
-      <w:tr>
-        <w:tc>
-          <w:tcPr>
-            <w:tcW w:type="dxa" w:w="1058"/>
-          </w:tcPr>
-          <w:p>
-            <w:r>
-              <w:rPr>
-                <w:sz w:val="16"/>
-              </w:rPr>
-            </w:r>
-            <w:r>
-              <w:rPr>
-                <w:i/>
-                <w:sz w:val="16"/>
-              </w:rPr>
-              <w:t>E. coli</w:t>
-            </w:r>
-          </w:p>
-        </w:tc>
-        <w:tc>
-          <w:tcPr>
-            <w:tcW w:type="dxa" w:w="1058"/>
-          </w:tcPr>
-          <w:p>
-            <w:r>
-              <w:rPr>
-                <w:sz w:val="16"/>
-              </w:rPr>
-            </w:r>
-            <w:r>
-              <w:rPr>
-                <w:sz w:val="16"/>
-              </w:rPr>
-              <w:t>0.505</w:t>
-            </w:r>
-          </w:p>
-        </w:tc>
-        <w:tc>
-          <w:tcPr>
-            <w:tcW w:type="dxa" w:w="1058"/>
-          </w:tcPr>
-          <w:p>
-            <w:r>
-              <w:rPr>
-                <w:sz w:val="16"/>
-              </w:rPr>
-            </w:r>
-            <w:r>
-              <w:rPr>
-                <w:sz w:val="16"/>
-              </w:rPr>
-              <w:t>0.552</w:t>
-            </w:r>
-          </w:p>
-        </w:tc>
-        <w:tc>
-          <w:tcPr>
-            <w:tcW w:type="dxa" w:w="1058"/>
-          </w:tcPr>
-          <w:p>
-            <w:r>
-              <w:rPr>
-                <w:sz w:val="16"/>
-              </w:rPr>
-            </w:r>
-            <w:r>
-              <w:rPr>
-                <w:sz w:val="16"/>
-              </w:rPr>
-              <w:t>0.575</w:t>
-            </w:r>
-          </w:p>
-        </w:tc>
-        <w:tc>
-          <w:tcPr>
-            <w:tcW w:type="dxa" w:w="1058"/>
-          </w:tcPr>
-          <w:p>
-            <w:r>
-              <w:rPr>
-                <w:sz w:val="16"/>
-              </w:rPr>
-            </w:r>
-            <w:r>
-              <w:rPr>
-                <w:sz w:val="16"/>
-              </w:rPr>
-              <w:t>0.530</w:t>
-            </w:r>
-          </w:p>
-        </w:tc>
-        <w:tc>
-          <w:tcPr>
-            <w:tcW w:type="dxa" w:w="1058"/>
-          </w:tcPr>
-          <w:p>
-            <w:r>
-              <w:rPr>
-                <w:sz w:val="16"/>
-              </w:rPr>
-            </w:r>
-            <w:r>
-              <w:rPr>
-                <w:sz w:val="16"/>
-              </w:rPr>
-              <w:t>0.503</w:t>
-            </w:r>
-          </w:p>
-        </w:tc>
-        <w:tc>
-          <w:tcPr>
-            <w:tcW w:type="dxa" w:w="1058"/>
-          </w:tcPr>
-          <w:p>
-            <w:r>
-              <w:rPr>
-                <w:sz w:val="16"/>
-              </w:rPr>
-            </w:r>
-            <w:r>
-              <w:rPr>
-                <w:sz w:val="16"/>
-              </w:rPr>
-              <w:t>0.493</w:t>
-            </w:r>
-          </w:p>
-        </w:tc>
-        <w:tc>
-          <w:tcPr>
-            <w:tcW w:type="dxa" w:w="1058"/>
-          </w:tcPr>
-          <w:p>
-            <w:r>
-              <w:rPr>
-                <w:sz w:val="16"/>
-              </w:rPr>
-            </w:r>
-            <w:r>
-              <w:rPr>
-                <w:sz w:val="16"/>
-              </w:rPr>
-              <w:t>1.000</w:t>
-            </w:r>
-          </w:p>
-        </w:tc>
-        <w:tc>
-          <w:tcPr>
-            <w:tcW w:type="dxa" w:w="1058"/>
-          </w:tcPr>
-          <w:p>
-            <w:r>
-              <w:rPr>
-                <w:sz w:val="16"/>
-              </w:rPr>
-            </w:r>
-            <w:r>
-              <w:rPr>
-                <w:sz w:val="16"/>
-              </w:rPr>
-              <w:t>0.997</w:t>
-            </w:r>
-          </w:p>
-        </w:tc>
-      </w:tr>
-      <w:tr>
-        <w:tc>
-          <w:tcPr>
-            <w:tcW w:type="dxa" w:w="1058"/>
-          </w:tcPr>
-          <w:p>
-            <w:r>
-              <w:rPr>
-                <w:sz w:val="16"/>
-              </w:rPr>
-            </w:r>
-            <w:r>
-              <w:rPr>
-                <w:i/>
-                <w:sz w:val="16"/>
-              </w:rPr>
-              <w:t>B. subtilis</w:t>
-            </w:r>
-          </w:p>
-        </w:tc>
-        <w:tc>
-          <w:tcPr>
-            <w:tcW w:type="dxa" w:w="1058"/>
-          </w:tcPr>
-          <w:p>
-            <w:r>
-              <w:rPr>
-                <w:sz w:val="16"/>
-              </w:rPr>
-            </w:r>
-            <w:r>
-              <w:rPr>
-                <w:sz w:val="16"/>
-              </w:rPr>
-              <w:t>0.539</w:t>
-            </w:r>
-          </w:p>
-        </w:tc>
-        <w:tc>
-          <w:tcPr>
-            <w:tcW w:type="dxa" w:w="1058"/>
-          </w:tcPr>
-          <w:p>
-            <w:r>
-              <w:rPr>
-                <w:sz w:val="16"/>
-              </w:rPr>
-            </w:r>
-            <w:r>
-              <w:rPr>
-                <w:sz w:val="16"/>
-              </w:rPr>
-              <w:t>0.589</w:t>
-            </w:r>
-          </w:p>
-        </w:tc>
-        <w:tc>
-          <w:tcPr>
-            <w:tcW w:type="dxa" w:w="1058"/>
-          </w:tcPr>
-          <w:p>
-            <w:r>
-              <w:rPr>
-                <w:sz w:val="16"/>
-              </w:rPr>
-            </w:r>
-            <w:r>
-              <w:rPr>
-                <w:sz w:val="16"/>
-              </w:rPr>
-              <w:t>0.608</w:t>
-            </w:r>
-          </w:p>
-        </w:tc>
-        <w:tc>
-          <w:tcPr>
-            <w:tcW w:type="dxa" w:w="1058"/>
-          </w:tcPr>
-          <w:p>
-            <w:r>
-              <w:rPr>
-                <w:sz w:val="16"/>
-              </w:rPr>
-            </w:r>
-            <w:r>
-              <w:rPr>
-                <w:sz w:val="16"/>
-              </w:rPr>
-              <w:t>0.561</w:t>
-            </w:r>
-          </w:p>
-        </w:tc>
-        <w:tc>
-          <w:tcPr>
-            <w:tcW w:type="dxa" w:w="1058"/>
-          </w:tcPr>
-          <w:p>
-            <w:r>
-              <w:rPr>
-                <w:sz w:val="16"/>
-              </w:rPr>
-            </w:r>
-            <w:r>
-              <w:rPr>
-                <w:sz w:val="16"/>
-              </w:rPr>
-              <w:t>0.548</w:t>
-            </w:r>
-          </w:p>
-        </w:tc>
-        <w:tc>
-          <w:tcPr>
-            <w:tcW w:type="dxa" w:w="1058"/>
-          </w:tcPr>
-          <w:p>
-            <w:r>
-              <w:rPr>
-                <w:sz w:val="16"/>
-              </w:rPr>
-            </w:r>
-            <w:r>
-              <w:rPr>
-                <w:sz w:val="16"/>
-              </w:rPr>
-              <w:t>0.588</w:t>
-            </w:r>
-          </w:p>
-        </w:tc>
-        <w:tc>
-          <w:tcPr>
-            <w:tcW w:type="dxa" w:w="1058"/>
-          </w:tcPr>
-          <w:p>
-            <w:r>
-              <w:rPr>
-                <w:sz w:val="16"/>
-              </w:rPr>
-            </w:r>
-            <w:r>
-              <w:rPr>
-                <w:sz w:val="16"/>
-              </w:rPr>
-              <w:t>0.996</w:t>
-            </w:r>
-          </w:p>
-        </w:tc>
-        <w:tc>
-          <w:tcPr>
-            <w:tcW w:type="dxa" w:w="1058"/>
-          </w:tcPr>
-          <w:p>
-            <w:r>
-              <w:rPr>
-                <w:sz w:val="16"/>
-              </w:rPr>
-            </w:r>
-            <w:r>
-              <w:rPr>
-                <w:sz w:val="16"/>
-              </w:rPr>
-              <w:t>0.950</w:t>
+            <w:tcW w:type="dxa" w:w="1360"/>
+          </w:tcPr>
+          <w:p>
+            <w:r>
+              <w:rPr>
+                <w:sz w:val="16"/>
+              </w:rPr>
+            </w:r>
+            <w:r>
+              <w:rPr>
+                <w:sz w:val="16"/>
+              </w:rPr>
+              <w:t>0.695</w:t>
+            </w:r>
+          </w:p>
+        </w:tc>
+        <w:tc>
+          <w:tcPr>
+            <w:tcW w:type="dxa" w:w="1360"/>
+          </w:tcPr>
+          <w:p>
+            <w:r>
+              <w:rPr>
+                <w:sz w:val="16"/>
+              </w:rPr>
+            </w:r>
+            <w:r>
+              <w:rPr>
+                <w:sz w:val="16"/>
+              </w:rPr>
+              <w:t>0.783</w:t>
+            </w:r>
+          </w:p>
+        </w:tc>
+        <w:tc>
+          <w:tcPr>
+            <w:tcW w:type="dxa" w:w="1360"/>
+          </w:tcPr>
+          <w:p>
+            <w:r>
+              <w:rPr>
+                <w:sz w:val="16"/>
+              </w:rPr>
+            </w:r>
+            <w:r>
+              <w:rPr>
+                <w:sz w:val="16"/>
+              </w:rPr>
+              <w:t>0.796</w:t>
+            </w:r>
+          </w:p>
+        </w:tc>
+        <w:tc>
+          <w:tcPr>
+            <w:tcW w:type="dxa" w:w="1360"/>
+          </w:tcPr>
+          <w:p>
+            <w:r>
+              <w:rPr>
+                <w:sz w:val="16"/>
+              </w:rPr>
+            </w:r>
+            <w:r>
+              <w:rPr>
+                <w:sz w:val="16"/>
+              </w:rPr>
+              <w:t>0.800</w:t>
+            </w:r>
+          </w:p>
+        </w:tc>
+        <w:tc>
+          <w:tcPr>
+            <w:tcW w:type="dxa" w:w="1360"/>
+          </w:tcPr>
+          <w:p>
+            <w:r>
+              <w:rPr>
+                <w:sz w:val="16"/>
+              </w:rPr>
+            </w:r>
+            <w:r>
+              <w:rPr>
+                <w:sz w:val="16"/>
+              </w:rPr>
+              <w:t>0.796</w:t>
+            </w:r>
+          </w:p>
+        </w:tc>
+        <w:tc>
+          <w:tcPr>
+            <w:tcW w:type="dxa" w:w="1360"/>
+          </w:tcPr>
+          <w:p>
+            <w:r>
+              <w:rPr>
+                <w:sz w:val="16"/>
+              </w:rPr>
+            </w:r>
+            <w:r>
+              <w:rPr>
+                <w:sz w:val="16"/>
+              </w:rPr>
+              <w:t>0.977</w:t>
             </w:r>
           </w:p>
         </w:tc>
@@ -3025,34 +2442,7 @@
     <w:p/>
     <w:p>
       <w:r>
-        <w:t>Diagonal entries are from a protein-cluster-disjoint 20% holdout of the same species; off-diagonal entries use a model trained on all rows of the source species. Small species have few test positives (</w:t>
-      </w:r>
-      <w:r>
-        <w:rPr>
-          <w:i/>
-        </w:rPr>
-        <w:t>A. thaliana</w:t>
-      </w:r>
-      <w:r>
-        <w:t xml:space="preserve"> 97 sites, </w:t>
-      </w:r>
-      <w:r>
-        <w:rPr>
-          <w:i/>
-        </w:rPr>
-        <w:t>E. coli</w:t>
-      </w:r>
-      <w:r>
-        <w:t xml:space="preserve"> 103, </w:t>
-      </w:r>
-      <w:r>
-        <w:rPr>
-          <w:i/>
-        </w:rPr>
-        <w:t>B. subtilis</w:t>
-      </w:r>
-      <w:r>
-        <w:t xml:space="preserve"> 85), so their rows are correspondingly noisy.</w:t>
+        <w:t>Diagonal entries are from a protein-cluster-disjoint 20% holdout of the same species; off-diagonal entries use a model trained on all source rows, with target rows in the training clusters removed. Pig and A. thaliana have few held-out positives, so their diagonal is correspondingly noisy.</w:t>
       </w:r>
     </w:p>
     <w:p>
@@ -3070,12 +2460,21 @@
     </w:p>
     <w:p>
       <w:r>
-        <w:t>Because a predictor is only useful if its errors are predictable, we stratified the held-out predictions (Table 6). Discrimination is substantially better for inferred than for experimentally supported sites (AUC 0.960 versus 0.908; mean predicted probability 0.55 versus 0.42). This "annotation-memory" effect is expected when 93% of labels are propagated: experimentally characterised sites are the atypical, family-specific cases that propagation does not cover, and they are exactly the ones a user is most likely to care about. Performance is stable across annotated topologies (cytoplasmic 0.898, extracellular 0.898, topology unknown 0.949) with the exception of the lumenal class, which contains only 14 positives and is not interpretable.</w:t>
+        <w:t>Because a predictor is only useful if its errors are predictable, we stratified the held-out predictions (Table 6). Discrimination remains better for inferred than for experimentally supported sites (AUC 0.947 versus 0.907), the annotation-memory effect expected when 90% of labels are propagated: experimentally characterised sites are the atypical, family-specific cases that propagation does not cover, and they are exactly the ones a user is most likely to care about. Performance is stable across annotated topologies (cytoplasmic 0.887, extracellular 0.855, topology unknown 0.898), with the lumenal class too small to interpret (14 positives).</w:t>
       </w:r>
     </w:p>
     <w:p>
       <w:r>
-        <w:t>For practical use we derived thresholds whose estimated false-discovery rate is controlled on the inner validation folds and then measured precision and recall on the outer folds (Figure 8b). At an estimated FDR of 1% the threshold retains 44.5% of known sites at 98.3% precision; at 5% it retains 61.3% at 93.5% precision; at 10%, 67.5% at 87.8%. This gives a principled way to generate a shortlist for experimental follow-up without committing to an arbitrary score cut-off, and it is the mode in which we expect the model to be used.</w:t>
+        <w:t xml:space="preserve">For practical use we derived, </w:t>
+      </w:r>
+      <w:r>
+        <w:rPr>
+          <w:b/>
+        </w:rPr>
+        <w:t>within each fold</w:t>
+      </w:r>
+      <w:r>
+        <w:t>, the threshold whose estimated false-discovery rate is at most a target value, and evaluated it on that fold's outer test rows (Figure 8b). At an estimated FDR of 1% the threshold retains 20.2% of known sites at 95.3% precision; at 5%, 34.5% at 90.3%; at 10%, 40.4% at 85.5%; at 20%, 53.5% at 76.6%. Thresholds are deliberately conservative, because the proteome-wide prior is small, and they give a principled way to generate a shortlist without committing to an arbitrary score cut-off.</w:t>
       </w:r>
     </w:p>
     <w:p>
@@ -3195,7 +2594,7 @@
               <w:rPr>
                 <w:sz w:val="16"/>
               </w:rPr>
-              <w:t>506</w:t>
+              <w:t>455</w:t>
             </w:r>
           </w:p>
         </w:tc>
@@ -3213,7 +2612,7 @@
               <w:rPr>
                 <w:sz w:val="16"/>
               </w:rPr>
-              <w:t>0.908</w:t>
+              <w:t>0.907</w:t>
             </w:r>
           </w:p>
         </w:tc>
@@ -3231,7 +2630,7 @@
               <w:rPr>
                 <w:sz w:val="16"/>
               </w:rPr>
-              <w:t>0.293</w:t>
+              <w:t>0.176</w:t>
             </w:r>
           </w:p>
         </w:tc>
@@ -3269,7 +2668,7 @@
               <w:rPr>
                 <w:sz w:val="16"/>
               </w:rPr>
-              <w:t>6,299</w:t>
+              <w:t>3,969</w:t>
             </w:r>
           </w:p>
         </w:tc>
@@ -3287,7 +2686,7 @@
               <w:rPr>
                 <w:sz w:val="16"/>
               </w:rPr>
-              <w:t>0.960</w:t>
+              <w:t>0.947</w:t>
             </w:r>
           </w:p>
         </w:tc>
@@ -3305,7 +2704,7 @@
               <w:rPr>
                 <w:sz w:val="16"/>
               </w:rPr>
-              <w:t>0.855</w:t>
+              <w:t>0.682</w:t>
             </w:r>
           </w:p>
         </w:tc>
@@ -3361,7 +2760,7 @@
               <w:rPr>
                 <w:sz w:val="16"/>
               </w:rPr>
-              <w:t>0.898</w:t>
+              <w:t>0.887</w:t>
             </w:r>
           </w:p>
         </w:tc>
@@ -3379,7 +2778,7 @@
               <w:rPr>
                 <w:sz w:val="16"/>
               </w:rPr>
-              <w:t>0.883</w:t>
+              <w:t>0.829</w:t>
             </w:r>
           </w:p>
         </w:tc>
@@ -3417,7 +2816,7 @@
               <w:rPr>
                 <w:sz w:val="16"/>
               </w:rPr>
-              <w:t>42</w:t>
+              <w:t>27</w:t>
             </w:r>
           </w:p>
         </w:tc>
@@ -3435,7 +2834,7 @@
               <w:rPr>
                 <w:sz w:val="16"/>
               </w:rPr>
-              <w:t>0.898</w:t>
+              <w:t>0.855</w:t>
             </w:r>
           </w:p>
         </w:tc>
@@ -3453,7 +2852,7 @@
               <w:rPr>
                 <w:sz w:val="16"/>
               </w:rPr>
-              <w:t>0.355</w:t>
+              <w:t>0.375</w:t>
             </w:r>
           </w:p>
         </w:tc>
@@ -3491,7 +2890,7 @@
               <w:rPr>
                 <w:sz w:val="16"/>
               </w:rPr>
-              <w:t>4,155</w:t>
+              <w:t>1,801</w:t>
             </w:r>
           </w:p>
         </w:tc>
@@ -3509,7 +2908,7 @@
               <w:rPr>
                 <w:sz w:val="16"/>
               </w:rPr>
-              <w:t>0.949</w:t>
+              <w:t>0.898</w:t>
             </w:r>
           </w:p>
         </w:tc>
@@ -3527,7 +2926,7 @@
               <w:rPr>
                 <w:sz w:val="16"/>
               </w:rPr>
-              <w:t>0.843</w:t>
+              <w:t>0.501</w:t>
             </w:r>
           </w:p>
         </w:tc>
@@ -3549,21 +2948,21 @@
     </w:p>
     <w:p>
       <w:r>
-        <w:t>In-silico mutagenesis of 300 human positive windows (every position mutated to every amino acid, scored with the forest view; Figure 8a) shows that substitutions at the central position are neutral, as they must be: every candidate is a cysteine, so the centre carries no discriminative information. The informative positions are the flanks. Introducing a cysteine at ±1 increases the predicted probability by 0.047, recovering the known preference for cysteine clusters; introducing glutamate or aspartate at −1 or −2 decreases it by 0.06–0.10, recovering the exclusion of acidic residues near the modification site.</w:t>
+        <w:t>In-silico mutagenesis of 300 human positive windows (every position mutated to every amino acid, scored with the forest view; Figure 8a) shows that substitutions at the central position are neutral, as they must be: every candidate is a cysteine, so the centre carries no discriminative information. The informative positions are the flanks. Introducing a cysteine at +1 increases the predicted probability by 0.089 and at −1 by 0.083, recovering the known preference for cysteine clusters; introducing glutamate or aspartate at −1 decreases it by 0.06–0.09, recovering the exclusion of acidic residues near the modification site.</w:t>
       </w:r>
     </w:p>
     <w:p>
       <w:r>
-        <w:t xml:space="preserve">The same audit exposed a label-quality problem. Before filtering, mutating the central cysteine to lysine </w:t>
+        <w:t xml:space="preserve">The same audit exposed a bug in </w:t>
       </w:r>
       <w:r>
         <w:rPr>
-          <w:i/>
+          <w:b/>
         </w:rPr>
-        <w:t>increased</w:t>
+        <w:t>our own label filter</w:t>
       </w:r>
       <w:r>
-        <w:t xml:space="preserve"> the score by 0.089 — an impossible result that traced back to 66 UniProt features (1.0% of positives) whose annotated position carries a lysine, glycine, serine or threonine in the current canonical sequence, reflecting transferred annotations on diverged or re-annotated entries. Removing those 66 sites abolished the artefact (effect 0.000) without changing cross-validated performance (AUC 0.9451 with and without). Interpretability is therefore not only a biological tool but a label-auditing one.</w:t>
+        <w:t>, not in UniProt. The first version of the dataset matched any lipidation note containing "palmitoyl", which admitted N-palmitoyl cysteine (2,315 sites), N6-palmitoyl lysine (34), N-palmitoyl glycine (18) and O-palmitoyl serine/threonine (14) — 35% of the original positives. These are legitimate annotations of different chemical modifications; they were mis-classified by us, and the earlier claim that they reflected UniProt annotation errors was wrong and is withdrawn. The corrected dataset requires an S-palmitoyl cysteine note on a cysteine residue and contains no non-cysteine positives. The label correction changed every downstream number in this paper; the audit trail (per-site notes before and after) is released with the data, and we report the corrected results throughout.</w:t>
       </w:r>
     </w:p>
     <w:p>
@@ -3595,17 +2994,17 @@
     </w:p>
     <w:p>
       <w:r>
-        <w:t>It is not a clean benchmark. The motif that the model learned is barely enriched in this set (PWM AUC 0.537 against same-protein cysteines), and PalmDL separates the literature sites from those cysteines only weakly (AUC 0.588; 0.607 against random background cysteines). Tightening the extraction — requiring an exact gene match, explicit "palmitoylation at CysX" phrasing, and excluding table rows — leaves the picture unchanged (PWM AUC 0.56–0.57; model AUC 0.61–0.62). Manual inspection explains why: genuine sites are mixed with extraction errors, and many genuine sites (MyD88 C113, iRhom2 C476, GRP78 C420) are transmembrane-proximal cysteines whose linear motif is weak, which is precisely the class that an annotation-trained model has least often seen.</w:t>
+        <w:t>It is not a clean benchmark. The motif that the model learned is barely enriched in this set (PWM AUC 0.540 against same-protein cysteines), and PalmDL separates the literature sites from those cysteines only weakly (AUC 0.585). Manual inspection explains why: genuine sites are mixed with extraction errors, and many genuine sites (MyD88 C113, iRhom2 C476, GRP78 C420) are transmembrane-proximal cysteines whose linear motif is weak, which is precisely the class that an annotation-trained model has least often seen.</w:t>
       </w:r>
     </w:p>
     <w:p>
       <w:r>
-        <w:t>To make sure this was not an extraction artefact, we curated all 136 sites by reading every sentence (Table 7, last row). Ninety-nine mentions could be assigned unambiguously to a protein and a cysteine — either because the sentence states the site explicitly or because a cysteine-to-serine/alanine mutant lost palmitoylation — while 37 were rejected as sites of a different protein in the same sentence, catalytic-site mutants of DHHC enzymes, predicted-only sites, negative results, or table rows with mismatched proteins. The curated subset behaves exactly like the full set (PWM AUC 0.561, model AUC 0.620), so extraction noise is not the explanation. We also tested the obvious alternative explanation, that the papers use a different residue numbering: allowing every site and every same-protein negative to score its best window within ±2 residues leaves AUC at 0.611, so numbering offsets do not explain the failure either.</w:t>
+        <w:t>To make sure this was not an extraction artefact, we curated all 136 sites by reading every sentence. Ninety-nine mentions could be assigned unambiguously to a protein and a cysteine — either because the sentence states the site explicitly or because a cysteine-to-serine/alanine mutant lost palmitoylation — while 37 were rejected as sites of a different protein in the same sentence, catalytic-site mutants of DHHC enzymes, predicted-only sites, negative results, or table rows with mismatched proteins. The curated subset behaves like the full set, so extraction noise is not the explanation. Allowing every site and every same-protein negative to score its best window within ±2 residues also leaves the ranking unchanged, so numbering offsets do not explain the failure either.</w:t>
       </w:r>
     </w:p>
     <w:p>
       <w:r>
-        <w:t>Consistent with this, the curated sites are essentially absent from the proteome-wide shortlist: one of 99 appears in the 5% FDR tier (expected 0.12 by chance; 8-fold but n = 1) and two in the 20% tier (expected 0.25). The honest conclusion is a domain-shift limitation that applies to any annotation-trained predictor, including PalmDL: it reproduces and extends the UniProt consensus, but does not recognise the motif-atypical, transmembrane-proximal sites that mechanistic papers tend to characterise.</w:t>
+        <w:t>Consistent with this, the curated sites are essentially absent from the proteome-wide shortlist: one of 99 appears at the 5% tier (expected 0.12 by chance) and two at the 20% tier. The honest conclusion is a domain-shift limitation that applies to any annotation-trained predictor, including PalmDL: it reproduces and extends the UniProt consensus, but does not recognise the motif-atypical, transmembrane-proximal sites that mechanistic papers tend to characterise.</w:t>
       </w:r>
     </w:p>
     <w:p>
@@ -3730,7 +3129,7 @@
               <w:rPr>
                 <w:sz w:val="16"/>
               </w:rPr>
-              <w:t>133</w:t>
+              <w:t>136</w:t>
             </w:r>
           </w:p>
         </w:tc>
@@ -3748,7 +3147,7 @@
               <w:rPr>
                 <w:sz w:val="16"/>
               </w:rPr>
-              <w:t>0.537</w:t>
+              <w:t>0.540</w:t>
             </w:r>
           </w:p>
         </w:tc>
@@ -3766,377 +3165,7 @@
               <w:rPr>
                 <w:sz w:val="16"/>
               </w:rPr>
-              <w:t>0.588</w:t>
-            </w:r>
-          </w:p>
-        </w:tc>
-      </w:tr>
-      <w:tr>
-        <w:tc>
-          <w:tcPr>
-            <w:tcW w:type="dxa" w:w="2379"/>
-          </w:tcPr>
-          <w:p>
-            <w:r>
-              <w:rPr>
-                <w:sz w:val="16"/>
-              </w:rPr>
-            </w:r>
-            <w:r>
-              <w:rPr>
-                <w:sz w:val="16"/>
-              </w:rPr>
-              <w:t>Exact gene-symbol match</w:t>
-            </w:r>
-          </w:p>
-        </w:tc>
-        <w:tc>
-          <w:tcPr>
-            <w:tcW w:type="dxa" w:w="2379"/>
-          </w:tcPr>
-          <w:p>
-            <w:r>
-              <w:rPr>
-                <w:sz w:val="16"/>
-              </w:rPr>
-            </w:r>
-            <w:r>
-              <w:rPr>
-                <w:sz w:val="16"/>
-              </w:rPr>
-              <w:t>131</w:t>
-            </w:r>
-          </w:p>
-        </w:tc>
-        <w:tc>
-          <w:tcPr>
-            <w:tcW w:type="dxa" w:w="2379"/>
-          </w:tcPr>
-          <w:p>
-            <w:r>
-              <w:rPr>
-                <w:sz w:val="16"/>
-              </w:rPr>
-            </w:r>
-            <w:r>
-              <w:rPr>
-                <w:sz w:val="16"/>
-              </w:rPr>
-              <w:t>0.539</w:t>
-            </w:r>
-          </w:p>
-        </w:tc>
-        <w:tc>
-          <w:tcPr>
-            <w:tcW w:type="dxa" w:w="2379"/>
-          </w:tcPr>
-          <w:p>
-            <w:r>
-              <w:rPr>
-                <w:sz w:val="16"/>
-              </w:rPr>
-            </w:r>
-            <w:r>
-              <w:rPr>
-                <w:sz w:val="16"/>
-              </w:rPr>
-              <w:t>0.591</w:t>
-            </w:r>
-          </w:p>
-        </w:tc>
-      </w:tr>
-      <w:tr>
-        <w:tc>
-          <w:tcPr>
-            <w:tcW w:type="dxa" w:w="2379"/>
-          </w:tcPr>
-          <w:p>
-            <w:r>
-              <w:rPr>
-                <w:sz w:val="16"/>
-              </w:rPr>
-            </w:r>
-            <w:r>
-              <w:rPr>
-                <w:sz w:val="16"/>
-              </w:rPr>
-              <w:t>Explicit "palmitoylation at CysX" phrasing</w:t>
-            </w:r>
-          </w:p>
-        </w:tc>
-        <w:tc>
-          <w:tcPr>
-            <w:tcW w:type="dxa" w:w="2379"/>
-          </w:tcPr>
-          <w:p>
-            <w:r>
-              <w:rPr>
-                <w:sz w:val="16"/>
-              </w:rPr>
-            </w:r>
-            <w:r>
-              <w:rPr>
-                <w:sz w:val="16"/>
-              </w:rPr>
-              <w:t>97</w:t>
-            </w:r>
-          </w:p>
-        </w:tc>
-        <w:tc>
-          <w:tcPr>
-            <w:tcW w:type="dxa" w:w="2379"/>
-          </w:tcPr>
-          <w:p>
-            <w:r>
-              <w:rPr>
-                <w:sz w:val="16"/>
-              </w:rPr>
-            </w:r>
-            <w:r>
-              <w:rPr>
-                <w:sz w:val="16"/>
-              </w:rPr>
-              <w:t>0.560</w:t>
-            </w:r>
-          </w:p>
-        </w:tc>
-        <w:tc>
-          <w:tcPr>
-            <w:tcW w:type="dxa" w:w="2379"/>
-          </w:tcPr>
-          <w:p>
-            <w:r>
-              <w:rPr>
-                <w:sz w:val="16"/>
-              </w:rPr>
-            </w:r>
-            <w:r>
-              <w:rPr>
-                <w:sz w:val="16"/>
-              </w:rPr>
-              <w:t>0.613</w:t>
-            </w:r>
-          </w:p>
-        </w:tc>
-      </w:tr>
-      <w:tr>
-        <w:tc>
-          <w:tcPr>
-            <w:tcW w:type="dxa" w:w="2379"/>
-          </w:tcPr>
-          <w:p>
-            <w:r>
-              <w:rPr>
-                <w:sz w:val="16"/>
-              </w:rPr>
-            </w:r>
-            <w:r>
-              <w:rPr>
-                <w:sz w:val="16"/>
-              </w:rPr>
-              <w:t>Exact match + explicit phrasing</w:t>
-            </w:r>
-          </w:p>
-        </w:tc>
-        <w:tc>
-          <w:tcPr>
-            <w:tcW w:type="dxa" w:w="2379"/>
-          </w:tcPr>
-          <w:p>
-            <w:r>
-              <w:rPr>
-                <w:sz w:val="16"/>
-              </w:rPr>
-            </w:r>
-            <w:r>
-              <w:rPr>
-                <w:sz w:val="16"/>
-              </w:rPr>
-              <w:t>96</w:t>
-            </w:r>
-          </w:p>
-        </w:tc>
-        <w:tc>
-          <w:tcPr>
-            <w:tcW w:type="dxa" w:w="2379"/>
-          </w:tcPr>
-          <w:p>
-            <w:r>
-              <w:rPr>
-                <w:sz w:val="16"/>
-              </w:rPr>
-            </w:r>
-            <w:r>
-              <w:rPr>
-                <w:sz w:val="16"/>
-              </w:rPr>
-              <w:t>0.559</w:t>
-            </w:r>
-          </w:p>
-        </w:tc>
-        <w:tc>
-          <w:tcPr>
-            <w:tcW w:type="dxa" w:w="2379"/>
-          </w:tcPr>
-          <w:p>
-            <w:r>
-              <w:rPr>
-                <w:sz w:val="16"/>
-              </w:rPr>
-            </w:r>
-            <w:r>
-              <w:rPr>
-                <w:sz w:val="16"/>
-              </w:rPr>
-              <w:t>0.615</w:t>
-            </w:r>
-          </w:p>
-        </w:tc>
-      </w:tr>
-      <w:tr>
-        <w:tc>
-          <w:tcPr>
-            <w:tcW w:type="dxa" w:w="2379"/>
-          </w:tcPr>
-          <w:p>
-            <w:r>
-              <w:rPr>
-                <w:sz w:val="16"/>
-              </w:rPr>
-            </w:r>
-            <w:r>
-              <w:rPr>
-                <w:sz w:val="16"/>
-              </w:rPr>
-              <w:t>+ table-like rows removed</w:t>
-            </w:r>
-          </w:p>
-        </w:tc>
-        <w:tc>
-          <w:tcPr>
-            <w:tcW w:type="dxa" w:w="2379"/>
-          </w:tcPr>
-          <w:p>
-            <w:r>
-              <w:rPr>
-                <w:sz w:val="16"/>
-              </w:rPr>
-            </w:r>
-            <w:r>
-              <w:rPr>
-                <w:sz w:val="16"/>
-              </w:rPr>
-              <w:t>95</w:t>
-            </w:r>
-          </w:p>
-        </w:tc>
-        <w:tc>
-          <w:tcPr>
-            <w:tcW w:type="dxa" w:w="2379"/>
-          </w:tcPr>
-          <w:p>
-            <w:r>
-              <w:rPr>
-                <w:sz w:val="16"/>
-              </w:rPr>
-            </w:r>
-            <w:r>
-              <w:rPr>
-                <w:sz w:val="16"/>
-              </w:rPr>
-              <w:t>0.565</w:t>
-            </w:r>
-          </w:p>
-        </w:tc>
-        <w:tc>
-          <w:tcPr>
-            <w:tcW w:type="dxa" w:w="2379"/>
-          </w:tcPr>
-          <w:p>
-            <w:r>
-              <w:rPr>
-                <w:sz w:val="16"/>
-              </w:rPr>
-            </w:r>
-            <w:r>
-              <w:rPr>
-                <w:sz w:val="16"/>
-              </w:rPr>
-              <w:t>0.616</w:t>
-            </w:r>
-          </w:p>
-        </w:tc>
-      </w:tr>
-      <w:tr>
-        <w:tc>
-          <w:tcPr>
-            <w:tcW w:type="dxa" w:w="2379"/>
-          </w:tcPr>
-          <w:p>
-            <w:r>
-              <w:rPr>
-                <w:sz w:val="16"/>
-              </w:rPr>
-            </w:r>
-            <w:r>
-              <w:rPr>
-                <w:sz w:val="16"/>
-              </w:rPr>
-              <w:t>Manually curated subset</w:t>
-            </w:r>
-          </w:p>
-        </w:tc>
-        <w:tc>
-          <w:tcPr>
-            <w:tcW w:type="dxa" w:w="2379"/>
-          </w:tcPr>
-          <w:p>
-            <w:r>
-              <w:rPr>
-                <w:sz w:val="16"/>
-              </w:rPr>
-            </w:r>
-            <w:r>
-              <w:rPr>
-                <w:sz w:val="16"/>
-              </w:rPr>
-              <w:t>99</w:t>
-            </w:r>
-          </w:p>
-        </w:tc>
-        <w:tc>
-          <w:tcPr>
-            <w:tcW w:type="dxa" w:w="2379"/>
-          </w:tcPr>
-          <w:p>
-            <w:r>
-              <w:rPr>
-                <w:sz w:val="16"/>
-              </w:rPr>
-            </w:r>
-            <w:r>
-              <w:rPr>
-                <w:sz w:val="16"/>
-              </w:rPr>
-              <w:t>0.561</w:t>
-            </w:r>
-          </w:p>
-        </w:tc>
-        <w:tc>
-          <w:tcPr>
-            <w:tcW w:type="dxa" w:w="2379"/>
-          </w:tcPr>
-          <w:p>
-            <w:r>
-              <w:rPr>
-                <w:sz w:val="16"/>
-              </w:rPr>
-            </w:r>
-            <w:r>
-              <w:rPr>
-                <w:sz w:val="16"/>
-              </w:rPr>
-              <w:t>0.620</w:t>
+              <w:t>0.585</w:t>
             </w:r>
           </w:p>
         </w:tc>
@@ -4145,7 +3174,7 @@
     <w:p/>
     <w:p>
       <w:r>
-        <w:t>Comparisons are against other cysteines of the same proteins. PWM AUC is the enrichment of a position-specific log-odds motif trained on the UniProt data; if the extracted positives were faithful, this value should approach the model AUC. The manually curated subset is not nested in the filters above: it was obtained by reading all 136 sentences and accepting 99 unambiguous mentions (82 proteins).</w:t>
+        <w:t>Comparisons are against other cysteines of the same proteins. PWM AUC is the enrichment of a position-specific log-odds motif trained on the UniProt data; if the extracted positives were faithful, this value should approach the model AUC. The manually curated subset (99 unambiguous mentions in 82 proteins) is used for the overlap analysis rather than for a separate filter row.</w:t>
       </w:r>
     </w:p>
     <w:p>
@@ -4163,7 +3192,7 @@
     </w:p>
     <w:p>
       <w:r>
-        <w:t xml:space="preserve">As a forward-looking counterpart to the retrospective benchmarks, we applied the released model to every cysteine of the reviewed human proteome — </w:t>
+        <w:t xml:space="preserve">As a forward-looking counterpart to the retrospective benchmarks, we applied the forest view of the released model to every cysteine of the reviewed human proteome — </w:t>
       </w:r>
       <w:r>
         <w:rPr>
@@ -4172,17 +3201,17 @@
         <w:t>262,286 sites in 19,814 proteins</w:t>
       </w:r>
       <w:r>
-        <w:t xml:space="preserve"> — and controlled the false-discovery rate with shuffled-flank decoys that keep the central cysteine but destroy the motif. (A C→A decoy is inappropriate here: §2.9 shows that the model is deliberately insensitive to the identity of the centre, so such mutants remain motif-shaped and give a null that is far too pessimistic.) At 1% FDR the scan yields 217 sites in 138 proteins; at 5%, 322 sites in 204 proteins; at 10%, 399; at 20%, 668; and at 30%, 1,065 (Table 8, Figure 9). Recall of the 572 UniProt-annotated human sites rises from 12.4% at the 1% tier to 39.0% at the 30% tier, and the strict tiers are dominated by novel sites (146 of 217 at 1%).</w:t>
+        <w:t xml:space="preserve"> — and controlled the false-discovery rate with 20,000 shuffled-flank decoys that keep the central cysteine but destroy the motif. (A C→A decoy is inappropriate: §2.9 shows that the model is deliberately insensitive to the identity of the centre.) At the 1% tier the scan yields 215 sites in 134 proteins; at 5%, 301 sites in 199 proteins (248 already annotated, 53 novel); at 10%, 396; at 20%, 615; and at 30%, 1,010 (Table 8, Figure 9).</w:t>
       </w:r>
     </w:p>
     <w:p>
       <w:r>
-        <w:t>The shortlist is biologically coherent. 90.7% of the 5% FDR sites carry annotated cytoplasmic topology versus 5.6% of all scanned cysteines — a 16.3-fold enrichment — and the highest-scoring novel entries are juxtamembrane cysteines of single-pass membrane proteins: endothelin receptor A C386/C388, claudin-2 C185, mucolipin-3 C550 and LRRC32 C650. This is precisely the class that canonical motif models under-score, and it is where a sequence-only model can add value. Only one of the 136 literature-mined sites reaches the 5% tier, consistent with the motif-atypical nature of that set (§2.10).</w:t>
+        <w:t>The 5% tier is biologically coherent. 61.8% of its sites carry annotated cytoplasmic topology versus 5.6% of all scanned cysteines — an 11.1-fold enrichment — and its highest-scoring entries include juxtamembrane cysteines of single-pass membrane proteins (endothelin receptor A C386/C388, claudin-2 C185, mucolipin-3 C550). Only one of the 136 literature-mined sites reaches the 20% tier, consistent with the motif-atypical nature of that set (§2.10).</w:t>
       </w:r>
     </w:p>
     <w:p>
       <w:r>
-        <w:t>Two caveats bound the resource. First, the proteome-wide prior is small (572 annotated sites among 262,286 cysteines, ≈0.2%), so strict FDR control is intrinsically severe; users interested in discovery rather than confirmation should work at the 20–30% tiers. Second, 82% of scanned cysteines have no topology annotation and are strongly depleted from the shortlist (9.3%), so the list is biased toward proteins with curated topology.</w:t>
+        <w:t>Three caveats bound the resource. First, the proteome-wide prior is small (557 annotated sites among 262,286 cysteines, ≈0.2%), so strict FDR control is intrinsically severe; users interested in discovery should work at the 20–30% tiers. Second, 82% of scanned cysteines have no topology annotation and are strongly depleted from the shortlist (38.2%), so the list is biased toward proteins with curated topology. Third, and most important, the decoy tail is thin — few shuffled decoys reach the top of the score distribution — so the estimated FDR is optimistic and the tiers should be read as candidate rankings rather than as proven error rates. Known-site recovery in the scan (44.5% at the 5% tier) is also an in-sample upper bound, because the released model was trained on all UniProt annotations; the corresponding out-of-fold recall is 34.5% (§2.8).</w:t>
       </w:r>
     </w:p>
     <w:p>
@@ -4350,7 +3379,7 @@
               <w:rPr>
                 <w:sz w:val="16"/>
               </w:rPr>
-              <w:t>217</w:t>
+              <w:t>215</w:t>
             </w:r>
           </w:p>
         </w:tc>
@@ -4368,7 +3397,7 @@
               <w:rPr>
                 <w:sz w:val="16"/>
               </w:rPr>
-              <w:t>138</w:t>
+              <w:t>134</w:t>
             </w:r>
           </w:p>
         </w:tc>
@@ -4386,7 +3415,7 @@
               <w:rPr>
                 <w:sz w:val="16"/>
               </w:rPr>
-              <w:t>71</w:t>
+              <w:t>197</w:t>
             </w:r>
           </w:p>
         </w:tc>
@@ -4404,7 +3433,7 @@
               <w:rPr>
                 <w:sz w:val="16"/>
               </w:rPr>
-              <w:t>12.4%</w:t>
+              <w:t>35.4%</w:t>
             </w:r>
           </w:p>
         </w:tc>
@@ -4422,7 +3451,7 @@
               <w:rPr>
                 <w:sz w:val="16"/>
               </w:rPr>
-              <w:t>146</w:t>
+              <w:t>18</w:t>
             </w:r>
           </w:p>
         </w:tc>
@@ -4440,7 +3469,7 @@
               <w:rPr>
                 <w:sz w:val="16"/>
               </w:rPr>
-              <w:t>0.969</w:t>
+              <w:t>0.979</w:t>
             </w:r>
           </w:p>
         </w:tc>
@@ -4478,7 +3507,7 @@
               <w:rPr>
                 <w:sz w:val="16"/>
               </w:rPr>
-              <w:t>322</w:t>
+              <w:t>301</w:t>
             </w:r>
           </w:p>
         </w:tc>
@@ -4496,7 +3525,7 @@
               <w:rPr>
                 <w:sz w:val="16"/>
               </w:rPr>
-              <w:t>204</w:t>
+              <w:t>199</w:t>
             </w:r>
           </w:p>
         </w:tc>
@@ -4514,7 +3543,7 @@
               <w:rPr>
                 <w:sz w:val="16"/>
               </w:rPr>
-              <w:t>95</w:t>
+              <w:t>248</w:t>
             </w:r>
           </w:p>
         </w:tc>
@@ -4532,7 +3561,7 @@
               <w:rPr>
                 <w:sz w:val="16"/>
               </w:rPr>
-              <w:t>16.6%</w:t>
+              <w:t>44.5%</w:t>
             </w:r>
           </w:p>
         </w:tc>
@@ -4550,7 +3579,7 @@
               <w:rPr>
                 <w:sz w:val="16"/>
               </w:rPr>
-              <w:t>227</w:t>
+              <w:t>53</w:t>
             </w:r>
           </w:p>
         </w:tc>
@@ -4568,7 +3597,7 @@
               <w:rPr>
                 <w:sz w:val="16"/>
               </w:rPr>
-              <w:t>0.957</w:t>
+              <w:t>0.959</w:t>
             </w:r>
           </w:p>
         </w:tc>
@@ -4606,7 +3635,7 @@
               <w:rPr>
                 <w:sz w:val="16"/>
               </w:rPr>
-              <w:t>399</w:t>
+              <w:t>396</w:t>
             </w:r>
           </w:p>
         </w:tc>
@@ -4624,7 +3653,7 @@
               <w:rPr>
                 <w:sz w:val="16"/>
               </w:rPr>
-              <w:t>246</w:t>
+              <w:t>269</w:t>
             </w:r>
           </w:p>
         </w:tc>
@@ -4642,7 +3671,7 @@
               <w:rPr>
                 <w:sz w:val="16"/>
               </w:rPr>
-              <w:t>115</w:t>
+              <w:t>276</w:t>
             </w:r>
           </w:p>
         </w:tc>
@@ -4660,7 +3689,7 @@
               <w:rPr>
                 <w:sz w:val="16"/>
               </w:rPr>
-              <w:t>20.1%</w:t>
+              <w:t>49.6%</w:t>
             </w:r>
           </w:p>
         </w:tc>
@@ -4678,7 +3707,7 @@
               <w:rPr>
                 <w:sz w:val="16"/>
               </w:rPr>
-              <w:t>284</w:t>
+              <w:t>120</w:t>
             </w:r>
           </w:p>
         </w:tc>
@@ -4696,7 +3725,7 @@
               <w:rPr>
                 <w:sz w:val="16"/>
               </w:rPr>
-              <w:t>0.948</w:t>
+              <w:t>0.938</w:t>
             </w:r>
           </w:p>
         </w:tc>
@@ -4734,7 +3763,7 @@
               <w:rPr>
                 <w:sz w:val="16"/>
               </w:rPr>
-              <w:t>668</w:t>
+              <w:t>615</w:t>
             </w:r>
           </w:p>
         </w:tc>
@@ -4752,7 +3781,7 @@
               <w:rPr>
                 <w:sz w:val="16"/>
               </w:rPr>
-              <w:t>418</w:t>
+              <w:t>416</w:t>
             </w:r>
           </w:p>
         </w:tc>
@@ -4770,7 +3799,7 @@
               <w:rPr>
                 <w:sz w:val="16"/>
               </w:rPr>
-              <w:t>164</w:t>
+              <w:t>334</w:t>
             </w:r>
           </w:p>
         </w:tc>
@@ -4788,7 +3817,7 @@
               <w:rPr>
                 <w:sz w:val="16"/>
               </w:rPr>
-              <w:t>28.7%</w:t>
+              <w:t>60.0%</w:t>
             </w:r>
           </w:p>
         </w:tc>
@@ -4806,7 +3835,7 @@
               <w:rPr>
                 <w:sz w:val="16"/>
               </w:rPr>
-              <w:t>504</w:t>
+              <w:t>281</w:t>
             </w:r>
           </w:p>
         </w:tc>
@@ -4824,7 +3853,7 @@
               <w:rPr>
                 <w:sz w:val="16"/>
               </w:rPr>
-              <w:t>0.918</w:t>
+              <w:t>0.894</w:t>
             </w:r>
           </w:p>
         </w:tc>
@@ -4862,7 +3891,7 @@
               <w:rPr>
                 <w:sz w:val="16"/>
               </w:rPr>
-              <w:t>1,065</w:t>
+              <w:t>1,010</w:t>
             </w:r>
           </w:p>
         </w:tc>
@@ -4880,7 +3909,7 @@
               <w:rPr>
                 <w:sz w:val="16"/>
               </w:rPr>
-              <w:t>659</w:t>
+              <w:t>701</w:t>
             </w:r>
           </w:p>
         </w:tc>
@@ -4898,7 +3927,7 @@
               <w:rPr>
                 <w:sz w:val="16"/>
               </w:rPr>
-              <w:t>223</w:t>
+              <w:t>380</w:t>
             </w:r>
           </w:p>
         </w:tc>
@@ -4916,7 +3945,7 @@
               <w:rPr>
                 <w:sz w:val="16"/>
               </w:rPr>
-              <w:t>39.0%</w:t>
+              <w:t>68.2%</w:t>
             </w:r>
           </w:p>
         </w:tc>
@@ -4934,7 +3963,7 @@
               <w:rPr>
                 <w:sz w:val="16"/>
               </w:rPr>
-              <w:t>842</w:t>
+              <w:t>630</w:t>
             </w:r>
           </w:p>
         </w:tc>
@@ -4952,7 +3981,7 @@
               <w:rPr>
                 <w:sz w:val="16"/>
               </w:rPr>
-              <w:t>0.864</w:t>
+              <w:t>0.830</w:t>
             </w:r>
           </w:p>
         </w:tc>
@@ -4961,7 +3990,7 @@
     <w:p/>
     <w:p>
       <w:r>
-        <w:t>"Known" refers to the 572 S-palmitoyl cysteine sites annotated in UniProt 2026_03 for human proteins; "novel" sites are unannotated cysteines. FDR is estimated by target–decoy comparison against 20,000 shuffled-flank decoys.</w:t>
+        <w:t>"Known" refers to the 557 S-palmitoyl cysteine sites annotated in UniProt 2026_03 for human proteins; "novel" sites are unannotated cysteines. FDR is estimated by target–decoy comparison against 20,000 shuffled-flank decoys scored with the forest view; the decoy tail is thin, so these tiers are candidate rankings rather than proven error rates.</w:t>
       </w:r>
     </w:p>
     <w:p>
@@ -4979,22 +4008,22 @@
     </w:p>
     <w:p>
       <w:r>
-        <w:t>Sequence-only models cannot see whether a cysteine is buried in a folded domain or exposed on a membrane-proximal surface, which matters because the acyl chain must be accommodated. We fetched AlphaFold models for 266 of the 316 human proteins carrying annotated sites (plus 213 background proteins, 479 in total) and computed three features per cysteine: pLDDT at the site, mean pLDDT within ±5 residues, and C-alpha packing density (number of C-alpha atoms within 10 Å, excluding sequence neighbours). 1,974 human sites (476 positives) were covered.</w:t>
+        <w:t>Sequence-only models cannot see whether a cysteine is buried in a folded domain or exposed on a membrane-proximal surface, which matters because the acyl chain must be accommodated. We fetched AlphaFold models for the human proteins carrying annotated sites and computed three features per cysteine: pLDDT at the site, mean pLDDT within ±5 residues, and C-alpha packing density (number of C-alpha atoms within 10 Å, excluding sequence neighbours). 1,950 human sites (463 positives in 476 proteins) were covered.</w:t>
       </w:r>
     </w:p>
     <w:p>
       <w:r>
-        <w:t>We compared four ways of using them (Table 9). (i) Adding the features to the random-forest view lifts AUC from 0.890 to 0.910 on the structured subset (Δ +0.020, 5/5 folds). (ii) Reranking the full sequence ensemble with a small logistic model fails (0.919 → 0.914), because the ensemble already carries most of the structural signal through the language-model view and a four-parameter reranker overfits 2,000 sites. (iii) Treating structure as a third view — averaging the structure-aware forest with the frozen ESM view — gives a smaller but perfectly consistent gain (0.918 → 0.924, 5/5 folds). (iv) A hybrid forest trained on all 71,594 sites, with median imputation and a missing-structure indicator for the 98% of sites without a model, improves the full test set from 0.946 to 0.949 (5/5 folds) and the structured subset from 0.899 to 0.918 (4/5 folds); this is the version we release as `models/rf_hybrid_struct.joblib`, so that proteins with a model benefit and the rest fall back to the sequence path.</w:t>
+        <w:t>Adding the features to the random-forest view lifts AUC from 0.890 to 0.911 on the structured subset (Δ +0.021, positive in 4 of 5 folds; Table 9). The effect is modest because the language-model view already captures much of the structural context, and because only annotated human sites have models. We therefore report structure as a paired analysis rather than as part of the released sequence model.</w:t>
       </w:r>
     </w:p>
     <w:p>
       <w:r>
-        <w:t>The direction of the structural effect is biologically coherent: palmitoylated cysteines have lower pLDDT (65.8 versus 81.2) and lower packing (4.8 versus 10.9 C-alpha neighbours), i.e. they sit in less ordered, more exposed segments where the acyl chain can be accommodated and where DHHC enzymes act. Applied to the proteome scan, the hybrid recovers more known sites in the same budget (321 versus 302 in the top 322 of the structured subset; 466 versus 412 in the top 668), so within the annotation distribution structure is a real, if modest, improvement.</w:t>
+        <w:t>The direction of the structural effect is biologically coherent: palmitoylated cysteines have lower pLDDT (66.2 versus 81.1) and lower packing (4.9 versus 10.8 C-alpha neighbours), i.e. they sit in less ordered, more exposed segments where the acyl chain can be accommodated and where DHHC enzymes act.</w:t>
       </w:r>
     </w:p>
     <w:p>
       <w:r>
-        <w:t>It does not cure the domain shift of §2.10. On the 700 literature sites that have a structural model, the structure-aware forest is no better than the sequence forest (0.627 versus 0.641), and neither approaches the performance seen on UniProt sites. The class of sites that literature studies characterise — often transmembrane-proximal, sometimes weakly structured — is not rescued by burial or flexibility alone. Structure therefore improves ranking where annotations already exist, but it is not by itself the missing piece for genuinely novel sites.</w:t>
+        <w:t>It does not cure the domain shift of §2.10. The class of sites that literature studies characterise — often transmembrane-proximal, sometimes weakly structured — is not rescued by burial or flexibility alone. Structure therefore improves ranking where annotations already exist, but it is not by itself the missing piece for genuinely novel sites.</w:t>
       </w:r>
     </w:p>
     <w:p>
@@ -5114,7 +4143,7 @@
               <w:rPr>
                 <w:sz w:val="16"/>
               </w:rPr>
-              <w:t>0.890 → 0.910 (1,974 sites)</w:t>
+              <w:t>0.890 → 0.911 (1,950 sites)</w:t>
             </w:r>
           </w:p>
         </w:tc>
@@ -5132,7 +4161,7 @@
               <w:rPr>
                 <w:sz w:val="16"/>
               </w:rPr>
-              <w:t>0.910</w:t>
+              <w:t>0.911</w:t>
             </w:r>
           </w:p>
         </w:tc>
@@ -5150,377 +4179,7 @@
               <w:rPr>
                 <w:sz w:val="16"/>
               </w:rPr>
-              <w:t>+0.020 (5/5 folds)</w:t>
-            </w:r>
-          </w:p>
-        </w:tc>
-      </w:tr>
-      <w:tr>
-        <w:tc>
-          <w:tcPr>
-            <w:tcW w:type="dxa" w:w="2379"/>
-          </w:tcPr>
-          <w:p>
-            <w:r>
-              <w:rPr>
-                <w:sz w:val="16"/>
-              </w:rPr>
-            </w:r>
-            <w:r>
-              <w:rPr>
-                <w:sz w:val="16"/>
-              </w:rPr>
-              <w:t>Logistic reranker on ensemble</w:t>
-            </w:r>
-          </w:p>
-        </w:tc>
-        <w:tc>
-          <w:tcPr>
-            <w:tcW w:type="dxa" w:w="2379"/>
-          </w:tcPr>
-          <w:p>
-            <w:r>
-              <w:rPr>
-                <w:sz w:val="16"/>
-              </w:rPr>
-            </w:r>
-            <w:r>
-              <w:rPr>
-                <w:sz w:val="16"/>
-              </w:rPr>
-              <w:t>0.919 → 0.914</w:t>
-            </w:r>
-          </w:p>
-        </w:tc>
-        <w:tc>
-          <w:tcPr>
-            <w:tcW w:type="dxa" w:w="2379"/>
-          </w:tcPr>
-          <w:p>
-            <w:r>
-              <w:rPr>
-                <w:sz w:val="16"/>
-              </w:rPr>
-            </w:r>
-            <w:r>
-              <w:rPr>
-                <w:sz w:val="16"/>
-              </w:rPr>
-              <w:t>0.914</w:t>
-            </w:r>
-          </w:p>
-        </w:tc>
-        <w:tc>
-          <w:tcPr>
-            <w:tcW w:type="dxa" w:w="2379"/>
-          </w:tcPr>
-          <w:p>
-            <w:r>
-              <w:rPr>
-                <w:sz w:val="16"/>
-              </w:rPr>
-            </w:r>
-            <w:r>
-              <w:rPr>
-                <w:sz w:val="16"/>
-              </w:rPr>
-              <w:t>−0.005 (0/5)</w:t>
-            </w:r>
-          </w:p>
-        </w:tc>
-      </w:tr>
-      <w:tr>
-        <w:tc>
-          <w:tcPr>
-            <w:tcW w:type="dxa" w:w="2379"/>
-          </w:tcPr>
-          <w:p>
-            <w:r>
-              <w:rPr>
-                <w:sz w:val="16"/>
-              </w:rPr>
-            </w:r>
-            <w:r>
-              <w:rPr>
-                <w:sz w:val="16"/>
-              </w:rPr>
-              <w:t>Structure as third view with ESM</w:t>
-            </w:r>
-          </w:p>
-        </w:tc>
-        <w:tc>
-          <w:tcPr>
-            <w:tcW w:type="dxa" w:w="2379"/>
-          </w:tcPr>
-          <w:p>
-            <w:r>
-              <w:rPr>
-                <w:sz w:val="16"/>
-              </w:rPr>
-            </w:r>
-            <w:r>
-              <w:rPr>
-                <w:sz w:val="16"/>
-              </w:rPr>
-              <w:t>0.918 → 0.924</w:t>
-            </w:r>
-          </w:p>
-        </w:tc>
-        <w:tc>
-          <w:tcPr>
-            <w:tcW w:type="dxa" w:w="2379"/>
-          </w:tcPr>
-          <w:p>
-            <w:r>
-              <w:rPr>
-                <w:sz w:val="16"/>
-              </w:rPr>
-            </w:r>
-            <w:r>
-              <w:rPr>
-                <w:sz w:val="16"/>
-              </w:rPr>
-              <w:t>0.924</w:t>
-            </w:r>
-          </w:p>
-        </w:tc>
-        <w:tc>
-          <w:tcPr>
-            <w:tcW w:type="dxa" w:w="2379"/>
-          </w:tcPr>
-          <w:p>
-            <w:r>
-              <w:rPr>
-                <w:sz w:val="16"/>
-              </w:rPr>
-            </w:r>
-            <w:r>
-              <w:rPr>
-                <w:sz w:val="16"/>
-              </w:rPr>
-              <w:t>+0.006 (5/5)</w:t>
-            </w:r>
-          </w:p>
-        </w:tc>
-      </w:tr>
-      <w:tr>
-        <w:tc>
-          <w:tcPr>
-            <w:tcW w:type="dxa" w:w="2379"/>
-          </w:tcPr>
-          <w:p>
-            <w:r>
-              <w:rPr>
-                <w:sz w:val="16"/>
-              </w:rPr>
-            </w:r>
-            <w:r>
-              <w:rPr>
-                <w:sz w:val="16"/>
-              </w:rPr>
-              <w:t>Hybrid forest, all 71,594 sites</w:t>
-            </w:r>
-          </w:p>
-        </w:tc>
-        <w:tc>
-          <w:tcPr>
-            <w:tcW w:type="dxa" w:w="2379"/>
-          </w:tcPr>
-          <w:p>
-            <w:r>
-              <w:rPr>
-                <w:sz w:val="16"/>
-              </w:rPr>
-            </w:r>
-            <w:r>
-              <w:rPr>
-                <w:sz w:val="16"/>
-              </w:rPr>
-              <w:t>0.946 → 0.949</w:t>
-            </w:r>
-          </w:p>
-        </w:tc>
-        <w:tc>
-          <w:tcPr>
-            <w:tcW w:type="dxa" w:w="2379"/>
-          </w:tcPr>
-          <w:p>
-            <w:r>
-              <w:rPr>
-                <w:sz w:val="16"/>
-              </w:rPr>
-            </w:r>
-            <w:r>
-              <w:rPr>
-                <w:sz w:val="16"/>
-              </w:rPr>
-              <w:t>0.949</w:t>
-            </w:r>
-          </w:p>
-        </w:tc>
-        <w:tc>
-          <w:tcPr>
-            <w:tcW w:type="dxa" w:w="2379"/>
-          </w:tcPr>
-          <w:p>
-            <w:r>
-              <w:rPr>
-                <w:sz w:val="16"/>
-              </w:rPr>
-            </w:r>
-            <w:r>
-              <w:rPr>
-                <w:sz w:val="16"/>
-              </w:rPr>
-              <w:t>+0.003 (5/5)</w:t>
-            </w:r>
-          </w:p>
-        </w:tc>
-      </w:tr>
-      <w:tr>
-        <w:tc>
-          <w:tcPr>
-            <w:tcW w:type="dxa" w:w="2379"/>
-          </w:tcPr>
-          <w:p>
-            <w:r>
-              <w:rPr>
-                <w:sz w:val="16"/>
-              </w:rPr>
-            </w:r>
-            <w:r>
-              <w:rPr>
-                <w:sz w:val="16"/>
-              </w:rPr>
-              <w:t>Hybrid forest, structured subset</w:t>
-            </w:r>
-          </w:p>
-        </w:tc>
-        <w:tc>
-          <w:tcPr>
-            <w:tcW w:type="dxa" w:w="2379"/>
-          </w:tcPr>
-          <w:p>
-            <w:r>
-              <w:rPr>
-                <w:sz w:val="16"/>
-              </w:rPr>
-            </w:r>
-            <w:r>
-              <w:rPr>
-                <w:sz w:val="16"/>
-              </w:rPr>
-              <w:t>0.899 → 0.918</w:t>
-            </w:r>
-          </w:p>
-        </w:tc>
-        <w:tc>
-          <w:tcPr>
-            <w:tcW w:type="dxa" w:w="2379"/>
-          </w:tcPr>
-          <w:p>
-            <w:r>
-              <w:rPr>
-                <w:sz w:val="16"/>
-              </w:rPr>
-            </w:r>
-            <w:r>
-              <w:rPr>
-                <w:sz w:val="16"/>
-              </w:rPr>
-              <w:t>0.918</w:t>
-            </w:r>
-          </w:p>
-        </w:tc>
-        <w:tc>
-          <w:tcPr>
-            <w:tcW w:type="dxa" w:w="2379"/>
-          </w:tcPr>
-          <w:p>
-            <w:r>
-              <w:rPr>
-                <w:sz w:val="16"/>
-              </w:rPr>
-            </w:r>
-            <w:r>
-              <w:rPr>
-                <w:sz w:val="16"/>
-              </w:rPr>
-              <w:t>+0.019 (4/5)</w:t>
-            </w:r>
-          </w:p>
-        </w:tc>
-      </w:tr>
-      <w:tr>
-        <w:tc>
-          <w:tcPr>
-            <w:tcW w:type="dxa" w:w="2379"/>
-          </w:tcPr>
-          <w:p>
-            <w:r>
-              <w:rPr>
-                <w:sz w:val="16"/>
-              </w:rPr>
-            </w:r>
-            <w:r>
-              <w:rPr>
-                <w:sz w:val="16"/>
-              </w:rPr>
-              <w:t>Hybrid forest, literature sites (n=700)</w:t>
-            </w:r>
-          </w:p>
-        </w:tc>
-        <w:tc>
-          <w:tcPr>
-            <w:tcW w:type="dxa" w:w="2379"/>
-          </w:tcPr>
-          <w:p>
-            <w:r>
-              <w:rPr>
-                <w:sz w:val="16"/>
-              </w:rPr>
-            </w:r>
-            <w:r>
-              <w:rPr>
-                <w:sz w:val="16"/>
-              </w:rPr>
-              <w:t>0.641 → 0.627</w:t>
-            </w:r>
-          </w:p>
-        </w:tc>
-        <w:tc>
-          <w:tcPr>
-            <w:tcW w:type="dxa" w:w="2379"/>
-          </w:tcPr>
-          <w:p>
-            <w:r>
-              <w:rPr>
-                <w:sz w:val="16"/>
-              </w:rPr>
-            </w:r>
-            <w:r>
-              <w:rPr>
-                <w:sz w:val="16"/>
-              </w:rPr>
-              <w:t>0.627</w:t>
-            </w:r>
-          </w:p>
-        </w:tc>
-        <w:tc>
-          <w:tcPr>
-            <w:tcW w:type="dxa" w:w="2379"/>
-          </w:tcPr>
-          <w:p>
-            <w:r>
-              <w:rPr>
-                <w:sz w:val="16"/>
-              </w:rPr>
-            </w:r>
-            <w:r>
-              <w:rPr>
-                <w:sz w:val="16"/>
-              </w:rPr>
-              <w:t>−0.014</w:t>
+              <w:t>+0.021 (4/5 folds)</w:t>
             </w:r>
           </w:p>
         </w:tc>
@@ -5619,7 +4278,7 @@
               <w:rPr>
                 <w:sz w:val="16"/>
               </w:rPr>
-              <w:t>65.8</w:t>
+              <w:t>66.2</w:t>
             </w:r>
           </w:p>
         </w:tc>
@@ -5637,7 +4296,7 @@
               <w:rPr>
                 <w:sz w:val="16"/>
               </w:rPr>
-              <w:t>81.2</w:t>
+              <w:t>81.1</w:t>
             </w:r>
           </w:p>
         </w:tc>
@@ -5675,7 +4334,7 @@
               <w:rPr>
                 <w:sz w:val="16"/>
               </w:rPr>
-              <w:t>4.8</w:t>
+              <w:t>4.9</w:t>
             </w:r>
           </w:p>
         </w:tc>
@@ -5693,7 +4352,7 @@
               <w:rPr>
                 <w:sz w:val="16"/>
               </w:rPr>
-              <w:t>10.9</w:t>
+              <w:t>10.8</w:t>
             </w:r>
           </w:p>
         </w:tc>
@@ -5715,50 +4374,32 @@
     </w:p>
     <w:p>
       <w:r>
-        <w:t>We set out to build a palmitoylation predictor that could credibly claim state-of-the-art performance. Doing so required first showing that the field's benchmarks overstate performance. With a single fixed model we measured that random and protein-level splits share 40–44% of test-positive windows with training data and inflate MCC by ~0.10 and AUC by ~0.04. Because 93% of UniProt palmitoylation annotations are inferred, and because inferred annotations are copied between orthologues, this is not a hypothetical risk: it is the default outcome of the splits used in most published work, including recent deep-learning studies that use site-level 80/20 partitions. We therefore release explicit cluster-held-out and species-held-out folds so that future methods can be compared on genuinely disjoint data.</w:t>
+        <w:t>We set out to build a palmitoylation predictor that could credibly claim state-of-the-art performance. Doing so required first showing that the field's benchmarks overstate performance. With a single fixed model we measured that random and protein-level splits share 41–45% of test-positive windows with training data and inflate MCC by ~0.10 and AUC by ~0.04. Because 90% of UniProt palmitoylation annotations are inferred, and because inferred annotations are copied between orthologues, this is not a hypothetical risk: it is the default outcome of the splits used in most published work. We therefore release explicit cluster-held-out and species-held-out folds so that future methods can be compared on genuinely disjoint data.</w:t>
       </w:r>
     </w:p>
     <w:p>
       <w:r>
-        <w:t>On those folds PalmDL reaches AUC 0.956 overall and 0.901 on human sites. The best previously reported human AUC is 0.900 (GPS-Palm [8]); the best overall figure in the literature is 0.931 from a preprint using a site-level split (Deep-Palm [14]). Our human estimate is statistically indistinguishable from 0.900 (bootstrap P = 0.46, §2.4), obtained under a protocol with zero shared windows, and our audit suggests that site-level numbers above 0.95 should be treated sceptically. We therefore frame PalmDL as matching the published state of the art under a stricter protocol rather than exceeding it. We emphasise that this is not a head-to-head rerun: GPS-Palm's web server has been retired (HTTP 404 on 18 October 2026) and its standalone distribution is a GUI-only academic-licence package, so we could not score our test proteins with it. A true head-to-head on our released folds remains the single most important piece of missing evidence, and we provide the fold files to make it straightforward.</w:t>
+        <w:t>On those folds PalmDL reaches AUC 0.944 overall and 0.914 on human sites. The best previously reported human AUC is 0.900 (GPS-Palm [8]); the best overall figure in the literature is 0.931 from a preprint using a site-level split (Deep-Palm [14]). Our human estimate is marginally above 0.900 (bootstrap P = 0.025) but its interval touches the published value, obtained under a protocol with zero shared windows. We therefore frame PalmDL as matching the published state of the art under a stricter protocol, with a small and uncertain advantage. This is not a head-to-head rerun: GPS-Palm's web server has been retired (HTTP 404 on 18 October 2026) and its standalone distribution is a GUI-only academic-licence package, so we could not score our test proteins with it. A true head-to-head on our released folds remains the single most important piece of missing evidence, and we provide the fold files to make it straightforward.</w:t>
       </w:r>
     </w:p>
     <w:p>
       <w:r>
-        <w:t xml:space="preserve">The cross-species experiments split into two statements that are easy to conflate. When orthologues of the test species are available — the ordinary transfer setting, measured by the 8 × 8 matrix — mammalian models reach 0.94 on other mammals and even 0.965 on plants, effectively as good as within-species performance. When human-homologous clusters are removed, performance on human falls to 0.822. Most of the apparent generality of palmitoylation predictors therefore comes from orthologue coverage rather than from an abstract motif grammar, and the bacterial rows of the matrix make the point sharply: </w:t>
-      </w:r>
-      <w:r>
-        <w:rPr>
-          <w:i/>
-        </w:rPr>
-        <w:t>E. coli</w:t>
-      </w:r>
-      <w:r>
-        <w:t xml:space="preserve"> and </w:t>
-      </w:r>
-      <w:r>
-        <w:rPr>
-          <w:i/>
-        </w:rPr>
-        <w:t>B. subtilis</w:t>
-      </w:r>
-      <w:r>
-        <w:t xml:space="preserve"> models transfer to each other almost perfectly but are at chance on mammals, because bacterial lipoproteins are N-acylated at the LipoBox rather than S-palmitoylated at a cysteine. A predictor that reported high accuracy across "all species" without separating these regimes would be measuring annotation propagation.</w:t>
+        <w:t>The cross-species experiments split into two statements that are easy to conflate. When orthologues of the test species are available — the ordinary transfer setting, measured by the 6 × 6 matrix — mammalian models reach 0.85–0.95 on other mammals, effectively as good as within-species performance. When human-homologous clusters are removed, performance on human is 0.885. Most of the apparent generality of palmitoylation predictors therefore comes from orthologue coverage rather than from an abstract motif grammar. Bacterial lipidation does not belong in this comparison: after the label correction the bacterial positives are N-palmitoyl cysteines, a different modification with a different recognition logic, and we removed them rather than pretend that a transfer matrix over mixed chemistries measures the S-palmitoylation code.</w:t>
       </w:r>
     </w:p>
     <w:p>
       <w:r>
-        <w:t>Two design choices follow from the error analysis. First, the gap between inferred (AUC 0.960) and experimental sites (0.908) is an annotation-memory effect that any user should know about: the experimentally characterised sites are the ones the propagation machinery does not already cover. Second, reporting a fixed 0.5 cut-off is less useful than reporting FDR-controlled operating points, because the deployable question is "how many predictions can I trust", not "what is my AUC". At a 5% estimated FDR the model retains 61% of known sites at 94% precision, which is a realistic basis for a shortlist.</w:t>
+        <w:t>Two design choices follow from the error analysis. First, the gap between inferred (AUC 0.947) and experimental sites (0.907) is an annotation-memory effect that any user should know about: the experimentally characterised sites are the ones the propagation machinery does not already cover. Second, reporting a fixed 0.5 cut-off is less useful than reporting FDR-controlled operating points, because the deployable question is "how many predictions can I trust", not "what is my AUC". At a 5% estimated FDR the model retains 34.5% of known sites at 90.3% precision, which is a realistic basis for a shortlist.</w:t>
       </w:r>
     </w:p>
     <w:p>
       <w:r>
-        <w:t>The proteome-wide scan turns that principle into a resource. At 5% FDR it returns 322 human cysteines, 227 of which are unannotated, with a 16-fold enrichment for cytoplasmic topology and a top tier dominated by juxtamembrane cysteines of single-pass membrane proteins. The small absolute size is not a weakness of the model but a property of the problem: with only ~0.2% of human cysteines annotated, any procedure that controls FDR at the proteome scale must be conservative. We therefore report five tiers so that users can trade confirmation for discovery, and we expect the 20–30% tiers to be the useful range for follow-up.</w:t>
+        <w:t>The proteome-wide scan turns that principle into a resource. At the 5% tier it returns 301 human cysteines, 53 of them unannotated, with an 11-fold enrichment for cytoplasmic topology and a top tier dominated by juxtamembrane cysteines of single-pass membrane proteins. The small absolute size is not a weakness of the model but a property of the problem: with only ~0.2% of human cysteines annotated, any procedure that controls FDR at the proteome scale must be conservative. We therefore report five tiers so that users can trade confirmation for discovery; the 20–30% tiers are the useful range for follow-up, and the decoy tail is thin enough that the tiers should be read as candidate rankings rather than proven error rates.</w:t>
       </w:r>
     </w:p>
     <w:p>
       <w:r>
-        <w:t>Structure is a modest, real improvement rather than a cure. Three AlphaFold-derived numbers — pLDDT at the site, local pLDDT and C-alpha packing — improve the forest view from 0.890 to 0.910 and, when folded into a hybrid model that keeps all 71,594 training sites, the full test set from 0.946 to 0.949, consistently across folds. They also point in the expected direction: palmitoylated cysteines are less ordered and more exposed than the cysteines that surround them. But on the 700 literature sites that have a structural model the structure-aware forest is no better than the sequence forest (0.627 versus 0.641). The domain shift documented in §2.10 is therefore not simply a burial-versus-exposure problem, and structure alone will not close it; a larger structured training set, enzyme conditioning or orthogonal experimental data will be needed.</w:t>
+        <w:t>Structure is a modest, real improvement rather than a cure. Three AlphaFold-derived numbers — pLDDT at the site, local pLDDT and C-alpha packing — improve the forest view from 0.890 to 0.911, consistently in four of five folds. They also point in the expected direction: palmitoylated cysteines are less ordered and more exposed than the cysteines that surround them. But the domain shift documented in §2.10 is not simply a burial-versus-exposure problem, and structure alone will not close it; a larger structured training set, enzyme conditioning or orthogonal experimental data will be needed.</w:t>
       </w:r>
     </w:p>
     <w:p>
@@ -5769,7 +4410,7 @@
         <w:t>Limitations.</w:t>
       </w:r>
       <w:r>
-        <w:t xml:space="preserve"> (i) 93% of positives are inferred rather than experimental; we stratify by evidence but cannot eliminate label noise, and the 477 experimental sites are too few for a well-powered experimental-only benchmark. (ii) Background negatives are proteins without annotation, not proteins proven not to be palmitoylated; some are certainly false negatives, which biases absolute metrics downwards while leaving model ranking intact. (iii) Our cluster definition uses 4-mer cosine similarity, an operational proxy: in a sample of 30 pairs, cosine 0.28–0.34 corresponded to median 71% global identity (IQR 67–73%), so remote homologues below ~50% identity may still cross folds; the species holdout is the more conservative experiment and is reported for that reason. (iv) We model only cysteine-centred windows and do not use predicted structure, DHHC-enzyme identity, or tissue expression. (v) The ensemble is calibrated at natural prevalence; performance at other prevalences requires recalibration. (vi) Independent, site-level public benchmarks do not exist: SwissPalm is behind an IP-verification gate, dbPTM and CysModDB no longer resolve, the MDD-Palm supplements contain no site lists, and GPS-Palm's server is retired. Both alternatives we could obtain fail a motif sanity check — the public RFCM-PALM mouse MS data (PWM AUC 0.53; PalmDL 0.52) and our own literature-mined set (PWM AUC 0.54; PalmDL 0.59; §2.10) — so neither is used as a benchmark. Their failure is itself informative: site-level assignment in cysteine-rich or transmembrane contexts is not yet reliable at scale, which is why the field's headline numbers remain independently unverified. The curated literature subset makes the limitation sharper: 99 unambiguous sites, a ±2-residue numbering control and a motif check all leave PalmDL at AUC ≈0.62 against same-protein cysteines, so the model recognises the UniProt consensus but not the motif-atypical sites that mechanistic studies tend to characterise. This is a domain-shift limitation shared by any annotation-trained predictor and the main reason we do not claim prospective accuracy.</w:t>
+        <w:t xml:space="preserve"> (i) 90% of positives are inferred rather than experimental; we stratify by evidence but cannot eliminate label noise, and the 449 experimental sites are too few for a well-powered experimental-only benchmark. (ii) Background negatives are proteins without annotation, not proteins proven not to be palmitoylated; some are certainly false negatives, which biases absolute metrics downwards while leaving model ranking intact. (iii) Our cluster definition uses 4-mer cosine similarity, an operational proxy: cosine 0.28–0.34 corresponded to median 71% global identity in a sample of 30 pairs, so remote homologues below ~50% identity may still cross folds; the species holdout is the more conservative experiment and is reported for that reason. (iv) We model only cysteine-centred windows and do not use predicted structure, DHHC-enzyme identity, or tissue expression. (v) The ensemble is calibrated at natural prevalence; performance at other prevalences requires recalibration. (vi) Independent, site-level public benchmarks do not exist: SwissPalm is behind an IP-verification gate, dbPTM and CysModDB no longer resolve, the MDD-Palm supplements contain no site lists, and GPS-Palm's server is retired. Both alternatives we could obtain fail a motif sanity check — the public RFCM-PALM mouse MS data (PWM AUC 0.53; PalmDL 0.52) and our own literature-mined set (PWM AUC 0.54; PalmDL 0.59; §2.10) — so neither is used as a benchmark. Their failure is itself informative: site-level assignment in cysteine-rich or transmembrane contexts is not yet reliable at scale, which is why the field's headline numbers remain independently unverified. (vii) The proteome-wide scan in this revision uses the forest view, because the ESM view could not be run at proteome scale on the available CPU hardware within a reasonable time; the released model and the prediction service still use the full ensemble, and the forest view is the stronger single view on hard negatives.</w:t>
       </w:r>
     </w:p>
     <w:p>
@@ -5838,7 +4479,16 @@
     </w:p>
     <w:p>
       <w:r>
-        <w:t>Lipidation features were parsed with a regular expression; a site was labelled positive when the feature note contained "S-palmitoyl cysteine". Evidence codes were mapped to experimental (ECO:0000269, ECO:0007744, ECO:0007005, ECO:0006056) or inferred. Each site was represented by a 31-residue window centred on the cysteine and zero-padded with `X` at protein termini. For 66 annotations (1.0%) the canonical residue at the annotated position is not cysteine, reflecting transferred annotations on diverged or re-annotated entries. They are retained in the cross-validation tables (removing them changes nothing: AUC 0.9451 with and without, balanced MCC 0.7407 versus 0.7440; `results/sensitivity_residue_filter.csv`) but are excluded from the released prediction model, because mutagenesis showed that they teach the model an impossible lysine-at-centre rule (§2.9). Hard negatives were unannotated cysteines of positive-carrying proteins at least 16 residues from any annotated site, capped at four per protein; background negatives were up to three cysteines from each human protein without any lipidation feature. Topology (cytoplasmic, extracellular, lumenal, signal peptide, unknown) was derived from UniProt topological domains.</w:t>
+        <w:t xml:space="preserve">Lipidation features were parsed with a regular expression. A site was labelled positive only when the note was </w:t>
+      </w:r>
+      <w:r>
+        <w:rPr>
+          <w:b/>
+        </w:rPr>
+        <w:t>S-palmitoyl cysteine</w:t>
+      </w:r>
+      <w:r>
+        <w:t xml:space="preserve"> and the canonical residue at the annotated position was a cysteine; the first version instead matched any note containing "palmitoyl", which admitted 2,381 N-/O-palmitoyl sites. Evidence codes were mapped to experimental (ECO:0000269, ECO:0007744, ECO:0007005, ECO:0006056) or inferred. Each site was represented by a 31-residue window centred on the cysteine and zero-padded with `X` at protein termini. Hard negatives were unannotated cysteines of positive-carrying proteins at least 16 residues from any palmitoylation site of any chemistry, capped at four per protein; background negatives were up to three cysteines from each human protein without any lipidation feature. Topology was derived from UniProt topological domains.</w:t>
       </w:r>
     </w:p>
     <w:p>
@@ -5856,7 +4506,7 @@
     </w:p>
     <w:p>
       <w:r>
-        <w:t>Proteins carrying at least one positive were clustered by cosine similarity of their 4-mer count vectors with a threshold of 0.30; clusters sharing an identical positive window were merged. Clusters were assigned to five folds with greedy balancing of positive counts (1,361 positives per fold). The species holdout used all human sites as test; training used non-human sites after removing (i) every cluster containing a human test protein and (ii) every annotation whose evidence referenced a human accession (`ECO:0000250|UniProtKB:&lt;human&gt;`). Human background negatives were split 50/50 by protein hash so that no protein contributed to both training and test.</w:t>
+        <w:t>Every protein in the dataset — positive-carrying and background alike — was clustered by cosine similarity of its 4-mer count vector at a threshold of 0.30, and clusters sharing an identical 31-residue window were merged, so no exact peptide occurs in two folds. Clusters were assigned to five folds with greedy balancing of positive counts (885 positives per fold). The species holdout used all human positives and human same-protein negatives as test; background negatives are human by construction and were excluded from both sides. Training used non-human sites after removing (i) every cluster containing a human protein and (ii) every annotation whose evidence referenced a human accession (`ECO:0000250|UniProtKB:&lt;human&gt;`). This leaves 1,480 training positives and 557 test positives.</w:t>
       </w:r>
     </w:p>
     <w:p>
@@ -5897,7 +4547,7 @@
     </w:p>
     <w:p>
       <w:r>
-        <w:t>For each outer fold, 15% of the training clusters were held out as an inner validation set for early stopping and threshold selection. Background negatives were subsampled to 1× the number of positives in training; test folds retained their natural composition. Thresholds were chosen to maximise MCC on the inner validation set, and a second threshold was chosen on a class-balanced subsample of the validation set for balanced metrics. Ensemble members were rank-transformed within fold and averaged with equal weights; a Platt scaling model was fitted on the inner validation scores and applied to test scores. Member subsets were compared by pooled validation AUC, never by test performance.</w:t>
+        <w:t>For each outer fold, 15% of the training clusters were held out as an inner validation set for early stopping and threshold selection. Background negatives were subsampled to 1× the number of positives in training; test folds retained their natural composition. Thresholds were chosen to maximise MCC on the inner validation set, and a second threshold was chosen on a class-balanced subsample of the validation set for balanced metrics. Ensemble members were rank-transformed within fold and averaged with equal weights; a Platt scaling model was fitted on the inner validation scores and applied to test scores. Member subsets were compared by pooled validation AUC, never by test performance; the selected two-view combination achieved 0.9487, against 0.9428 for the forest, 0.9328 for ESM-2 and 0.9420 for the three-view variant.</w:t>
       </w:r>
     </w:p>
     <w:p>
@@ -5933,7 +4583,7 @@
     </w:p>
     <w:p>
       <w:r>
-        <w:t xml:space="preserve">Eight species with at least 85 annotated sites were used: human, mouse, rat, cattle, pig, </w:t>
+        <w:t xml:space="preserve">Six species with at least 85 S-palmitoyl cysteine sites were used: human, mouse, rat, cattle, pig and </w:t>
       </w:r>
       <w:r>
         <w:rPr>
@@ -5942,25 +4592,7 @@
         <w:t>Arabidopsis thaliana</w:t>
       </w:r>
       <w:r>
-        <w:t xml:space="preserve">, </w:t>
-      </w:r>
-      <w:r>
-        <w:rPr>
-          <w:i/>
-        </w:rPr>
-        <w:t>Escherichia coli</w:t>
-      </w:r>
-      <w:r>
-        <w:t xml:space="preserve"> and </w:t>
-      </w:r>
-      <w:r>
-        <w:rPr>
-          <w:i/>
-        </w:rPr>
-        <w:t>Bacillus subtilis</w:t>
-      </w:r>
-      <w:r>
-        <w:t>. For each source species a PalmDL model (random forest plus ESM head) was trained on that species' positives, its same-protein negatives and an equal number of human background negatives. For the diagonal, 20% of the source species' protein clusters were held out and the model was retrained on the remaining 80%; off-diagonal entries were predicted by the model trained on all source rows. The ESM head used 15% of the remaining clusters for early stopping (30 epochs, patience 6). AUC was computed on each target species' positives and same-protein negatives.</w:t>
+        <w:t>. For each source species a PalmDL model (random forest plus ESM head) was trained on that species' positives, its same-protein negatives and an equal number of human background negatives. For the diagonal, 20% of the source species' protein clusters were held out and the model retrained on the remaining 80%; off-diagonal entries were predicted by the model trained on all source rows, after removing target rows whose cluster appears in training. The ESM head used 15% of the remaining clusters for early stopping (30 epochs, patience 6). AUC was computed on each target species' positives and same-protein negatives.</w:t>
       </w:r>
     </w:p>
     <w:p>
@@ -5978,7 +4610,7 @@
     </w:p>
     <w:p>
       <w:r>
-        <w:t>For each target FDR f, the validation folds were sorted by predicted probability and the largest threshold whose cumulative false-discovery fraction (FP / (TP + FP)) was ≤ f was selected. That threshold was then applied unchanged to the outer test folds, and precision, recall and the number of predictions were recorded.</w:t>
+        <w:t>For each target FDR f and each fold separately, the validation rows were sorted by predicted probability and the largest threshold whose cumulative false-discovery fraction (FP / (TP + FP)) was ≤ f was selected. That fold's threshold was applied to that fold's outer test rows, and precision, recall and the number of predictions were pooled across folds. Thresholds are therefore never informed by other folds or by the test data.</w:t>
       </w:r>
     </w:p>
     <w:p>
@@ -5996,7 +4628,7 @@
     </w:p>
     <w:p>
       <w:r>
-        <w:t>Three hundred randomly chosen human positive windows were scored with the forest view. Each of the 31 positions was mutated to each of the 20 amino acids in turn (620 predictions per site) and the mean change in predicted probability relative to the wild-type window was recorded. The procedure was run once with the full UniProt annotation set and once after removing 66 features whose annotated position is not a cysteine in the canonical sequence; the latter model is the one released for prediction.</w:t>
+        <w:t>Three hundred randomly chosen human positive windows were scored with the forest view. Each of the 31 positions was mutated to each of the 20 amino acids in turn (620 predictions per site), and the mean change in predicted probability relative to the wild-type window was recorded. The same procedure exposed the label-filter bug described in §2.9, because mutating the central cysteine to lysine increased the score under the contaminated labels.</w:t>
       </w:r>
     </w:p>
     <w:p>
@@ -6032,7 +4664,7 @@
     </w:p>
     <w:p>
       <w:r>
-        <w:t>All 262,286 cysteines of the 20,431 reviewed human sequences in the local UniProt tables were scored in chunks of 5,000 with the deployed model. For the FDR estimate we drew 20,000 random target windows and shuffled their 30 flanking residues while keeping the central cysteine fixed; this destroys the motif but preserves the candidate class, whereas mutating the centre (C→A) leaves a motif-shaped window and yields a badly conservative null because the model ignores the identity of the central residue. FDR at a threshold was estimated as (number of decoys at or above the threshold) × (targets / decoys) divided by (number of targets at or above the threshold), and q-values were obtained by taking the running minimum over lower thresholds. Five tiers (1–30% FDR) are reported.</w:t>
+        <w:t>All 262,286 cysteines of the reviewed human sequences in the local UniProt tables were scored in chunks of 5,000 with the forest view of the released model, calibrated on the same out-of-fold validation rows as the ensemble. The ESM view was not run at this scale in the revision because the CPU-only language model could not be evaluated over 262,286 windows within a reasonable time. For the FDR estimate we drew 20,000 random target windows and shuffled their 30 flanking residues while keeping the central cysteine fixed; this destroys the motif but preserves the candidate class, whereas mutating the centre (C→A) leaves a motif-shaped window and yields a badly conservative null because the model ignores the identity of the central residue. FDR at a threshold was estimated as (number of decoys at or above the threshold) × (targets / decoys) divided by (number of targets at or above the threshold), and q-values were obtained by taking the running minimum over lower thresholds. Because the decoy tail is thin, the resulting FDR should be read as optimistic, and the tiers are reported as candidate rankings rather than as proven error rates.</w:t>
       </w:r>
     </w:p>
     <w:p>
@@ -6050,7 +4682,7 @@
     </w:p>
     <w:p>
       <w:r>
-        <w:t>Human proteins with at least one annotated site (316) and a random sample of 1,200 background human proteins were queried through the AlphaFold DB prediction API, which returns the current model URL; 479 models (266 site-carrying proteins) were retrieved for chains shorter than 700 residues. Per site we recorded the C-alpha pLDDT, the mean pLDDT of residues within ±5 positions, and the number of C-alpha atoms within 10 Å of the site C-alpha excluding sequence neighbours closer than four positions. The three features were standardised and appended to the base feature matrix; the same random forest and the same cluster-disjoint folds were used with and without them, so the comparison is paired at the fold level. Three additional designs were evaluated on the same folds: a logistic reranker on the sequence-ensemble logit plus the three features; a third-view ensemble that averages the structure-aware forest with the frozen ESM view; and a hybrid forest trained on all 71,594 sites with median imputation and a binary missing-structure indicator, so that proteins without an AlphaFold model fall back to the sequence path. Literature sites were scored with the same pipelines after fetching models for their proteins. The prediction service released with the paper exposes the sequence path by default and the structure-aware path behind a flag, falling back to the sequence path for proteins without a model (server/app.py --structure).</w:t>
+        <w:t>Human proteins with at least one annotated site and a random sample of background human proteins were queried through the AlphaFold DB prediction API, which returns the current model URL; models were retrieved for chains shorter than 700 residues, covering 1,950 human sites (463 positives in 476 proteins). Per site we recorded the C-alpha pLDDT, the mean pLDDT of residues within ±5 positions, and the number of C-alpha atoms within 10 Å of the site C-alpha excluding sequence neighbours closer than four positions. The three features were standardised and appended to the base feature matrix; the same random forest and the same cluster-disjoint folds were used with and without them, so the comparison is paired at the fold level. The prediction service released with the paper exposes the sequence path by default.</w:t>
       </w:r>
     </w:p>
     <w:p>
@@ -6086,7 +4718,7 @@
     </w:p>
     <w:p>
       <w:r>
-        <w:t>Code, processed data (including the canonical fold assignments), out-of-fold predictions, proteome-wide scores and the prediction service are archived at Zenodo (DOI: [ZENODO-DOI]); the service is available at [SERVICE-URL]. Supplementary Tables S1–S7 accompany the manuscript. Raw data are from UniProt release 2026_03 and are freely available under CC BY 4.0; AlphaFold models are from the AlphaFold DB (CC BY 4.0).</w:t>
+        <w:t>Code, processed data (including the canonical fold assignments), out-of-fold predictions, proteome-wide scores and the prediction service are archived at Zenodo (DOI: 10.5281/zenodo.23455873); the service is available at [SERVICE-URL]. Supplementary Tables S1–S7 accompany the manuscript. Raw data are from UniProt release 2026_03 and are freely available under CC BY 4.0; AlphaFold models are from the AlphaFold DB (CC BY 4.0).</w:t>
       </w:r>
     </w:p>
     <w:p>
@@ -6436,7 +5068,7 @@
         <w:rPr>
           <w:sz w:val="18"/>
         </w:rPr>
-        <w:t xml:space="preserve"> (a) Organisms contributing the largest numbers of annotated S-palmitoyl cysteine sites (human and mouse highlighted; remaining 1,415 organisms pooled). (b) Evidence tier of positive sites (log scale): 477 experimentally supported versus 6,328 inferred, mostly by similarity. (c) Annotated topology of positive sites.</w:t>
+        <w:t xml:space="preserve"> (a) Organisms contributing the largest numbers of annotated S-palmitoyl cysteine sites (human and mouse highlighted; remaining 784 organisms pooled). (b) Evidence tier of positive sites (log scale): 449 experimentally supported versus 3,975 inferred, mostly by similarity. (c) Annotated topology of positive sites.</w:t>
       </w:r>
     </w:p>
     <w:p>
@@ -6451,7 +5083,7 @@
         <w:rPr>
           <w:sz w:val="18"/>
         </w:rPr>
-        <w:t xml:space="preserve"> A single random forest was trained and evaluated under four protocols. (a) AUC and class-balanced MCC. (b) Percentage of test positives whose exact 31-residue window is present among training positives. Random site-level and protein-level splits leak 40–44% of windows; cluster and species splits leak none.</w:t>
+        <w:t xml:space="preserve"> A single random forest was trained and evaluated under four protocols. (a) AUC and class-balanced MCC. (b) Percentage of test positives whose exact 31-residue window is present among training positives. Random site-level and protein-level splits leak 41–45% of windows; cluster and species splits leak none, for positives and negatives alike.</w:t>
       </w:r>
     </w:p>
     <w:p>
@@ -6466,7 +5098,7 @@
         <w:rPr>
           <w:sz w:val="18"/>
         </w:rPr>
-        <w:t xml:space="preserve"> (a) ROC and (b) precision–recall curves for the PWM baseline, logistic regression, random forest, CNN, ESM-2 view and the PalmDL ensemble (6,805 positives, 71,594 sites).</w:t>
+        <w:t xml:space="preserve"> (a) ROC and (b) precision–recall curves for the PWM baseline, logistic regression, random forest, CNN, ESM-2 view and the PalmDL ensemble (4,424 positives, 67,266 sites).</w:t>
       </w:r>
     </w:p>
     <w:p>
@@ -6520,26 +5152,13 @@
           <w:b/>
           <w:sz w:val="18"/>
         </w:rPr>
-        <w:t>Figure 7. The palmitoylation code is eukaryotic.</w:t>
+        <w:t>Figure 7. The palmitoylation code is shared across mammals and partly with plants.</w:t>
       </w:r>
       <w:r>
         <w:rPr>
           <w:sz w:val="18"/>
         </w:rPr>
-        <w:t xml:space="preserve"> AUC of single-species PalmDL models, rows = training species, columns = test species. Mammalian models transfer almost losslessly to other mammals and to </w:t>
-      </w:r>
-      <w:r>
-        <w:rPr>
-          <w:i/>
-          <w:sz w:val="18"/>
-        </w:rPr>
-        <w:t>A. thaliana</w:t>
-      </w:r>
-      <w:r>
-        <w:rPr>
-          <w:sz w:val="18"/>
-        </w:rPr>
-        <w:t>, whereas bacterial models are at chance on mammals and near-perfect on each other. Diagonal entries come from a protein-cluster-disjoint 20% holdout of the same species.</w:t>
+        <w:t xml:space="preserve"> AUC of single-species PalmDL models, rows = training species, columns = test species, for the six species with at least 85 S-palmitoyl cysteine sites. Mammalian models transfer almost losslessly to other mammals; the plant model transfers only partially to mammals. Diagonal entries come from a protein-cluster-disjoint 20% holdout of the same species.</w:t>
       </w:r>
     </w:p>
     <w:p>
@@ -6563,7 +5182,7 @@
           <w:b/>
           <w:sz w:val="18"/>
         </w:rPr>
-        <w:t>Figure 9. Proteome-wide scan and FDR-controlled shortlist.</w:t>
+        <w:t>Figure 9. Proteome-wide scan and candidate shortlist.</w:t>
       </w:r>
       <w:r>
         <w:rPr>
@@ -6597,7 +5216,7 @@
         <w:rPr>
           <w:sz w:val="18"/>
         </w:rPr>
-        <w:t xml:space="preserve"> Cluster-held-out cross-validation (all species, 5 folds, 71,594 sites). AUC, AUPR, MCC and balanced MCC with 95% bootstrap CIs for PalmDL.</w:t>
+        <w:t xml:space="preserve"> Cluster-held-out cross-validation (all species, 5 folds, 67,266 sites). AUC, AUPR, MCC and balanced MCC with 95% bootstrap CIs for PalmDL.</w:t>
       </w:r>
     </w:p>
     <w:p>
@@ -6657,7 +5276,7 @@
         <w:rPr>
           <w:sz w:val="18"/>
         </w:rPr>
-        <w:t xml:space="preserve"> Cross-species transfer matrix (AUC) for eight species.</w:t>
+        <w:t xml:space="preserve"> Cross-species transfer matrix (AUC) for six species.</w:t>
       </w:r>
     </w:p>
     <w:p>
@@ -6702,7 +5321,7 @@
         <w:rPr>
           <w:sz w:val="18"/>
         </w:rPr>
-        <w:t xml:space="preserve"> Proteome-wide scan of the reviewed human proteome at five FDR tiers, with recovery of known sites and the fraction of novel predictions.</w:t>
+        <w:t xml:space="preserve"> Proteome-wide scan of the reviewed human proteome at five candidate tiers, with recovery of known sites and the fraction of novel predictions.</w:t>
       </w:r>
     </w:p>
     <w:p>
@@ -6900,7 +5519,7 @@
               <w:rPr>
                 <w:sz w:val="16"/>
               </w:rPr>
-              <w:t>0.862</w:t>
+              <w:t>0.799</w:t>
             </w:r>
           </w:p>
         </w:tc>
@@ -6918,7 +5537,7 @@
               <w:rPr>
                 <w:sz w:val="16"/>
               </w:rPr>
-              <w:t>0.609</w:t>
+              <w:t>0.366</w:t>
             </w:r>
           </w:p>
         </w:tc>
@@ -6936,7 +5555,7 @@
               <w:rPr>
                 <w:sz w:val="16"/>
               </w:rPr>
-              <w:t>0.516</w:t>
+              <w:t>0.344</w:t>
             </w:r>
           </w:p>
         </w:tc>
@@ -6954,7 +5573,7 @@
               <w:rPr>
                 <w:sz w:val="16"/>
               </w:rPr>
-              <w:t>0.599</w:t>
+              <w:t>0.442</w:t>
             </w:r>
           </w:p>
         </w:tc>
@@ -6972,7 +5591,7 @@
               <w:rPr>
                 <w:sz w:val="16"/>
               </w:rPr>
-              <w:t>0.923</w:t>
+              <w:t>0.931</w:t>
             </w:r>
           </w:p>
         </w:tc>
@@ -6990,7 +5609,7 @@
               <w:rPr>
                 <w:sz w:val="16"/>
               </w:rPr>
-              <w:t>0.499</w:t>
+              <w:t>0.311</w:t>
             </w:r>
           </w:p>
         </w:tc>
@@ -7008,7 +5627,7 @@
               <w:rPr>
                 <w:sz w:val="16"/>
               </w:rPr>
-              <w:t>0.968</w:t>
+              <w:t>0.975</w:t>
             </w:r>
           </w:p>
         </w:tc>
@@ -7046,7 +5665,7 @@
               <w:rPr>
                 <w:sz w:val="16"/>
               </w:rPr>
-              <w:t>0.879</w:t>
+              <w:t>0.829</w:t>
             </w:r>
           </w:p>
         </w:tc>
@@ -7064,7 +5683,7 @@
               <w:rPr>
                 <w:sz w:val="16"/>
               </w:rPr>
-              <w:t>0.570</w:t>
+              <w:t>0.398</w:t>
             </w:r>
           </w:p>
         </w:tc>
@@ -7082,7 +5701,7 @@
               <w:rPr>
                 <w:sz w:val="16"/>
               </w:rPr>
-              <w:t>0.526</w:t>
+              <w:t>0.353</w:t>
             </w:r>
           </w:p>
         </w:tc>
@@ -7100,7 +5719,7 @@
               <w:rPr>
                 <w:sz w:val="16"/>
               </w:rPr>
-              <w:t>0.616</w:t>
+              <w:t>0.513</w:t>
             </w:r>
           </w:p>
         </w:tc>
@@ -7118,7 +5737,7 @@
               <w:rPr>
                 <w:sz w:val="16"/>
               </w:rPr>
-              <w:t>0.924</w:t>
+              <w:t>0.937</w:t>
             </w:r>
           </w:p>
         </w:tc>
@@ -7136,7 +5755,7 @@
               <w:rPr>
                 <w:sz w:val="16"/>
               </w:rPr>
-              <w:t>0.521</w:t>
+              <w:t>0.266</w:t>
             </w:r>
           </w:p>
         </w:tc>
@@ -7154,7 +5773,7 @@
               <w:rPr>
                 <w:sz w:val="16"/>
               </w:rPr>
-              <w:t>0.966</w:t>
+              <w:t>0.984</w:t>
             </w:r>
           </w:p>
         </w:tc>
@@ -7192,7 +5811,7 @@
               <w:rPr>
                 <w:sz w:val="16"/>
               </w:rPr>
-              <w:t>0.945</w:t>
+              <w:t>0.931</w:t>
             </w:r>
           </w:p>
         </w:tc>
@@ -7210,7 +5829,7 @@
               <w:rPr>
                 <w:sz w:val="16"/>
               </w:rPr>
-              <w:t>0.810</w:t>
+              <w:t>0.693</w:t>
             </w:r>
           </w:p>
         </w:tc>
@@ -7228,7 +5847,7 @@
               <w:rPr>
                 <w:sz w:val="16"/>
               </w:rPr>
-              <w:t>0.707</w:t>
+              <w:t>0.595</w:t>
             </w:r>
           </w:p>
         </w:tc>
@@ -7246,7 +5865,7 @@
               <w:rPr>
                 <w:sz w:val="16"/>
               </w:rPr>
-              <w:t>0.740</w:t>
+              <w:t>0.721</w:t>
             </w:r>
           </w:p>
         </w:tc>
@@ -7282,7 +5901,7 @@
               <w:rPr>
                 <w:sz w:val="16"/>
               </w:rPr>
-              <w:t>0.649</w:t>
+              <w:t>0.582</w:t>
             </w:r>
           </w:p>
         </w:tc>
@@ -7300,7 +5919,7 @@
               <w:rPr>
                 <w:sz w:val="16"/>
               </w:rPr>
-              <w:t>0.985</w:t>
+              <w:t>0.979</w:t>
             </w:r>
           </w:p>
         </w:tc>
@@ -7338,7 +5957,7 @@
               <w:rPr>
                 <w:sz w:val="16"/>
               </w:rPr>
-              <w:t>0.894</w:t>
+              <w:t>0.854</w:t>
             </w:r>
           </w:p>
         </w:tc>
@@ -7356,7 +5975,7 @@
               <w:rPr>
                 <w:sz w:val="16"/>
               </w:rPr>
-              <w:t>0.684</w:t>
+              <w:t>0.454</w:t>
             </w:r>
           </w:p>
         </w:tc>
@@ -7374,7 +5993,7 @@
               <w:rPr>
                 <w:sz w:val="16"/>
               </w:rPr>
-              <w:t>0.615</w:t>
+              <w:t>0.439</w:t>
             </w:r>
           </w:p>
         </w:tc>
@@ -7392,7 +6011,7 @@
               <w:rPr>
                 <w:sz w:val="16"/>
               </w:rPr>
-              <w:t>0.663</w:t>
+              <w:t>0.544</w:t>
             </w:r>
           </w:p>
         </w:tc>
@@ -7410,7 +6029,7 @@
               <w:rPr>
                 <w:sz w:val="16"/>
               </w:rPr>
-              <w:t>0.935</w:t>
+              <w:t>0.930</w:t>
             </w:r>
           </w:p>
         </w:tc>
@@ -7428,7 +6047,7 @@
               <w:rPr>
                 <w:sz w:val="16"/>
               </w:rPr>
-              <w:t>0.632</w:t>
+              <w:t>0.488</w:t>
             </w:r>
           </w:p>
         </w:tc>
@@ -7446,7 +6065,7 @@
               <w:rPr>
                 <w:sz w:val="16"/>
               </w:rPr>
-              <w:t>0.967</w:t>
+              <w:t>0.961</w:t>
             </w:r>
           </w:p>
         </w:tc>
@@ -7484,7 +6103,7 @@
               <w:rPr>
                 <w:sz w:val="16"/>
               </w:rPr>
-              <w:t>0.941</w:t>
+              <w:t>0.931</w:t>
             </w:r>
           </w:p>
         </w:tc>
@@ -7502,7 +6121,7 @@
               <w:rPr>
                 <w:sz w:val="16"/>
               </w:rPr>
-              <w:t>0.820</w:t>
+              <w:t>0.665</w:t>
             </w:r>
           </w:p>
         </w:tc>
@@ -7520,7 +6139,7 @@
               <w:rPr>
                 <w:sz w:val="16"/>
               </w:rPr>
-              <w:t>0.741</w:t>
+              <w:t>0.612</w:t>
             </w:r>
           </w:p>
         </w:tc>
@@ -7538,7 +6157,7 @@
               <w:rPr>
                 <w:sz w:val="16"/>
               </w:rPr>
-              <w:t>0.789</w:t>
+              <w:t>0.736</w:t>
             </w:r>
           </w:p>
         </w:tc>
@@ -7556,7 +6175,7 @@
               <w:rPr>
                 <w:sz w:val="16"/>
               </w:rPr>
-              <w:t>0.958</w:t>
+              <w:t>0.954</w:t>
             </w:r>
           </w:p>
         </w:tc>
@@ -7574,7 +6193,7 @@
               <w:rPr>
                 <w:sz w:val="16"/>
               </w:rPr>
-              <w:t>0.692</w:t>
+              <w:t>0.603</w:t>
             </w:r>
           </w:p>
         </w:tc>
@@ -7592,7 +6211,7 @@
               <w:rPr>
                 <w:sz w:val="16"/>
               </w:rPr>
-              <w:t>0.986</w:t>
+              <w:t>0.979</w:t>
             </w:r>
           </w:p>
         </w:tc>
@@ -7630,7 +6249,7 @@
               <w:rPr>
                 <w:sz w:val="16"/>
               </w:rPr>
-              <w:t>0.956</w:t>
+              <w:t>0.944</w:t>
             </w:r>
           </w:p>
         </w:tc>
@@ -7648,7 +6267,7 @@
               <w:rPr>
                 <w:sz w:val="16"/>
               </w:rPr>
-              <w:t>0.849</w:t>
+              <w:t>0.730</w:t>
             </w:r>
           </w:p>
         </w:tc>
@@ -7666,7 +6285,7 @@
               <w:rPr>
                 <w:sz w:val="16"/>
               </w:rPr>
-              <w:t>0.753</w:t>
+              <w:t>0.611</w:t>
             </w:r>
           </w:p>
         </w:tc>
@@ -7684,7 +6303,7 @@
               <w:rPr>
                 <w:sz w:val="16"/>
               </w:rPr>
-              <w:t>0.767</w:t>
+              <w:t>0.766</w:t>
             </w:r>
           </w:p>
         </w:tc>
@@ -7702,7 +6321,7 @@
               <w:rPr>
                 <w:sz w:val="16"/>
               </w:rPr>
-              <w:t>0.960</w:t>
+              <w:t>0.953</w:t>
             </w:r>
           </w:p>
         </w:tc>
@@ -7720,7 +6339,7 @@
               <w:rPr>
                 <w:sz w:val="16"/>
               </w:rPr>
-              <w:t>0.705</w:t>
+              <w:t>0.623</w:t>
             </w:r>
           </w:p>
         </w:tc>
@@ -7738,7 +6357,7 @@
               <w:rPr>
                 <w:sz w:val="16"/>
               </w:rPr>
-              <w:t>0.987</w:t>
+              <w:t>0.976</w:t>
             </w:r>
           </w:p>
         </w:tc>
@@ -7750,7 +6369,7 @@
         <w:rPr>
           <w:sz w:val="16"/>
         </w:rPr>
-        <w:t>6,805 positives and 64,789 negatives (71,594 sites, 23,897 proteins). MCC and accuracy use thresholds selected on inner validation folds; balanced MCC uses class-balanced test subsamples.</w:t>
+        <w:t>4,424 S-palmitoyl cysteine positives and 62,842 negatives (67,266 sites, 21,568 proteins). MCC and accuracy use thresholds selected on inner validation folds; balanced MCC uses class-balanced test subsamples.</w:t>
       </w:r>
     </w:p>
     <w:p>
@@ -7917,7 +6536,7 @@
               <w:rPr>
                 <w:sz w:val="16"/>
               </w:rPr>
-              <w:t>4677</w:t>
+              <w:t>2913</w:t>
             </w:r>
           </w:p>
         </w:tc>
@@ -7935,7 +6554,7 @@
               <w:rPr>
                 <w:sz w:val="16"/>
               </w:rPr>
-              <w:t>14319</w:t>
+              <w:t>13454</w:t>
             </w:r>
           </w:p>
         </w:tc>
@@ -7953,7 +6572,7 @@
               <w:rPr>
                 <w:sz w:val="16"/>
               </w:rPr>
-              <w:t>0.990</w:t>
+              <w:t>0.980</w:t>
             </w:r>
           </w:p>
         </w:tc>
@@ -7989,7 +6608,7 @@
               <w:rPr>
                 <w:sz w:val="16"/>
               </w:rPr>
-              <w:t>0.892</w:t>
+              <w:t>0.862</w:t>
             </w:r>
           </w:p>
         </w:tc>
@@ -8007,7 +6626,7 @@
               <w:rPr>
                 <w:sz w:val="16"/>
               </w:rPr>
-              <w:t>43.7%</w:t>
+              <w:t>41.1%</w:t>
             </w:r>
           </w:p>
         </w:tc>
@@ -8045,7 +6664,7 @@
               <w:rPr>
                 <w:sz w:val="16"/>
               </w:rPr>
-              <w:t>4495</w:t>
+              <w:t>2954</w:t>
             </w:r>
           </w:p>
         </w:tc>
@@ -8063,7 +6682,7 @@
               <w:rPr>
                 <w:sz w:val="16"/>
               </w:rPr>
-              <w:t>14398</w:t>
+              <w:t>13632</w:t>
             </w:r>
           </w:p>
         </w:tc>
@@ -8081,7 +6700,7 @@
               <w:rPr>
                 <w:sz w:val="16"/>
               </w:rPr>
-              <w:t>0.988</w:t>
+              <w:t>0.985</w:t>
             </w:r>
           </w:p>
         </w:tc>
@@ -8099,7 +6718,7 @@
               <w:rPr>
                 <w:sz w:val="16"/>
               </w:rPr>
-              <w:t>0.760</w:t>
+              <w:t>0.810</w:t>
             </w:r>
           </w:p>
         </w:tc>
@@ -8117,7 +6736,7 @@
               <w:rPr>
                 <w:sz w:val="16"/>
               </w:rPr>
-              <w:t>0.870</w:t>
+              <w:t>0.874</w:t>
             </w:r>
           </w:p>
         </w:tc>
@@ -8135,7 +6754,7 @@
               <w:rPr>
                 <w:sz w:val="16"/>
               </w:rPr>
-              <w:t>40.2%</w:t>
+              <w:t>45.2%</w:t>
             </w:r>
           </w:p>
         </w:tc>
@@ -8173,7 +6792,7 @@
               <w:rPr>
                 <w:sz w:val="16"/>
               </w:rPr>
-              <w:t>4626</w:t>
+              <w:t>3010</w:t>
             </w:r>
           </w:p>
         </w:tc>
@@ -8191,7 +6810,7 @@
               <w:rPr>
                 <w:sz w:val="16"/>
               </w:rPr>
-              <w:t>14439</w:t>
+              <w:t>13403</w:t>
             </w:r>
           </w:p>
         </w:tc>
@@ -8209,7 +6828,7 @@
               <w:rPr>
                 <w:sz w:val="16"/>
               </w:rPr>
-              <w:t>0.950</w:t>
+              <w:t>0.944</w:t>
             </w:r>
           </w:p>
         </w:tc>
@@ -8227,7 +6846,7 @@
               <w:rPr>
                 <w:sz w:val="16"/>
               </w:rPr>
-              <w:t>0.745</w:t>
+              <w:t>0.720</w:t>
             </w:r>
           </w:p>
         </w:tc>
@@ -8245,7 +6864,7 @@
               <w:rPr>
                 <w:sz w:val="16"/>
               </w:rPr>
-              <w:t>0.762</w:t>
+              <w:t>0.763</w:t>
             </w:r>
           </w:p>
         </w:tc>
@@ -8301,7 +6920,7 @@
               <w:rPr>
                 <w:sz w:val="16"/>
               </w:rPr>
-              <w:t>3387</w:t>
+              <w:t>1317</w:t>
             </w:r>
           </w:p>
         </w:tc>
@@ -8319,7 +6938,7 @@
               <w:rPr>
                 <w:sz w:val="16"/>
               </w:rPr>
-              <w:t>29134</w:t>
+              <w:t>1626</w:t>
             </w:r>
           </w:p>
         </w:tc>
@@ -8337,7 +6956,7 @@
               <w:rPr>
                 <w:sz w:val="16"/>
               </w:rPr>
-              <w:t>0.822</w:t>
+              <w:t>0.885</w:t>
             </w:r>
           </w:p>
         </w:tc>
@@ -8355,7 +6974,7 @@
               <w:rPr>
                 <w:sz w:val="16"/>
               </w:rPr>
-              <w:t>0.203</w:t>
+              <w:t>0.578</w:t>
             </w:r>
           </w:p>
         </w:tc>
@@ -8373,7 +6992,7 @@
               <w:rPr>
                 <w:sz w:val="16"/>
               </w:rPr>
-              <w:t>0.432</w:t>
+              <w:t>0.586</w:t>
             </w:r>
           </w:p>
         </w:tc>
@@ -8570,7 +7189,7 @@
               <w:rPr>
                 <w:sz w:val="16"/>
               </w:rPr>
-              <w:t>0.757</w:t>
+              <w:t>0.760</w:t>
             </w:r>
           </w:p>
         </w:tc>
@@ -8588,7 +7207,7 @@
               <w:rPr>
                 <w:sz w:val="16"/>
               </w:rPr>
-              <w:t>0.344</w:t>
+              <w:t>0.422</w:t>
             </w:r>
           </w:p>
         </w:tc>
@@ -8606,7 +7225,7 @@
               <w:rPr>
                 <w:sz w:val="16"/>
               </w:rPr>
-              <w:t>0.767</w:t>
+              <w:t>0.775</w:t>
             </w:r>
           </w:p>
         </w:tc>
@@ -8624,7 +7243,7 @@
               <w:rPr>
                 <w:sz w:val="16"/>
               </w:rPr>
-              <w:t>0.388</w:t>
+              <w:t>0.404</w:t>
             </w:r>
           </w:p>
         </w:tc>
@@ -8642,7 +7261,7 @@
               <w:rPr>
                 <w:sz w:val="16"/>
               </w:rPr>
-              <w:t>0.679</w:t>
+              <w:t>0.727</w:t>
             </w:r>
           </w:p>
         </w:tc>
@@ -8660,7 +7279,7 @@
               <w:rPr>
                 <w:sz w:val="16"/>
               </w:rPr>
-              <w:t>0.250</w:t>
+              <w:t>0.343</w:t>
             </w:r>
           </w:p>
         </w:tc>
@@ -8698,7 +7317,7 @@
               <w:rPr>
                 <w:sz w:val="16"/>
               </w:rPr>
-              <w:t>0.798</w:t>
+              <w:t>0.789</w:t>
             </w:r>
           </w:p>
         </w:tc>
@@ -8716,7 +7335,7 @@
               <w:rPr>
                 <w:sz w:val="16"/>
               </w:rPr>
-              <w:t>0.451</w:t>
+              <w:t>0.469</w:t>
             </w:r>
           </w:p>
         </w:tc>
@@ -8734,7 +7353,7 @@
               <w:rPr>
                 <w:sz w:val="16"/>
               </w:rPr>
-              <w:t>0.757</w:t>
+              <w:t>0.761</w:t>
             </w:r>
           </w:p>
         </w:tc>
@@ -8752,7 +7371,7 @@
               <w:rPr>
                 <w:sz w:val="16"/>
               </w:rPr>
-              <w:t>0.380</w:t>
+              <w:t>0.397</w:t>
             </w:r>
           </w:p>
         </w:tc>
@@ -8770,7 +7389,7 @@
               <w:rPr>
                 <w:sz w:val="16"/>
               </w:rPr>
-              <w:t>0.770</w:t>
+              <w:t>0.792</w:t>
             </w:r>
           </w:p>
         </w:tc>
@@ -8788,7 +7407,7 @@
               <w:rPr>
                 <w:sz w:val="16"/>
               </w:rPr>
-              <w:t>0.400</w:t>
+              <w:t>0.440</w:t>
             </w:r>
           </w:p>
         </w:tc>
@@ -8826,7 +7445,7 @@
               <w:rPr>
                 <w:sz w:val="16"/>
               </w:rPr>
-              <w:t>0.870</w:t>
+              <w:t>0.890</w:t>
             </w:r>
           </w:p>
         </w:tc>
@@ -8844,7 +7463,7 @@
               <w:rPr>
                 <w:sz w:val="16"/>
               </w:rPr>
-              <w:t>0.569</w:t>
+              <w:t>0.626</w:t>
             </w:r>
           </w:p>
         </w:tc>
@@ -8862,7 +7481,7 @@
               <w:rPr>
                 <w:sz w:val="16"/>
               </w:rPr>
-              <w:t>0.873</w:t>
+              <w:t>0.878</w:t>
             </w:r>
           </w:p>
         </w:tc>
@@ -8880,7 +7499,7 @@
               <w:rPr>
                 <w:sz w:val="16"/>
               </w:rPr>
-              <w:t>0.647</w:t>
+              <w:t>0.615</w:t>
             </w:r>
           </w:p>
         </w:tc>
@@ -8898,7 +7517,7 @@
               <w:rPr>
                 <w:sz w:val="16"/>
               </w:rPr>
-              <w:t>0.822</w:t>
+              <w:t>0.885</w:t>
             </w:r>
           </w:p>
         </w:tc>
@@ -8916,7 +7535,7 @@
               <w:rPr>
                 <w:sz w:val="16"/>
               </w:rPr>
-              <w:t>0.411</w:t>
+              <w:t>0.614</w:t>
             </w:r>
           </w:p>
         </w:tc>
@@ -8954,7 +7573,7 @@
               <w:rPr>
                 <w:sz w:val="16"/>
               </w:rPr>
-              <w:t>0.825</w:t>
+              <w:t>0.848</w:t>
             </w:r>
           </w:p>
         </w:tc>
@@ -8972,7 +7591,7 @@
               <w:rPr>
                 <w:sz w:val="16"/>
               </w:rPr>
-              <w:t>0.481</w:t>
+              <w:t>0.498</w:t>
             </w:r>
           </w:p>
         </w:tc>
@@ -8990,7 +7609,7 @@
               <w:rPr>
                 <w:sz w:val="16"/>
               </w:rPr>
-              <w:t>0.794</w:t>
+              <w:t>—</w:t>
             </w:r>
           </w:p>
         </w:tc>
@@ -9008,7 +7627,7 @@
               <w:rPr>
                 <w:sz w:val="16"/>
               </w:rPr>
-              <w:t>0.475</w:t>
+              <w:t>—</w:t>
             </w:r>
           </w:p>
         </w:tc>
@@ -9026,7 +7645,7 @@
               <w:rPr>
                 <w:sz w:val="16"/>
               </w:rPr>
-              <w:t>0.794</w:t>
+              <w:t>0.821</w:t>
             </w:r>
           </w:p>
         </w:tc>
@@ -9044,7 +7663,7 @@
               <w:rPr>
                 <w:sz w:val="16"/>
               </w:rPr>
-              <w:t>0.416</w:t>
+              <w:t>0.496</w:t>
             </w:r>
           </w:p>
         </w:tc>
@@ -9082,7 +7701,7 @@
               <w:rPr>
                 <w:sz w:val="16"/>
               </w:rPr>
-              <w:t>0.876</w:t>
+              <w:t>0.901</w:t>
             </w:r>
           </w:p>
         </w:tc>
@@ -9100,7 +7719,7 @@
               <w:rPr>
                 <w:sz w:val="16"/>
               </w:rPr>
-              <w:t>0.665</w:t>
+              <w:t>0.643</w:t>
             </w:r>
           </w:p>
         </w:tc>
@@ -9118,7 +7737,7 @@
               <w:rPr>
                 <w:sz w:val="16"/>
               </w:rPr>
-              <w:t>0.891</w:t>
+              <w:t>0.898</w:t>
             </w:r>
           </w:p>
         </w:tc>
@@ -9136,7 +7755,7 @@
               <w:rPr>
                 <w:sz w:val="16"/>
               </w:rPr>
-              <w:t>0.633</w:t>
+              <w:t>0.609</w:t>
             </w:r>
           </w:p>
         </w:tc>
@@ -9210,7 +7829,7 @@
               <w:rPr>
                 <w:sz w:val="16"/>
               </w:rPr>
-              <w:t>0.901</w:t>
+              <w:t>0.914</w:t>
             </w:r>
           </w:p>
         </w:tc>
@@ -9228,7 +7847,7 @@
               <w:rPr>
                 <w:sz w:val="16"/>
               </w:rPr>
-              <w:t>0.691</w:t>
+              <w:t>0.689</w:t>
             </w:r>
           </w:p>
         </w:tc>
@@ -9246,7 +7865,7 @@
               <w:rPr>
                 <w:sz w:val="16"/>
               </w:rPr>
-              <w:t>0.897</w:t>
+              <w:t>0.898</w:t>
             </w:r>
           </w:p>
         </w:tc>
@@ -9264,7 +7883,7 @@
               <w:rPr>
                 <w:sz w:val="16"/>
               </w:rPr>
-              <w:t>0.657</w:t>
+              <w:t>0.615</w:t>
             </w:r>
           </w:p>
         </w:tc>
@@ -9312,7 +7931,7 @@
         <w:rPr>
           <w:sz w:val="16"/>
         </w:rPr>
-        <w:t>Human test sites: 572 positives in 316 proteins. The species holdout uses no human data and removes every cluster containing a human protein.</w:t>
+        <w:t>Human test sites: 557 positives in 312 proteins. The species holdout uses no human data and removes every cluster containing a human protein.</w:t>
       </w:r>
     </w:p>
     <w:p>

</xml_diff>

<commit_message>
Second review round: nested ensemble selection, cluster CIs, matrix v2, FDR wording
</commit_message>
<xml_diff>
--- a/manuscript/PalmDL_manuscript.docx
+++ b/manuscript/PalmDL_manuscript.docx
@@ -79,7 +79,7 @@
         <w:t>Results.</w:t>
       </w:r>
       <w:r>
-        <w:t xml:space="preserve"> We assembled a versioned, evidence-stratified dataset from UniProt release 2026_03 comprising 67,266 labelled cysteine sites (4,424 S-palmitoyl cysteine sites, of which 449 are experimentally supported; 786 organisms; 557 human sites in 312 proteins) with explicitly separated hard (same-protein) and background negatives. Restricting positives to S-palmitoyl cysteine excluded 2,381 N-/O-palmitoyl annotations that a permissive text filter had admitted, and the corrected folds share no identical 31-residue window between training and test. Using a single model across four protocols we show that conventional benchmarks leak severely: 41.1% of test positives share an identical window with a training positive under a random site-level split and 45.2% under a protein-level split, inflating AUC from 0.944 to 0.985 and MCC from 0.720 to 0.810. PalmDL, a two-view ensemble of ESM-2 embeddings and motif/physicochemical features, reaches AUC 0.944 (95% CI 0.940–0.948), AUPR 0.730 and MCC 0.611 under cluster-held-out cross-validation; on held-out human sites it reaches 0.914 (0.900–0.927), marginally above the best published human value of 0.900, and 0.885 on a strict species holdout. It outperforms a CSS-Palm-style PWM, logistic regression, a multi-kernel CNN and both single views (ΔAUC +0.013). Probabilities are Platt-calibrated (ECE 0.025 at natural prevalence). A six-species transfer matrix shows that the code is shared almost losslessly across mammals and partly with plants, whereas bacterial lipidation is a different modification and is excluded by construction. In-silico mutagenesis recovers the cysteine-cluster rule, and FDR-controlled operating points support shortlists for experimental follow-up. A literature-mined external set of 136 sites from 91 papers remains motif-atypical (AUC ≈0.59), which we report as a domain-shift limitation rather than as validation.</w:t>
+        <w:t xml:space="preserve"> We assembled a versioned, evidence-stratified dataset from UniProt release 2026_03 comprising 67,266 labelled cysteine sites (4,424 S-palmitoyl cysteine sites, of which 455 are experimentally supported; 786 organisms; 557 human sites in 312 proteins) with explicitly separated hard (same-protein) and background negatives. Restricting positives to S-palmitoyl cysteine excluded 2,381 N-/O-palmitoyl annotations that a permissive text filter had admitted, and the corrected folds share no identical 31-residue window between training and test. Using a single model across four protocols we show that conventional benchmarks leak severely: 41.1% of test positives share an identical window with a training positive under a random site-level split and 45.2% under a protein-level split, inflating AUC from 0.944 to 0.985 and MCC from 0.720 to 0.810. PalmDL, a two-view ensemble of ESM-2 embeddings and motif/physicochemical features whose member combination is chosen inside each outer fold, reaches AUC 0.938 (cluster-bootstrap 95% CI 0.917–0.954), AUPR 0.697 and MCC 0.590 under cluster-held-out cross-validation; on held-out human sites it reaches 0.910 (0.890–0.929) and 0.885 on a strict species holdout. It improves on each single view (ΔAUC +0.008 over ESM-2, +0.007 over the forest, whose interval includes zero). Probabilities are Platt-calibrated (mean fold ECE 0.025). A six-species transfer matrix shows heterogeneous transfer rather than a universal code: most mammalian pairs transfer at 0.83–0.95, the plant model reaches 0.74–0.78 on mammals, and bacterial lipidation is excluded as a different modification. In-silico mutagenesis recovers the cysteine-cluster rule, and empirical validation-target operating points support candidate shortlists. A literature-mined external set of 136 sites from 91 papers remains motif-atypical (within-protein AUC 0.585), which we report as a domain-shift limitation rather than as validation.</w:t>
       </w:r>
     </w:p>
     <w:p>
@@ -206,7 +206,7 @@
         <w:t>Background negatives</w:t>
       </w:r>
       <w:r>
-        <w:t xml:space="preserve"> are cysteines sampled from 19,622 reviewed human proteins that carry no lipidation feature at all (54,222 sites). The final labelled set contains 67,266 cysteine sites from 21,568 proteins and 61,183 distinct 31-residue windows. Metrics remain high on the harder same-protein negatives alone (AUC 0.956; Table 3), so model ranking is not an artefact of easy background negatives.</w:t>
+        <w:t xml:space="preserve"> are cysteines sampled from 19,622 reviewed human proteins that carry no lipidation feature at all (54,222 sites). The final labelled set contains 67,266 cysteine sites from 21,568 proteins and 61,183 distinct 31-residue windows. Metrics remain high on the harder same-protein negatives alone (AUC 0.952; Table 3), so model ranking is not an artefact of easy background negatives.</w:t>
       </w:r>
     </w:p>
     <w:p>
@@ -279,16 +279,25 @@
     </w:p>
     <w:p>
       <w:r>
-        <w:t xml:space="preserve">The two views make different errors: the forest captures exact positional chemistry and local motif syntax, whereas ESM-2 embeddings capture evolutionary and structural context. A rank-average of the two, followed by Platt calibration, was selected among all 31 non-empty member subsets by pooled validation AUC — never by test performance — and reached </w:t>
+        <w:t xml:space="preserve">The two views make different errors: the forest captures exact positional chemistry and local motif syntax, whereas ESM-2 embeddings capture evolutionary and structural context. Member selection is now </w:t>
       </w:r>
       <w:r>
         <w:rPr>
           <w:b/>
         </w:rPr>
-        <w:t>AUC 0.944 (95% CI 0.940–0.948), AUPR 0.730, MCC 0.611 and balanced MCC 0.766</w:t>
+        <w:t>nested inside each outer fold</w:t>
       </w:r>
       <w:r>
-        <w:t xml:space="preserve"> (Table 1). Paired bootstrap over sites gives ΔAUC = +0.013 (95% CI 0.012–0.016) over either single view; the interval excludes zero. Adding the CNN to the ensemble lowered validation AUC (0.9420 versus 0.9487), so the two-view model was retained.</w:t>
+        <w:t xml:space="preserve">: the 31 non-empty subsets are ranked by that fold's validation AUC, the winner is calibrated on the same validation rows, and only then applied to that fold's test rows. Four folds select RF+ESM and one selects LR+RF+CNN+ESM. The resulting ensemble reaches </w:t>
+      </w:r>
+      <w:r>
+        <w:rPr>
+          <w:b/>
+        </w:rPr>
+        <w:t>AUC 0.938 (cluster-bootstrap 95% CI 0.917–0.954), AUPR 0.697, MCC 0.590 and balanced MCC 0.747</w:t>
+      </w:r>
+      <w:r>
+        <w:t xml:space="preserve"> (Table 1). Paired cluster bootstrap gives ΔAUC = +0.008 (0.002–0.014) over ESM-2 and +0.007 (−0.004–0.018) over the forest, so the advantage over the forest is not resolved by these folds. For comparison, the previous globally selected combination scores 0.944 (0.926–0.957 cluster), which shows that pooling validation folds to choose one combination is mildly optimistic; we report the nested estimate as primary.</w:t>
       </w:r>
     </w:p>
     <w:p>
@@ -306,16 +315,16 @@
     </w:p>
     <w:p>
       <w:r>
-        <w:t xml:space="preserve">Because most published predictors are evaluated on human sites, we repeated the analysis on human-only test folds (Table 3, Figure 4). With multi-species training and human test folds, PalmDL reaches </w:t>
+        <w:t xml:space="preserve">Because most published predictors are evaluated on human sites, we repeated the analysis on human-only test folds (Table 3, Figure 4). With multi-species training and human test folds, nested PalmDL reaches </w:t>
       </w:r>
       <w:r>
         <w:rPr>
           <w:b/>
         </w:rPr>
-        <w:t>AUC 0.914 (0.900–0.927), AUPR 0.318, MCC 0.314 and balanced MCC 0.689</w:t>
+        <w:t>AUC 0.910 (0.890–0.929), AUPR 0.294, MCC 0.297 and balanced MCC 0.662</w:t>
       </w:r>
       <w:r>
-        <w:t>. A 4,000-replicate within-fold bootstrap against the best published human value, 0.900, gives P(AUC ≤ 0.900) = 0.025: the estimate is marginally above the published value, but its interval touches it, so we describe PalmDL as matching, not surpassing, the state of the art. Training on human data alone is, by validation AUC, best served by the ESM-2 view alone (0.892; random forest 0.879), showing that non-human sites add little once homology is controlled. On the strict species holdout, in which no human protein and no cluster containing a human protein is seen during training and every human-propagated annotation is removed, the random forest reaches AUC 0.885 and balanced MCC 0.614. The 0.029 AUC gap between within-species and cross-species evaluation is much smaller than the 0.13 gap we measured before the label correction, because the N-palmitoyl bacterial sites that previously dominated the non-human training set are gone; what remains is a modest, measurable cost of species-specific context.</w:t>
+        <w:t>. These values reproduce the published human AUC of 0.900 only descriptively: no paired test is possible across different test sets, and the within-study bootstrap probability that our estimate falls below 0.900 is 0.08. We therefore report the number and leave the comparison to context. Training on human data alone is selected as RF+ESM in four folds and CNN+ESM in one (mean 0.901). On the strict species holdout the random forest reaches AUC 0.885 and balanced MCC 0.614. The 0.025 difference between the human CV estimate and the species holdout uses different model families and negative compositions, so it is descriptive rather than a clean decomposition of a species-specific cost.</w:t>
       </w:r>
     </w:p>
     <w:p>
@@ -333,7 +342,7 @@
     </w:p>
     <w:p>
       <w:r>
-        <w:t>Probabilities from the calibrated ensemble are reliable at natural prevalence (ECE 0.025; Figure 5), whereas the uncalibrated forest has ECE ≈ 0.12 and over-confident tails. On the hard-negative benchmark (positives plus same-protein cysteines only, 1:1.95 ratio), PalmDL reaches AUC 0.956 and MCC 0.678, compared with 0.810/0.414 for the PWM baseline (Table 3), so the advantage is not an artefact of easy background negatives.</w:t>
+        <w:t>Probabilities from the calibrated ensemble are reliable at natural prevalence (mean fold ECE 0.025, pooled 10-bin ECE 0.021; Figure 5), whereas the uncalibrated forest has ECE ≈ 0.12 and over-confident tails. On the hard-negative benchmark (positives plus same-protein cysteines only, 1:1.95 ratio), PalmDL reaches AUC 0.952 and MCC 0.664, compared with 0.811/0.414 for the PWM baseline (Table 3), so the advantage is not an artefact of easy background negatives.</w:t>
       </w:r>
     </w:p>
     <w:p>
@@ -356,7 +365,7 @@
     </w:p>
     <w:p>
       <w:r>
-        <w:t>Table 4 places our results next to the numbers reported by previous methods. Three patterns are visible. First, classical MCC values (0.45–0.67) were obtained under protocols that either reuse the training literature or do not hold out proteins, and the only classical tool with an independent test (CSS-Palm 2.0) dropped from MCC 0.671 to 0.523 when it did so. Second, the deep-learning systems with published AUCs (GPS-Palm 0.900, pCysMod 0.807) report neither cross-species nor explicit protein-disjoint evaluation. Third, the highest published number (Deep-Palm 0.931) comes from a site-level split, precisely the protocol that our audit shows to leak 41–45% of windows. PalmDL's 0.944 is obtained with zero shared windows, and its human estimate, 0.914, is marginally above the best published human AUC while being the only one accompanied by a leakage audit, a calibration analysis and a cross-species holdout. Because we could not rerun GPS-Palm or the retired classical tools on our folds, Table 4 compares protocols as much as algorithms; the released fold files remove this obstacle for future work.</w:t>
+        <w:t>Table 4 places our results next to the numbers reported by previous methods. Three patterns are visible. First, classical MCC values (0.45–0.67) were obtained under protocols that either reuse the training literature or do not hold out proteins, and the only classical tool with an independent test (CSS-Palm 2.0) dropped from MCC 0.671 to 0.523 when it did so. Second, the deep-learning systems with published AUCs (GPS-Palm 0.900, pCysMod 0.807) report neither cross-species nor explicit protein-disjoint evaluation. Third, the highest published number (Deep-Palm 0.931) comes from a site-level split, precisely the protocol that our audit shows to leak 41–45% of windows. PalmDL's 0.938 is obtained with zero shared windows under nested member selection, and its human estimate, 0.910, is reported for context rather than as a paired superiority claim. Because we could not rerun GPS-Palm or the retired classical tools on our folds, Table 4 compares protocols as much as algorithms; the released fold files remove this obstacle for future work.</w:t>
       </w:r>
     </w:p>
     <w:p>
@@ -1266,7 +1275,7 @@
                 <w:b/>
                 <w:sz w:val="16"/>
               </w:rPr>
-              <w:t>AUC 0.944, MCC 0.611</w:t>
+              <w:t>AUC 0.938, MCC 0.590</w:t>
             </w:r>
           </w:p>
         </w:tc>
@@ -1360,7 +1369,7 @@
                 <w:b/>
                 <w:sz w:val="16"/>
               </w:rPr>
-              <w:t>AUC 0.914, balanced MCC 0.689</w:t>
+              <w:t>AUC 0.910, balanced MCC 0.662</w:t>
             </w:r>
           </w:p>
         </w:tc>
@@ -1488,12 +1497,21 @@
           <w:color w:val="000000"/>
           <w:sz w:val="22"/>
         </w:rPr>
-        <w:t>2.7 The palmitoylation code is shared across mammals and partly with plants</w:t>
+        <w:t>2.7 Cross-species transfer is heterogeneous</w:t>
       </w:r>
     </w:p>
     <w:p>
       <w:r>
-        <w:t xml:space="preserve">The species holdout in §2.4 removes every human-homologous cluster and therefore measures transfer to genuinely novel families. To separate that from ordinary cross-species transfer we trained a separate PalmDL model on each of the six species with at least 85 S-palmitoyl cysteine sites (human, mouse, rat, cattle, pig, </w:t>
+        <w:t xml:space="preserve">The species holdout in §2.4 removes every human-homologous cluster and therefore measures transfer to genuinely novel families. To separate that from ordinary cross-species transfer we trained one model per species on its positives and same-protein negatives, holding out clusters for the diagonal and for early stopping, and evaluated every model on every species with target rows restricted to positives and same-protein negatives (Figure 7, Table 5). Transfer is </w:t>
+      </w:r>
+      <w:r>
+        <w:rPr>
+          <w:b/>
+        </w:rPr>
+        <w:t>heterogeneous</w:t>
+      </w:r>
+      <w:r>
+        <w:t xml:space="preserve">, not uniformly lossless. Most mammalian pairs fall between 0.83 and 0.95 (mean 0.896), with Pig→Human (0.834) the clear exception, 0.11 below the human diagonal and 0.14 below the pig diagonal. The plant model reaches 0.74–0.78 on mammals, whereas mammalian models reach 0.96–0.98 on </w:t>
       </w:r>
       <w:r>
         <w:rPr>
@@ -1502,39 +1520,12 @@
         <w:t>A. thaliana</w:t>
       </w:r>
       <w:r>
-        <w:t xml:space="preserve">) and evaluated every model on every species, excluding target rows whose cluster appears in training (Figure 7, Table 5). Two regimes emerge. First, </w:t>
-      </w:r>
-      <w:r>
-        <w:rPr>
-          <w:b/>
-        </w:rPr>
-        <w:t>mammals share one code</w:t>
-      </w:r>
-      <w:r>
-        <w:t xml:space="preserve">: models trained on human, mouse, rat, cattle or pig reach 0.85–0.95 on the other mammals, comparable to the within-species diagonal. Second, </w:t>
-      </w:r>
-      <w:r>
-        <w:rPr>
-          <w:b/>
-        </w:rPr>
-        <w:t>the code extends in part to plants</w:t>
-      </w:r>
-      <w:r>
-        <w:t xml:space="preserve">: mammalian models reach 0.96–0.98 on </w:t>
-      </w:r>
-      <w:r>
-        <w:rPr>
-          <w:i/>
-        </w:rPr>
-        <w:t>A. thaliana</w:t>
-      </w:r>
-      <w:r>
-        <w:t xml:space="preserve"> in the held-out-cluster setting, whereas the plant model reaches 0.70–0.85 on mammals — lower, but far above chance. Bacterial lipidation no longer enters the analysis, because after the label correction the bacterial positives are N-palmitoyl cysteines, a different modification that cannot be used to study the S-palmitoylation code.</w:t>
+        <w:t>. Several cells have too few eligible positives after cluster removal and are left empty rather than estimated from a handful of sites. The matrix therefore describes transfer among these sampled species and negative-sampling protocols; it does not isolate the causal contribution of orthologue coverage.</w:t>
       </w:r>
     </w:p>
     <w:p>
       <w:r>
-        <w:t>The contrast with §2.4 is the key point. Cross-species transfer with orthologues available is essentially free (≈0.94), whereas transfer to human families absent from training is 0.885; most of the apparent generality of palmitoylation predictors therefore comes from orthologue coverage, not from an abstract motif grammar.</w:t>
+        <w:t>Two consequences follow. First, claims of a single shared eukaryotic code are not supported by this design: the pig exception and the plant asymmetry are as informative as the mammalian mean. Second, the strict human holdout (0.885) and the human CV estimate (0.910) differ by only 0.025 and use different model families and negative compositions, so they should not be read as a clean species-specific penalty. A paired design with matched negatives and a frozen target set would be needed to separate orthologue coverage from motif generalisation.</w:t>
       </w:r>
     </w:p>
     <w:p>
@@ -1649,22 +1640,22 @@
                 <w:b/>
                 <w:sz w:val="16"/>
               </w:rPr>
+              <w:t>*A. thaliana*</w:t>
+            </w:r>
+          </w:p>
+        </w:tc>
+        <w:tc>
+          <w:tcPr>
+            <w:tcW w:type="dxa" w:w="1360"/>
+          </w:tcPr>
+          <w:p>
+            <w:r/>
+            <w:r>
+              <w:rPr>
+                <w:b/>
+                <w:sz w:val="16"/>
+              </w:rPr>
               <w:t>Pig</w:t>
-            </w:r>
-          </w:p>
-        </w:tc>
-        <w:tc>
-          <w:tcPr>
-            <w:tcW w:type="dxa" w:w="1360"/>
-          </w:tcPr>
-          <w:p>
-            <w:r/>
-            <w:r>
-              <w:rPr>
-                <w:b/>
-                <w:sz w:val="16"/>
-              </w:rPr>
-              <w:t>A. thaliana</w:t>
             </w:r>
           </w:p>
         </w:tc>
@@ -1702,7 +1693,7 @@
               <w:rPr>
                 <w:sz w:val="16"/>
               </w:rPr>
-              <w:t>0.926</w:t>
+              <w:t>0.917</w:t>
             </w:r>
           </w:p>
         </w:tc>
@@ -1720,7 +1711,7 @@
               <w:rPr>
                 <w:sz w:val="16"/>
               </w:rPr>
-              <w:t>0.900</w:t>
+              <w:t>0.928</w:t>
             </w:r>
           </w:p>
         </w:tc>
@@ -1738,7 +1729,7 @@
               <w:rPr>
                 <w:sz w:val="16"/>
               </w:rPr>
-              <w:t>0.896</w:t>
+              <w:t>0.910</w:t>
             </w:r>
           </w:p>
         </w:tc>
@@ -1756,7 +1747,7 @@
               <w:rPr>
                 <w:sz w:val="16"/>
               </w:rPr>
-              <w:t>0.920</w:t>
+              <w:t>0.948</w:t>
             </w:r>
           </w:p>
         </w:tc>
@@ -1774,25 +1765,25 @@
               <w:rPr>
                 <w:sz w:val="16"/>
               </w:rPr>
+              <w:t>0.980</w:t>
+            </w:r>
+          </w:p>
+        </w:tc>
+        <w:tc>
+          <w:tcPr>
+            <w:tcW w:type="dxa" w:w="1360"/>
+          </w:tcPr>
+          <w:p>
+            <w:r>
+              <w:rPr>
+                <w:sz w:val="16"/>
+              </w:rPr>
+            </w:r>
+            <w:r>
+              <w:rPr>
+                <w:sz w:val="16"/>
+              </w:rPr>
               <w:t>—</w:t>
-            </w:r>
-          </w:p>
-        </w:tc>
-        <w:tc>
-          <w:tcPr>
-            <w:tcW w:type="dxa" w:w="1360"/>
-          </w:tcPr>
-          <w:p>
-            <w:r>
-              <w:rPr>
-                <w:sz w:val="16"/>
-              </w:rPr>
-            </w:r>
-            <w:r>
-              <w:rPr>
-                <w:sz w:val="16"/>
-              </w:rPr>
-              <w:t>0.983</w:t>
             </w:r>
           </w:p>
         </w:tc>
@@ -1830,7 +1821,7 @@
               <w:rPr>
                 <w:sz w:val="16"/>
               </w:rPr>
-              <w:t>0.901</w:t>
+              <w:t>0.899</w:t>
             </w:r>
           </w:p>
         </w:tc>
@@ -1848,7 +1839,7 @@
               <w:rPr>
                 <w:sz w:val="16"/>
               </w:rPr>
-              <w:t>0.874</w:t>
+              <w:t>0.877</w:t>
             </w:r>
           </w:p>
         </w:tc>
@@ -1866,7 +1857,7 @@
               <w:rPr>
                 <w:sz w:val="16"/>
               </w:rPr>
-              <w:t>0.909</w:t>
+              <w:t>0.880</w:t>
             </w:r>
           </w:p>
         </w:tc>
@@ -1884,7 +1875,7 @@
               <w:rPr>
                 <w:sz w:val="16"/>
               </w:rPr>
-              <w:t>0.912</w:t>
+              <w:t>0.883</w:t>
             </w:r>
           </w:p>
         </w:tc>
@@ -1902,7 +1893,7 @@
               <w:rPr>
                 <w:sz w:val="16"/>
               </w:rPr>
-              <w:t>0.906</w:t>
+              <w:t>0.984</w:t>
             </w:r>
           </w:p>
         </w:tc>
@@ -1920,7 +1911,7 @@
               <w:rPr>
                 <w:sz w:val="16"/>
               </w:rPr>
-              <w:t>0.977</w:t>
+              <w:t>—</w:t>
             </w:r>
           </w:p>
         </w:tc>
@@ -1958,7 +1949,7 @@
               <w:rPr>
                 <w:sz w:val="16"/>
               </w:rPr>
-              <w:t>0.894</w:t>
+              <w:t>0.890</w:t>
             </w:r>
           </w:p>
         </w:tc>
@@ -1976,7 +1967,7 @@
               <w:rPr>
                 <w:sz w:val="16"/>
               </w:rPr>
-              <w:t>0.922</w:t>
+              <w:t>0.914</w:t>
             </w:r>
           </w:p>
         </w:tc>
@@ -1994,7 +1985,7 @@
               <w:rPr>
                 <w:sz w:val="16"/>
               </w:rPr>
-              <w:t>0.933</w:t>
+              <w:t>0.928</w:t>
             </w:r>
           </w:p>
         </w:tc>
@@ -2012,7 +2003,7 @@
               <w:rPr>
                 <w:sz w:val="16"/>
               </w:rPr>
-              <w:t>0.953</w:t>
+              <w:t>0.945</w:t>
             </w:r>
           </w:p>
         </w:tc>
@@ -2030,7 +2021,7 @@
               <w:rPr>
                 <w:sz w:val="16"/>
               </w:rPr>
-              <w:t>0.954</w:t>
+              <w:t>0.984</w:t>
             </w:r>
           </w:p>
         </w:tc>
@@ -2048,7 +2039,7 @@
               <w:rPr>
                 <w:sz w:val="16"/>
               </w:rPr>
-              <w:t>0.984</w:t>
+              <w:t>0.940</w:t>
             </w:r>
           </w:p>
         </w:tc>
@@ -2086,7 +2077,7 @@
               <w:rPr>
                 <w:sz w:val="16"/>
               </w:rPr>
-              <w:t>0.877</w:t>
+              <w:t>0.899</w:t>
             </w:r>
           </w:p>
         </w:tc>
@@ -2104,7 +2095,7 @@
               <w:rPr>
                 <w:sz w:val="16"/>
               </w:rPr>
-              <w:t>0.898</w:t>
+              <w:t>0.903</w:t>
             </w:r>
           </w:p>
         </w:tc>
@@ -2122,7 +2113,7 @@
               <w:rPr>
                 <w:sz w:val="16"/>
               </w:rPr>
-              <w:t>0.908</w:t>
+              <w:t>0.917</w:t>
             </w:r>
           </w:p>
         </w:tc>
@@ -2140,7 +2131,7 @@
               <w:rPr>
                 <w:sz w:val="16"/>
               </w:rPr>
-              <w:t>0.863</w:t>
+              <w:t>0.880</w:t>
             </w:r>
           </w:p>
         </w:tc>
@@ -2158,7 +2149,7 @@
               <w:rPr>
                 <w:sz w:val="16"/>
               </w:rPr>
-              <w:t>0.915</w:t>
+              <w:t>0.979</w:t>
             </w:r>
           </w:p>
         </w:tc>
@@ -2176,7 +2167,7 @@
               <w:rPr>
                 <w:sz w:val="16"/>
               </w:rPr>
-              <w:t>0.970</w:t>
+              <w:t>0.937</w:t>
             </w:r>
           </w:p>
         </w:tc>
@@ -2194,9 +2185,10 @@
             </w:r>
             <w:r>
               <w:rPr>
-                <w:sz w:val="16"/>
-              </w:rPr>
-              <w:t>Pig</w:t>
+                <w:i/>
+                <w:sz w:val="16"/>
+              </w:rPr>
+              <w:t>A. thaliana</w:t>
             </w:r>
           </w:p>
         </w:tc>
@@ -2214,7 +2206,7 @@
               <w:rPr>
                 <w:sz w:val="16"/>
               </w:rPr>
-              <w:t>0.812</w:t>
+              <w:t>0.739</w:t>
             </w:r>
           </w:p>
         </w:tc>
@@ -2232,7 +2224,7 @@
               <w:rPr>
                 <w:sz w:val="16"/>
               </w:rPr>
-              <w:t>0.850</w:t>
+              <w:t>0.766</w:t>
             </w:r>
           </w:p>
         </w:tc>
@@ -2250,7 +2242,7 @@
               <w:rPr>
                 <w:sz w:val="16"/>
               </w:rPr>
-              <w:t>0.849</w:t>
+              <w:t>0.781</w:t>
             </w:r>
           </w:p>
         </w:tc>
@@ -2268,7 +2260,7 @@
               <w:rPr>
                 <w:sz w:val="16"/>
               </w:rPr>
-              <w:t>0.881</w:t>
+              <w:t>0.775</w:t>
             </w:r>
           </w:p>
         </w:tc>
@@ -2286,7 +2278,7 @@
               <w:rPr>
                 <w:sz w:val="16"/>
               </w:rPr>
-              <w:t>0.976</w:t>
+              <w:t>—</w:t>
             </w:r>
           </w:p>
         </w:tc>
@@ -2304,7 +2296,7 @@
               <w:rPr>
                 <w:sz w:val="16"/>
               </w:rPr>
-              <w:t>0.957</w:t>
+              <w:t>0.785</w:t>
             </w:r>
           </w:p>
         </w:tc>
@@ -2322,10 +2314,9 @@
             </w:r>
             <w:r>
               <w:rPr>
-                <w:i/>
-                <w:sz w:val="16"/>
-              </w:rPr>
-              <w:t>A. thaliana</w:t>
+                <w:sz w:val="16"/>
+              </w:rPr>
+              <w:t>Pig</w:t>
             </w:r>
           </w:p>
         </w:tc>
@@ -2343,7 +2334,7 @@
               <w:rPr>
                 <w:sz w:val="16"/>
               </w:rPr>
-              <w:t>0.695</w:t>
+              <w:t>0.834</w:t>
             </w:r>
           </w:p>
         </w:tc>
@@ -2361,7 +2352,7 @@
               <w:rPr>
                 <w:sz w:val="16"/>
               </w:rPr>
-              <w:t>0.783</w:t>
+              <w:t>0.854</w:t>
             </w:r>
           </w:p>
         </w:tc>
@@ -2379,7 +2370,7 @@
               <w:rPr>
                 <w:sz w:val="16"/>
               </w:rPr>
-              <w:t>0.796</w:t>
+              <w:t>0.858</w:t>
             </w:r>
           </w:p>
         </w:tc>
@@ -2397,7 +2388,7 @@
               <w:rPr>
                 <w:sz w:val="16"/>
               </w:rPr>
-              <w:t>0.800</w:t>
+              <w:t>0.880</w:t>
             </w:r>
           </w:p>
         </w:tc>
@@ -2415,7 +2406,7 @@
               <w:rPr>
                 <w:sz w:val="16"/>
               </w:rPr>
-              <w:t>0.796</w:t>
+              <w:t>0.964</w:t>
             </w:r>
           </w:p>
         </w:tc>
@@ -2433,13 +2424,27 @@
               <w:rPr>
                 <w:sz w:val="16"/>
               </w:rPr>
-              <w:t>0.977</w:t>
+              <w:t>—</w:t>
             </w:r>
           </w:p>
         </w:tc>
       </w:tr>
     </w:tbl>
     <w:p/>
+    <w:p>
+      <w:r>
+        <w:t xml:space="preserve">One model per source species is trained on its positives and same-protein negatives (no human background); 20% of source clusters are held out for the diagonal and another 15% for early stopping. Target cells use only positives and same-protein negatives, and rows whose cluster appears in either the fit or the validation split are removed. Off-diagonal cells therefore share the model of their row, as stated in Methods. Dashes mark cells with fewer than 20 eligible test positives (Human→Pig 13, Mouse→Pig 19, and the </w:t>
+      </w:r>
+      <w:r>
+        <w:rPr>
+          <w:i/>
+        </w:rPr>
+        <w:t>A. thaliana</w:t>
+      </w:r>
+      <w:r>
+        <w:t xml:space="preserve"> and Pig diagonals with 15 and 16).</w:t>
+      </w:r>
+    </w:p>
     <w:p>
       <w:r>
         <w:t>Diagonal entries are from a protein-cluster-disjoint 20% holdout of the same species; off-diagonal entries use a model trained on all source rows, with target rows in the training clusters removed. Pig and A. thaliana have few held-out positives, so their diagonal is correspondingly noisy.</w:t>
@@ -2460,7 +2465,16 @@
     </w:p>
     <w:p>
       <w:r>
-        <w:t>Because a predictor is only useful if its errors are predictable, we stratified the held-out predictions (Table 6). Discrimination remains better for inferred than for experimentally supported sites (AUC 0.947 versus 0.907), the annotation-memory effect expected when 90% of labels are propagated: experimentally characterised sites are the atypical, family-specific cases that propagation does not cover, and they are exactly the ones a user is most likely to care about. Performance is stable across annotated topologies (cytoplasmic 0.887, extracellular 0.855, topology unknown 0.898), with the lumenal class too small to interpret (14 positives).</w:t>
+        <w:t xml:space="preserve">Because a predictor is only useful if its errors are predictable, we stratified the held-out predictions (Table 6). Discrimination remains better for inferred than for experimentally supported sites (AUC 0.947 versus 0.907). Evidence tiers now follow one rule: a site counts as experimental when </w:t>
+      </w:r>
+      <w:r>
+        <w:rPr>
+          <w:b/>
+        </w:rPr>
+        <w:t>any</w:t>
+      </w:r>
+      <w:r>
+        <w:t xml:space="preserve"> evidence clause is experimental (ECO:0000269, 0007744, 0007005 or 0006056), which gives 455 experimental and 3,969 inferred sites; six mixed-clause sites were previously misclassified by a comma-only split and are now aligned with Table 6. Performance is stable across annotated topologies (cytoplasmic 0.887, extracellular 0.855, topology unknown 0.898), with the lumenal class too small to interpret (14 positives). Topology is itself an input feature, so these strata describe where the model is accurate, not an independent validation of the topology signal.</w:t>
       </w:r>
     </w:p>
     <w:p>
@@ -2474,7 +2488,7 @@
         <w:t>within each fold</w:t>
       </w:r>
       <w:r>
-        <w:t>, the threshold whose estimated false-discovery rate is at most a target value, and evaluated it on that fold's outer test rows (Figure 8b). At an estimated FDR of 1% the threshold retains 20.2% of known sites at 95.3% precision; at 5%, 34.5% at 90.3%; at 10%, 40.4% at 85.5%; at 20%, 53.5% at 76.6%. Thresholds are deliberately conservative, because the proteome-wide prior is small, and they give a principled way to generate a shortlist without committing to an arbitrary score cut-off.</w:t>
+        <w:t>, the lowest threshold whose complete score groups satisfy an empirical validation false-discovery target, and evaluated it on that fold's outer test rows (Figure 8b). The nominal targets are not achieved out of sample, and we report both sides: at a 1% validation target the held-out precision is 0.953, recall 0.201 and observed false-discovery proportion 4.7%; at 5%, 0.900/0.331/10.0%; at 10%, 0.849/0.398/15.1%; at 20%, 0.759/0.490/24.1%. These are empirically calibrated operating points, not a demonstrated FDR-controlling procedure; the gap between validation target and held-out FDP is the honest measure of their transferability.</w:t>
       </w:r>
     </w:p>
     <w:p>
@@ -2994,17 +3008,26 @@
     </w:p>
     <w:p>
       <w:r>
-        <w:t>It is not a clean benchmark. The motif that the model learned is barely enriched in this set (PWM AUC 0.540 against same-protein cysteines), and PalmDL separates the literature sites from those cysteines only weakly (AUC 0.585). Manual inspection explains why: genuine sites are mixed with extraction errors, and many genuine sites (MyD88 C113, iRhom2 C476, GRP78 C420) are transmembrane-proximal cysteines whose linear motif is weak, which is precisely the class that an annotation-trained model has least often seen.</w:t>
+        <w:t>It is not a clean benchmark. The motif that the model learned is barely enriched in this set (PWM AUC 0.537 on the 133 scorable sites), and PalmDL separates the literature sites from same-protein cysteines only weakly (weighted within-protein AUC 0.585; pooled novel-site AUC 0.578). Manual inspection explains why: genuine sites are mixed with extraction errors, and many genuine sites are transmembrane-proximal or otherwise motif-atypical cysteines that an annotation-trained model has least often seen. A low PWM score does not by itself prove that a literature site is wrong; it shows that this class lies outside the motif distribution the model was trained on.</w:t>
       </w:r>
     </w:p>
     <w:p>
       <w:r>
-        <w:t>To make sure this was not an extraction artefact, we curated all 136 sites by reading every sentence. Ninety-nine mentions could be assigned unambiguously to a protein and a cysteine — either because the sentence states the site explicitly or because a cysteine-to-serine/alanine mutant lost palmitoylation — while 37 were rejected as sites of a different protein in the same sentence, catalytic-site mutants of DHHC enzymes, predicted-only sites, negative results, or table rows with mismatched proteins. The curated subset behaves like the full set, so extraction noise is not the explanation. Allowing every site and every same-protein negative to score its best window within ±2 residues also leaves the ranking unchanged, so numbering offsets do not explain the failure either.</w:t>
+        <w:t>To make sure this was not an extraction artefact, we curated all 136 sites by reading every sentence. Ninety-nine mentions could be assigned unambiguously to a protein and a cysteine — either because the sentence states the site explicitly or because a cysteine-to-serine/alanine mutant lost palmitoylation — while 37 were rejected as sites of a different protein in the same sentence, catalytic-site mutants of DHHC enzymes, predicted-only sites, negative results, or table rows with mismatched proteins. The curated subset behaves like the full set, so extraction noise is not the explanation.</w:t>
       </w:r>
     </w:p>
     <w:p>
       <w:r>
-        <w:t>Consistent with this, the curated sites are essentially absent from the proteome-wide shortlist: one of 99 appears at the 5% tier (expected 0.12 by chance) and two at the 20% tier. The honest conclusion is a domain-shift limitation that applies to any annotation-trained predictor, including PalmDL: it reproduces and extends the UniProt consensus, but does not recognise the motif-atypical, transmembrane-proximal sites that mechanistic papers tend to characterise.</w:t>
+        <w:t xml:space="preserve">The curated sites are almost absent from the candidate list: </w:t>
+      </w:r>
+      <w:r>
+        <w:rPr>
+          <w:b/>
+        </w:rPr>
+        <w:t>none of the 99 appears at the 5% tier, one at the 20% tier and two at the 30% tier</w:t>
+      </w:r>
+      <w:r>
+        <w:t xml:space="preserve"> (the same counts as the full 136-site set). The honest conclusion is a domain-shift limitation that applies to any annotation-trained predictor, including PalmDL: it reproduces and extends the UniProt consensus, but does not recognise the motif-atypical, transmembrane-proximal sites that mechanistic papers tend to characterise.</w:t>
       </w:r>
     </w:p>
     <w:p>
@@ -3018,7 +3041,7 @@
           <w:b/>
           <w:sz w:val="18"/>
         </w:rPr>
-        <w:t>Table 7. Automated literature mining as an external benchmark: yields and motif consistency.</w:t>
+        <w:t>Table 7. Automated literature mining as an external benchmark.</w:t>
       </w:r>
     </w:p>
     <w:tbl>
@@ -3129,7 +3152,7 @@
               <w:rPr>
                 <w:sz w:val="16"/>
               </w:rPr>
-              <w:t>136</w:t>
+              <w:t>133</w:t>
             </w:r>
           </w:p>
         </w:tc>
@@ -3147,7 +3170,7 @@
               <w:rPr>
                 <w:sz w:val="16"/>
               </w:rPr>
-              <w:t>0.540</w:t>
+              <w:t>0.537</w:t>
             </w:r>
           </w:p>
         </w:tc>
@@ -3165,7 +3188,7 @@
               <w:rPr>
                 <w:sz w:val="16"/>
               </w:rPr>
-              <w:t>0.585</w:t>
+              <w:t>0.585†</w:t>
             </w:r>
           </w:p>
         </w:tc>
@@ -3174,7 +3197,7 @@
     <w:p/>
     <w:p>
       <w:r>
-        <w:t>Comparisons are against other cysteines of the same proteins. PWM AUC is the enrichment of a position-specific log-odds motif trained on the UniProt data; if the extracted positives were faithful, this value should approach the model AUC. The manually curated subset (99 unambiguous mentions in 82 proteins) is used for the overlap analysis rather than for a separate filter row.</w:t>
+        <w:t>†Weighted within-protein AUC over 104 protein-level tests; the pooled novel-site AUC against same-protein cysteines is 0.578 and the filter-table value for the same 133 sites is 0.588. Comparisons are against other cysteines of the same proteins. The manually curated subset (99 unambiguous mentions in 82 proteins) is used for the overlap analysis, not as a separate filter row.</w:t>
       </w:r>
     </w:p>
     <w:p>
@@ -3206,12 +3229,12 @@
     </w:p>
     <w:p>
       <w:r>
-        <w:t>The 5% tier is biologically coherent. 61.8% of its sites carry annotated cytoplasmic topology versus 5.6% of all scanned cysteines — an 11.1-fold enrichment — and its highest-scoring entries include juxtamembrane cysteines of single-pass membrane proteins (endothelin receptor A C386/C388, claudin-2 C185, mucolipin-3 C550). Only one of the 136 literature-mined sites reaches the 20% tier, consistent with the motif-atypical nature of that set (§2.10).</w:t>
+        <w:t>The 5% tier is biologically coherent in composition. 61.8% of its sites carry annotated cytoplasmic topology versus 5.6% of all scanned cysteines (11.1-fold). The highest-confidence examples at the 5% tier include endothelin receptor A C386 (q = 0.044); its neighbour C388 is in the 20% tier (q = 0.174), and the other candidates mentioned in earlier drafts (claudin-2 C185, mucolipin-3 C550) have q = 0.70 and 0.41 and are not top-tier examples. Topology is an input feature, so this enrichment describes the composition of the list rather than validating the predictions.</w:t>
       </w:r>
     </w:p>
     <w:p>
       <w:r>
-        <w:t>Three caveats bound the resource. First, the proteome-wide prior is small (557 annotated sites among 262,286 cysteines, ≈0.2%), so strict FDR control is intrinsically severe; users interested in discovery should work at the 20–30% tiers. Second, 82% of scanned cysteines have no topology annotation and are strongly depleted from the shortlist (38.2%), so the list is biased toward proteins with curated topology. Third, and most important, the decoy tail is thin — few shuffled decoys reach the top of the score distribution — so the estimated FDR is optimistic and the tiers should be read as candidate rankings rather than as proven error rates. Known-site recovery in the scan (44.5% at the 5% tier) is also an in-sample upper bound, because the released model was trained on all UniProt annotations; the corresponding out-of-fold recall is 34.5% (§2.8).</w:t>
+        <w:t>Four caveats bound the resource. First, the proteome-wide prior is small (557 annotated sites among 262,286 cysteines, ≈0.2%), so any strict operating point is intrinsically severe. Second, 82% of scanned cysteines have no topology annotation and are strongly depleted from the shortlist (38.2%), so the list is biased toward proteins with curated topology. Third, the decoy tail is thin — few shuffled decoys reach the top of the score distribution — so the FDR estimate is optimistic and the tiers are candidate rankings rather than proven error rates. Fourth, known-site recovery in the scan (44.5% at the 5% tier) is an in-sample upper bound because the released model was trained on all UniProt annotations; the corresponding out-of-fold recall is 33.1% (§2.8).</w:t>
       </w:r>
     </w:p>
     <w:p>
@@ -4379,17 +4402,17 @@
     </w:p>
     <w:p>
       <w:r>
-        <w:t>On those folds PalmDL reaches AUC 0.944 overall and 0.914 on human sites. The best previously reported human AUC is 0.900 (GPS-Palm [8]); the best overall figure in the literature is 0.931 from a preprint using a site-level split (Deep-Palm [14]). Our human estimate is marginally above 0.900 (bootstrap P = 0.025) but its interval touches the published value, obtained under a protocol with zero shared windows. We therefore frame PalmDL as matching the published state of the art under a stricter protocol, with a small and uncertain advantage. This is not a head-to-head rerun: GPS-Palm's web server has been retired (HTTP 404 on 18 October 2026) and its standalone distribution is a GUI-only academic-licence package, so we could not score our test proteins with it. A true head-to-head on our released folds remains the single most important piece of missing evidence, and we provide the fold files to make it straightforward.</w:t>
+        <w:t>On those folds nested PalmDL reaches AUC 0.938 overall and 0.910 on human sites. The best previously reported human AUC is 0.900 (GPS-Palm [8]); the best overall figure in the literature is 0.931 from a preprint using a site-level split (Deep-Palm [14]). These are different test sets and negative schemes, so the numbers are context rather than a paired comparison; the within-study bootstrap probability that our human estimate falls below 0.900 is 0.08. This is not a head-to-head rerun: GPS-Palm's web server has been retired (HTTP 404 on 18 October 2026) and its standalone distribution is a GUI-only academic-licence package. A true head-to-head on our released folds remains the single most important piece of missing evidence, and we provide the fold files to make it straightforward.</w:t>
       </w:r>
     </w:p>
     <w:p>
       <w:r>
-        <w:t>The cross-species experiments split into two statements that are easy to conflate. When orthologues of the test species are available — the ordinary transfer setting, measured by the 6 × 6 matrix — mammalian models reach 0.85–0.95 on other mammals, effectively as good as within-species performance. When human-homologous clusters are removed, performance on human is 0.885. Most of the apparent generality of palmitoylation predictors therefore comes from orthologue coverage rather than from an abstract motif grammar. Bacterial lipidation does not belong in this comparison: after the label correction the bacterial positives are N-palmitoyl cysteines, a different modification with a different recognition logic, and we removed them rather than pretend that a transfer matrix over mixed chemistries measures the S-palmitoylation code.</w:t>
+        <w:t>The cross-species experiments are deliberately descriptive. With orthologues available, most mammalian pairs transfer at 0.83–0.95, but Pig→Human is 0.834 and the plant→mammal direction is 0.74–0.78; without human-homologous clusters, human performance is 0.885. The matrix therefore shows heterogeneous transfer among sampled species and negative-sampling protocols, not a uniform eukaryotic code, and it does not isolate orthologue coverage as the cause. Bacterial lipidation is excluded rather than compared: after the label correction the bacterial positives are N-palmitoyl cysteines, a different modification.</w:t>
       </w:r>
     </w:p>
     <w:p>
       <w:r>
-        <w:t>Two design choices follow from the error analysis. First, the gap between inferred (AUC 0.947) and experimental sites (0.907) is an annotation-memory effect that any user should know about: the experimentally characterised sites are the ones the propagation machinery does not already cover. Second, reporting a fixed 0.5 cut-off is less useful than reporting FDR-controlled operating points, because the deployable question is "how many predictions can I trust", not "what is my AUC". At a 5% estimated FDR the model retains 34.5% of known sites at 90.3% precision, which is a realistic basis for a shortlist.</w:t>
+        <w:t>Two design choices follow from the error analysis. First, the gap between inferred (AUC 0.947) and experimental sites (0.907) is an annotation-memory effect that any user should know about. Second, reporting a fixed 0.5 cut-off is less useful than reporting empirical operating points, provided their transfer is shown: at a 5% validation target the held-out precision is 0.900 and the observed false-discovery proportion 10.0%, so the nominal target is not a guarantee.</w:t>
       </w:r>
     </w:p>
     <w:p>
@@ -4399,7 +4422,7 @@
     </w:p>
     <w:p>
       <w:r>
-        <w:t>Structure is a modest, real improvement rather than a cure. Three AlphaFold-derived numbers — pLDDT at the site, local pLDDT and C-alpha packing — improve the forest view from 0.890 to 0.911, consistently in four of five folds. They also point in the expected direction: palmitoylated cysteines are less ordered and more exposed than the cysteines that surround them. But the domain shift documented in §2.10 is not simply a burial-versus-exposure problem, and structure alone will not close it; a larger structured training set, enzyme conditioning or orthogonal experimental data will be needed.</w:t>
+        <w:t>Structure is a modest, real improvement rather than a cure. Three AlphaFold-derived numbers — pLDDT at the site, local pLDDT and C-alpha packing — improve the forest view from 0.890 to 0.911, consistently in four of five folds. pLDDT is a model-confidence measure that correlates with disorder, not a direct experimental measure of flexibility. The domain shift documented in §2.10 is not simply a burial-versus-exposure problem, and structure alone will not close it.</w:t>
       </w:r>
     </w:p>
     <w:p>
@@ -4410,7 +4433,7 @@
         <w:t>Limitations.</w:t>
       </w:r>
       <w:r>
-        <w:t xml:space="preserve"> (i) 90% of positives are inferred rather than experimental; we stratify by evidence but cannot eliminate label noise, and the 449 experimental sites are too few for a well-powered experimental-only benchmark. (ii) Background negatives are proteins without annotation, not proteins proven not to be palmitoylated; some are certainly false negatives, which biases absolute metrics downwards while leaving model ranking intact. (iii) Our cluster definition uses 4-mer cosine similarity, an operational proxy: cosine 0.28–0.34 corresponded to median 71% global identity in a sample of 30 pairs, so remote homologues below ~50% identity may still cross folds; the species holdout is the more conservative experiment and is reported for that reason. (iv) We model only cysteine-centred windows and do not use predicted structure, DHHC-enzyme identity, or tissue expression. (v) The ensemble is calibrated at natural prevalence; performance at other prevalences requires recalibration. (vi) Independent, site-level public benchmarks do not exist: SwissPalm is behind an IP-verification gate, dbPTM and CysModDB no longer resolve, the MDD-Palm supplements contain no site lists, and GPS-Palm's server is retired. Both alternatives we could obtain fail a motif sanity check — the public RFCM-PALM mouse MS data (PWM AUC 0.53; PalmDL 0.52) and our own literature-mined set (PWM AUC 0.54; PalmDL 0.59; §2.10) — so neither is used as a benchmark. Their failure is itself informative: site-level assignment in cysteine-rich or transmembrane contexts is not yet reliable at scale, which is why the field's headline numbers remain independently unverified. (vii) The proteome-wide scan in this revision uses the forest view, because the ESM view could not be run at proteome scale on the available CPU hardware within a reasonable time; the released model and the prediction service still use the full ensemble, and the forest view is the stronger single view on hard negatives.</w:t>
+        <w:t xml:space="preserve"> (i) 90% of positives are inferred rather than experimental; we stratify by evidence but cannot eliminate label noise, and the 455 experimental sites are too few for a well-powered experimental-only benchmark. (ii) Background negatives are proteins without annotation, not proteins proven not to be palmitoylated. (iii) The cluster definition uses 4-mer cosine similarity, an operational proxy: cosine 0.28–0.34 corresponded to median 71% global identity in 30 sampled pairs, so remote homologues below ~50% identity may still cross folds. (iv) We model only cysteine-centred windows and do not use predicted structure, DHHC-enzyme identity, or tissue expression. (v) The ensemble is calibrated at natural prevalence; performance at other prevalences requires recalibration. (vi) Independent, site-level public benchmarks do not exist: SwissPalm is behind an IP-verification gate, dbPTM and CysModDB no longer resolve, the MDD-Palm supplements contain no site lists, and GPS-Palm's server is retired. Both alternatives we could obtain fail a motif sanity check, so neither is used as a benchmark. (vii) The proteome-wide scan uses the forest view and a shuffled-flank null with a thin tail; the tiers are candidate rankings, not demonstrated error rates. (viii) The cross-species matrix samples heterogeneous negative sets and leaves four cells empty for lack of eligible positives; it does not support a causal orthologue-coverage claim. (ix) The deployed service averages view logits rather than within-fold ranks, which on the same folds gives AUC 0.940 versus 0.944 for the rank average under the global combination.</w:t>
       </w:r>
     </w:p>
     <w:p>
@@ -4488,7 +4511,7 @@
         <w:t>S-palmitoyl cysteine</w:t>
       </w:r>
       <w:r>
-        <w:t xml:space="preserve"> and the canonical residue at the annotated position was a cysteine; the first version instead matched any note containing "palmitoyl", which admitted 2,381 N-/O-palmitoyl sites. Evidence codes were mapped to experimental (ECO:0000269, ECO:0007744, ECO:0007005, ECO:0006056) or inferred. Each site was represented by a 31-residue window centred on the cysteine and zero-padded with `X` at protein termini. Hard negatives were unannotated cysteines of positive-carrying proteins at least 16 residues from any palmitoylation site of any chemistry, capped at four per protein; background negatives were up to three cysteines from each human protein without any lipidation feature. Topology was derived from UniProt topological domains.</w:t>
+        <w:t xml:space="preserve"> and the canonical residue was a cysteine. A site was classified as experimental when at least one ECO clause in its evidence string matched ECO:0000269, ECO:0007744, ECO:0007005 or ECO:0006056; clauses are separated by ',' or ';' in UniProt, and both separators are handled. This gives 455 experimental and 3,969 inferred sites, the counts used in Table 6. Each site was represented by a 31-residue window centred on the cysteine and zero-padded with `X`. Hard negatives were unannotated cysteines of positive-carrying proteins at least 16 residues from any palmitoylation site, capped at four per protein; background negatives were up to three cysteines from each human protein without any lipidation feature. Topology was derived from UniProt topological domains.</w:t>
       </w:r>
     </w:p>
     <w:p>
@@ -4506,7 +4529,7 @@
     </w:p>
     <w:p>
       <w:r>
-        <w:t>Every protein in the dataset — positive-carrying and background alike — was clustered by cosine similarity of its 4-mer count vector at a threshold of 0.30, and clusters sharing an identical 31-residue window were merged, so no exact peptide occurs in two folds. Clusters were assigned to five folds with greedy balancing of positive counts (885 positives per fold). The species holdout used all human positives and human same-protein negatives as test; background negatives are human by construction and were excluded from both sides. Training used non-human sites after removing (i) every cluster containing a human protein and (ii) every annotation whose evidence referenced a human accession (`ECO:0000250|UniProtKB:&lt;human&gt;`). This leaves 1,480 training positives and 557 test positives.</w:t>
+        <w:t>Every protein in the dataset — positive-carrying and background alike — was clustered by cosine similarity of its 4-mer count vector at 0.30, and clusters sharing an identical 31-residue window were merged, so no exact peptide occurs in two folds. Clusters were assigned to five folds with greedy balancing of positive counts (885 positives per fold). The species holdout used human positives and human same-protein negatives as test; background negatives are human by construction and were excluded from both sides. Training used non-human sites after removing every cluster containing a human protein and every annotation propagated from a human accession, leaving 1,480 training and 557 test positives.</w:t>
       </w:r>
     </w:p>
     <w:p>
@@ -4547,7 +4570,16 @@
     </w:p>
     <w:p>
       <w:r>
-        <w:t>For each outer fold, 15% of the training clusters were held out as an inner validation set for early stopping and threshold selection. Background negatives were subsampled to 1× the number of positives in training; test folds retained their natural composition. Thresholds were chosen to maximise MCC on the inner validation set, and a second threshold was chosen on a class-balanced subsample of the validation set for balanced metrics. Ensemble members were rank-transformed within fold and averaged with equal weights; a Platt scaling model was fitted on the inner validation scores and applied to test scores. Member subsets were compared by pooled validation AUC, never by test performance; the selected two-view combination achieved 0.9487, against 0.9428 for the forest, 0.9328 for ESM-2 and 0.9420 for the three-view variant.</w:t>
+        <w:t xml:space="preserve">For each outer fold, 15% of the training clusters were held out as inner validation. Background negatives were subsampled to 1× the number of positives in training; test folds retained their natural composition. Thresholds were chosen to maximise MCC on the inner validation set. Ensemble member selection, calibration and thresholding were performed </w:t>
+      </w:r>
+      <w:r>
+        <w:rPr>
+          <w:b/>
+        </w:rPr>
+        <w:t>within the same outer fold</w:t>
+      </w:r>
+      <w:r>
+        <w:t>: the 31 non-empty subsets were ranked by that fold's validation AUC, the winner was Platt-calibrated on those rows, and the calibrated scores were applied to that fold's test rows. The globally selected combination is reported only as a sensitivity analysis. Discrimination is the unweighted mean of the five fold metrics; MCC and accuracy pool confusion counts at the per-fold thresholds. Two bootstrap schemes are reported: resampling sites and resampling protein clusters within folds.</w:t>
       </w:r>
     </w:p>
     <w:p>
@@ -4565,7 +4597,7 @@
     </w:p>
     <w:p>
       <w:r>
-        <w:t>Discrimination was measured by AUC and average precision; threshold-dependent performance by MCC, accuracy, sensitivity and specificity at the validation-derived threshold, reported both at natural prevalence and on class-balanced subsamples. Calibration was measured by expected calibration error with ten bins. Confidence intervals were obtained by bootstrapping sites (2,000 replicates); model comparisons used paired bootstrap on identical sites. All experiments used Python 3.12, PyTorch 2.9 (CPU), scikit-learn 1.6 and Biopython 1.88.</w:t>
+        <w:t>Discrimination was measured by AUC and average precision; threshold-dependent performance by MCC, accuracy, sensitivity and specificity at the validation-derived threshold, reported both at natural prevalence and on class-balanced subsamples. Calibration was measured by expected calibration error with ten bins. Confidence intervals were obtained by bootstrapping sites (2,000 replicates) and, because sites within a protein cluster are not independent, by resampling protein clusters within folds (1,000 replicates); the wider cluster interval is the one quoted in the abstract. Model comparisons used paired cluster bootstrap on identical rows. All experiments used Python 3.12, PyTorch 2.9 (CPU), scikit-learn 1.6 and Biopython 1.88.</w:t>
       </w:r>
     </w:p>
     <w:p>
@@ -4592,7 +4624,7 @@
         <w:t>Arabidopsis thaliana</w:t>
       </w:r>
       <w:r>
-        <w:t>. For each source species a PalmDL model (random forest plus ESM head) was trained on that species' positives, its same-protein negatives and an equal number of human background negatives. For the diagonal, 20% of the source species' protein clusters were held out and the model retrained on the remaining 80%; off-diagonal entries were predicted by the model trained on all source rows, after removing target rows whose cluster appears in training. The ESM head used 15% of the remaining clusters for early stopping (30 epochs, patience 6). AUC was computed on each target species' positives and same-protein negatives.</w:t>
+        <w:t>. For each source species one model (random forest plus ESM head) was trained on that species' positives and its same-protein negatives; human background negatives were excluded. Twenty percent of the source clusters were held out for the diagonal and another 15% for early stopping. Off-diagonal cells use the same model as their row. Target rows were restricted to positives and same-protein negatives and removed if their cluster appeared in either the fit or the validation split. Cells with fewer than 20 eligible test positives are reported as empty rather than estimated.</w:t>
       </w:r>
     </w:p>
     <w:p>
@@ -4610,7 +4642,16 @@
     </w:p>
     <w:p>
       <w:r>
-        <w:t>For each target FDR f and each fold separately, the validation rows were sorted by predicted probability and the largest threshold whose cumulative false-discovery fraction (FP / (TP + FP)) was ≤ f was selected. That fold's threshold was applied to that fold's outer test rows, and precision, recall and the number of predictions were pooled across folds. Thresholds are therefore never informed by other folds or by the test data.</w:t>
+        <w:t xml:space="preserve">For each empirical target f and each fold separately, validation rows were sorted by predicted probability and the lowest threshold was chosen whose </w:t>
+      </w:r>
+      <w:r>
+        <w:rPr>
+          <w:b/>
+        </w:rPr>
+        <w:t>complete score groups</w:t>
+      </w:r>
+      <w:r>
+        <w:t xml:space="preserve"> satisfied the cumulative false-discovery constraint (FP / (TP + FP) ≤ f); splitting a tied group is not allowed. The threshold was applied to that fold's outer test rows and precision, recall, predicted counts and the observed test false-discovery proportion were pooled across folds. Validation targets are nominal: they are not a guarantee of out-of-sample FDR control, and both values are reported.</w:t>
       </w:r>
     </w:p>
     <w:p>
@@ -4664,7 +4705,7 @@
     </w:p>
     <w:p>
       <w:r>
-        <w:t>All 262,286 cysteines of the reviewed human sequences in the local UniProt tables were scored in chunks of 5,000 with the forest view of the released model, calibrated on the same out-of-fold validation rows as the ensemble. The ESM view was not run at this scale in the revision because the CPU-only language model could not be evaluated over 262,286 windows within a reasonable time. For the FDR estimate we drew 20,000 random target windows and shuffled their 30 flanking residues while keeping the central cysteine fixed; this destroys the motif but preserves the candidate class, whereas mutating the centre (C→A) leaves a motif-shaped window and yields a badly conservative null because the model ignores the identity of the central residue. FDR at a threshold was estimated as (number of decoys at or above the threshold) × (targets / decoys) divided by (number of targets at or above the threshold), and q-values were obtained by taking the running minimum over lower thresholds. Because the decoy tail is thin, the resulting FDR should be read as optimistic, and the tiers are reported as candidate rankings rather than as proven error rates.</w:t>
+        <w:t>All 262,286 cysteines of the reviewed human sequences were scored in chunks with the forest view of the released model, calibrated on the same out-of-fold validation rows. The ESM view was not run at this scale. The null was 20,000 shuffled-flank decoys that keep the central cysteine but destroy the motif; a C→A decoy would remain motif-shaped. FDR at a threshold was estimated as (decoys at or above the threshold) × (targets / decoys) divided by (targets at or above the threshold), with q-values as the running minimum over lower thresholds. Because the decoy tail is thin and the shuffled null is not proven to represent unmodified cysteines, the tiers are candidate rankings rather than demonstrated error rates.</w:t>
       </w:r>
     </w:p>
     <w:p>
@@ -4682,7 +4723,7 @@
     </w:p>
     <w:p>
       <w:r>
-        <w:t>Human proteins with at least one annotated site and a random sample of background human proteins were queried through the AlphaFold DB prediction API, which returns the current model URL; models were retrieved for chains shorter than 700 residues, covering 1,950 human sites (463 positives in 476 proteins). Per site we recorded the C-alpha pLDDT, the mean pLDDT of residues within ±5 positions, and the number of C-alpha atoms within 10 Å of the site C-alpha excluding sequence neighbours closer than four positions. The three features were standardised and appended to the base feature matrix; the same random forest and the same cluster-disjoint folds were used with and without them, so the comparison is paired at the fold level. The prediction service released with the paper exposes the sequence path by default.</w:t>
+        <w:t>Human proteins with at least one annotated site and a random sample of background human proteins were queried through the AlphaFold DB prediction API; models were retrieved for chains shorter than 700 residues, covering 1,950 human sites (463 positives in 476 proteins). Per site we recorded the C-alpha pLDDT, mean pLDDT within ±5 positions, and C-alpha atoms within 10 Å excluding neighbours closer than four positions. The same random forest and cluster-disjoint folds were used with and without the features, so the comparison is paired at the fold level. The prediction service exposes the sequence path only.</w:t>
       </w:r>
     </w:p>
     <w:p>
@@ -4718,7 +4759,7 @@
     </w:p>
     <w:p>
       <w:r>
-        <w:t>Code, processed data (including the canonical fold assignments), out-of-fold predictions, proteome-wide scores and the prediction service are archived at Zenodo (DOI: 10.5281/zenodo.23455873); the service is available at [SERVICE-URL]. Supplementary Tables S1–S7 accompany the manuscript. Raw data are from UniProt release 2026_03 and are freely available under CC BY 4.0; AlphaFold models are from the AlphaFold DB (CC BY 4.0).</w:t>
+        <w:t>The corrected v2 code, processed data (including the canonical fold assignments), out-of-fold predictions and proteome-wide scores are available at https://github.com/opus940810/palm-dl (commit 758952f or later). The earlier v1.0.0 release is archived at Zenodo (DOI 10.5281/zenodo.23455873); it predates the label correction and must not be used for the results reported here, and a corrected Zenodo version will be deposited before publication. The prediction service is available at [SERVICE-URL]. Supplementary Tables S1–S7 accompany the manuscript. Raw data are from UniProt release 2026_03 and are freely available under CC BY 4.0; AlphaFold models are from the AlphaFold DB (CC BY 4.0).</w:t>
       </w:r>
     </w:p>
     <w:p>
@@ -4929,7 +4970,7 @@
         <w:pStyle w:val="ListNumber"/>
       </w:pPr>
       <w:r>
-        <w:t xml:space="preserve">Li Z, Wang C, Wang X, Wang J, Li Z, Zhang Y, et al. pCysMod: prediction of multiple cysteine modifications based on deep learning framework. </w:t>
+        <w:t xml:space="preserve">Li S, Yu K, Wu G, Zhang Q, Wang P, Zheng J. pCysMod: prediction of multiple cysteine modifications based on deep learning framework. </w:t>
       </w:r>
       <w:r>
         <w:rPr>
@@ -4980,7 +5021,7 @@
         <w:pStyle w:val="ListNumber"/>
       </w:pPr>
       <w:r>
-        <w:t xml:space="preserve">Meng L, Chen X, Cheng K, Chen K, Xu Z, Ren J, et al. CysModDB: a comprehensive platform with the integration of manually curated resources and analyses to facilitate the study of cysteine modifications. </w:t>
+        <w:t xml:space="preserve">Meng Y, Zhang L, Zhang L, Wang Z, Wang X, Li C. CysModDB: a comprehensive platform with the integration of manually curated resources and analyses to facilitate the study of cysteine modifications. </w:t>
       </w:r>
       <w:r>
         <w:rPr>
@@ -4989,7 +5030,7 @@
         <w:t>Brief Bioinform.</w:t>
       </w:r>
       <w:r>
-        <w:t xml:space="preserve"> 2022;23(5):bbac460. doi:10.1093/bib/bbac460</w:t>
+        <w:t xml:space="preserve"> 2022;23(6):bbac460. doi:10.1093/bib/bbac460</w:t>
       </w:r>
     </w:p>
     <w:p>
@@ -4997,7 +5038,7 @@
         <w:pStyle w:val="ListNumber"/>
       </w:pPr>
       <w:r>
-        <w:t xml:space="preserve">Meng L, Chan WS, Huang L, Hu J, Wang J, Huang H, et al. Mini-review: recent advances in post-translational modification site prediction based on deep learning. </w:t>
+        <w:t xml:space="preserve">Meng L, Chan W, Huang L, Liu L, Chen X, Zhang W. Mini-review: recent advances in post-translational modification site prediction based on deep learning. </w:t>
       </w:r>
       <w:r>
         <w:rPr>
@@ -5014,7 +5055,7 @@
         <w:pStyle w:val="ListNumber"/>
       </w:pPr>
       <w:r>
-        <w:t xml:space="preserve">Deng X, et al. Deep-Palm: an integrated deep learning framework for structure-aware prediction of protein S-palmitoylation. </w:t>
+        <w:t xml:space="preserve">Deng M, et al. Deep-Palm: an integrated deep learning framework for structure-aware prediction of protein S-palmitoylation. </w:t>
       </w:r>
       <w:r>
         <w:rPr>
@@ -5098,7 +5139,7 @@
         <w:rPr>
           <w:sz w:val="18"/>
         </w:rPr>
-        <w:t xml:space="preserve"> (a) ROC and (b) precision–recall curves for the PWM baseline, logistic regression, random forest, CNN, ESM-2 view and the PalmDL ensemble (4,424 positives, 67,266 sites).</w:t>
+        <w:t xml:space="preserve"> (a) ROC and (b) precision–recall curves pooled over out-of-fold predictions; the table reports unweighted fold means, so the pooled curves and the table are related but not identical estimands. Models: PWM, logistic regression, random forest, CNN, ESM-2 view and nested PalmDL (4,424 positives, 67,266 sites).</w:t>
       </w:r>
     </w:p>
     <w:p>
@@ -5113,7 +5154,7 @@
         <w:rPr>
           <w:sz w:val="18"/>
         </w:rPr>
-        <w:t xml:space="preserve"> (a) AUC and (b) class-balanced MCC for multi-species training with human test folds, human-only training, and the strict species holdout. PalmDL scores are shown where available.</w:t>
+        <w:t xml:space="preserve"> (a) AUC and (b) balanced MCC for multi-species training with human test folds, human-only training, and the strict species holdout. The species-holdout bars are single-model (random forest/CNN) results and are not a full ensemble; negative compositions differ between the three regimes.</w:t>
       </w:r>
     </w:p>
     <w:p>
@@ -5152,13 +5193,13 @@
           <w:b/>
           <w:sz w:val="18"/>
         </w:rPr>
-        <w:t>Figure 7. The palmitoylation code is shared across mammals and partly with plants.</w:t>
+        <w:t>Figure 7. Cross-species transfer is heterogeneous.</w:t>
       </w:r>
       <w:r>
         <w:rPr>
           <w:sz w:val="18"/>
         </w:rPr>
-        <w:t xml:space="preserve"> AUC of single-species PalmDL models, rows = training species, columns = test species, for the six species with at least 85 S-palmitoyl cysteine sites. Mammalian models transfer almost losslessly to other mammals; the plant model transfers only partially to mammals. Diagonal entries come from a protein-cluster-disjoint 20% holdout of the same species.</w:t>
+        <w:t xml:space="preserve"> AUC of single-species PalmDL models, rows = training species, columns = test species, for the six species with at least 85 S-palmitoyl cysteine sites. Most mammalian pairs transfer at 0.83–0.95 with a pig→human exception; the plant model reaches 0.74–0.78 on mammals. Empty cells have fewer than 20 eligible test positives after cluster removal. Diagonal entries come from a protein-cluster-disjoint 20% holdout of the same species.</w:t>
       </w:r>
     </w:p>
     <w:p>
@@ -6249,7 +6290,7 @@
               <w:rPr>
                 <w:sz w:val="16"/>
               </w:rPr>
-              <w:t>0.944</w:t>
+              <w:t>0.938</w:t>
             </w:r>
           </w:p>
         </w:tc>
@@ -6267,7 +6308,7 @@
               <w:rPr>
                 <w:sz w:val="16"/>
               </w:rPr>
-              <w:t>0.730</w:t>
+              <w:t>0.697</w:t>
             </w:r>
           </w:p>
         </w:tc>
@@ -6285,7 +6326,7 @@
               <w:rPr>
                 <w:sz w:val="16"/>
               </w:rPr>
-              <w:t>0.611</w:t>
+              <w:t>0.590</w:t>
             </w:r>
           </w:p>
         </w:tc>
@@ -6303,7 +6344,7 @@
               <w:rPr>
                 <w:sz w:val="16"/>
               </w:rPr>
-              <w:t>0.766</w:t>
+              <w:t>0.747</w:t>
             </w:r>
           </w:p>
         </w:tc>
@@ -6321,7 +6362,7 @@
               <w:rPr>
                 <w:sz w:val="16"/>
               </w:rPr>
-              <w:t>0.953</w:t>
+              <w:t>0.951</w:t>
             </w:r>
           </w:p>
         </w:tc>
@@ -6339,7 +6380,7 @@
               <w:rPr>
                 <w:sz w:val="16"/>
               </w:rPr>
-              <w:t>0.623</w:t>
+              <w:t>0.605</w:t>
             </w:r>
           </w:p>
         </w:tc>
@@ -6357,7 +6398,7 @@
               <w:rPr>
                 <w:sz w:val="16"/>
               </w:rPr>
-              <w:t>0.976</w:t>
+              <w:t>0.975</w:t>
             </w:r>
           </w:p>
         </w:tc>
@@ -7609,7 +7650,7 @@
               <w:rPr>
                 <w:sz w:val="16"/>
               </w:rPr>
-              <w:t>—</w:t>
+              <w:t>0.810</w:t>
             </w:r>
           </w:p>
         </w:tc>
@@ -7627,7 +7668,7 @@
               <w:rPr>
                 <w:sz w:val="16"/>
               </w:rPr>
-              <w:t>—</w:t>
+              <w:t>0.433</w:t>
             </w:r>
           </w:p>
         </w:tc>
@@ -7829,7 +7870,7 @@
               <w:rPr>
                 <w:sz w:val="16"/>
               </w:rPr>
-              <w:t>0.914</w:t>
+              <w:t>0.910</w:t>
             </w:r>
           </w:p>
         </w:tc>
@@ -7847,7 +7888,7 @@
               <w:rPr>
                 <w:sz w:val="16"/>
               </w:rPr>
-              <w:t>0.689</w:t>
+              <w:t>0.662</w:t>
             </w:r>
           </w:p>
         </w:tc>
@@ -7865,7 +7906,7 @@
               <w:rPr>
                 <w:sz w:val="16"/>
               </w:rPr>
-              <w:t>0.898</w:t>
+              <w:t>0.901</w:t>
             </w:r>
           </w:p>
         </w:tc>
@@ -7883,7 +7924,7 @@
               <w:rPr>
                 <w:sz w:val="16"/>
               </w:rPr>
-              <w:t>0.615</w:t>
+              <w:t>0.653</w:t>
             </w:r>
           </w:p>
         </w:tc>
@@ -8290,7 +8331,7 @@
       <w:r>
         <w:drawing>
           <wp:inline xmlns:a="http://schemas.openxmlformats.org/drawingml/2006/main" xmlns:pic="http://schemas.openxmlformats.org/drawingml/2006/picture">
-            <wp:extent cx="5940000" cy="2121622"/>
+            <wp:extent cx="5940000" cy="2137201"/>
             <wp:docPr id="8" name="Picture 8"/>
             <wp:cNvGraphicFramePr>
               <a:graphicFrameLocks noChangeAspect="1"/>
@@ -8311,7 +8352,7 @@
                   <pic:spPr>
                     <a:xfrm>
                       <a:off x="0" y="0"/>
-                      <a:ext cx="5940000" cy="2121622"/>
+                      <a:ext cx="5940000" cy="2137201"/>
                     </a:xfrm>
                     <a:prstGeom prst="rect"/>
                   </pic:spPr>

</xml_diff>

<commit_message>
Fix table header and correspondence line
</commit_message>
<xml_diff>
--- a/manuscript/PalmDL_manuscript.docx
+++ b/manuscript/PalmDL_manuscript.docx
@@ -44,7 +44,7 @@
     </w:p>
     <w:p>
       <w:r>
-        <w:t>\* Correspondence: [email]</w:t>
+        <w:t>Correspondence: [email]</w:t>
       </w:r>
     </w:p>
     <w:p>
@@ -1640,7 +1640,7 @@
                 <w:b/>
                 <w:sz w:val="16"/>
               </w:rPr>
-              <w:t>*A. thaliana*</w:t>
+              <w:t>A. thaliana</w:t>
             </w:r>
           </w:p>
         </w:tc>

</xml_diff>

<commit_message>
Third review round: nested Table 6/ECE, matrix wording, service UI, reproduce commands
</commit_message>
<xml_diff>
--- a/manuscript/PalmDL_manuscript.docx
+++ b/manuscript/PalmDL_manuscript.docx
@@ -79,7 +79,7 @@
         <w:t>Results.</w:t>
       </w:r>
       <w:r>
-        <w:t xml:space="preserve"> We assembled a versioned, evidence-stratified dataset from UniProt release 2026_03 comprising 67,266 labelled cysteine sites (4,424 S-palmitoyl cysteine sites, of which 455 are experimentally supported; 786 organisms; 557 human sites in 312 proteins) with explicitly separated hard (same-protein) and background negatives. Restricting positives to S-palmitoyl cysteine excluded 2,381 N-/O-palmitoyl annotations that a permissive text filter had admitted, and the corrected folds share no identical 31-residue window between training and test. Using a single model across four protocols we show that conventional benchmarks leak severely: 41.1% of test positives share an identical window with a training positive under a random site-level split and 45.2% under a protein-level split, inflating AUC from 0.944 to 0.985 and MCC from 0.720 to 0.810. PalmDL, a two-view ensemble of ESM-2 embeddings and motif/physicochemical features whose member combination is chosen inside each outer fold, reaches AUC 0.938 (cluster-bootstrap 95% CI 0.917–0.954), AUPR 0.697 and MCC 0.590 under cluster-held-out cross-validation; on held-out human sites it reaches 0.910 (0.890–0.929) and 0.885 on a strict species holdout. It improves on each single view (ΔAUC +0.008 over ESM-2, +0.007 over the forest, whose interval includes zero). Probabilities are Platt-calibrated (mean fold ECE 0.025). A six-species transfer matrix shows heterogeneous transfer rather than a universal code: most mammalian pairs transfer at 0.83–0.95, the plant model reaches 0.74–0.78 on mammals, and bacterial lipidation is excluded as a different modification. In-silico mutagenesis recovers the cysteine-cluster rule, and empirical validation-target operating points support candidate shortlists. A literature-mined external set of 136 sites from 91 papers remains motif-atypical (within-protein AUC 0.585), which we report as a domain-shift limitation rather than as validation.</w:t>
+        <w:t xml:space="preserve"> We assembled a versioned, evidence-stratified dataset from UniProt release 2026_03 comprising 67,266 labelled cysteine sites (4,424 S-palmitoyl cysteine sites, of which 455 are experimentally supported; 786 organisms; 557 human sites in 312 proteins) with explicitly separated hard (same-protein) and background negatives. Restricting positives to S-palmitoyl cysteine excluded 2,381 N-/O-palmitoyl annotations that a permissive text filter had admitted, and the corrected folds share no identical 31-residue window between training and test. Using a single model across four protocols we show that conventional benchmarks leak severely: 41.1% of test positives share an identical window with a training positive under a random site-level split and 45.2% under a protein-level split, inflating AUC from 0.944 to 0.985 and MCC from 0.720 to 0.810. PalmDL, a two-view ensemble of ESM-2 embeddings and motif/physicochemical features whose member combination is chosen inside each outer fold, reaches AUC 0.938 (cluster-bootstrap 95% CI 0.917–0.954), AUPR 0.697 and MCC 0.590 under cluster-held-out cross-validation; on held-out human sites it reaches 0.910 (0.890–0.929) and 0.885 on a strict species holdout. It improves on each single view (ΔAUC +0.008 over ESM-2, +0.007 over the forest, whose interval includes zero). Probabilities are Platt-calibrated (mean fold ECE 0.024; pooled ECE 0.018). A six-species transfer matrix shows heterogeneous transfer rather than a universal code: most mammalian pairs transfer at 0.83–0.95, the plant model reaches 0.74–0.78 on mammals, and bacterial lipidation is excluded as a different modification. In-silico mutagenesis recovers the cysteine-cluster rule, and empirical validation-target operating points support candidate shortlists. A literature-mined external set of 136 sites from 91 papers remains motif-atypical (within-protein AUC 0.585), which we report as a domain-shift limitation rather than as validation.</w:t>
       </w:r>
     </w:p>
     <w:p>
@@ -134,7 +134,7 @@
     </w:p>
     <w:p>
       <w:r>
-        <w:t>Here we address all three. We build a versioned, evidence-stratified dataset from a single UniProt release and separate hard from background negatives. We quantify, with one fixed model, how much each splitting protocol inflates performance, and measure the fraction of test positives whose exact window appeared in training. We then develop PalmDL, a leakage-aware ensemble of a protein-language-model view (ESM-2) and a motif/physicochemical view (random forest), calibrated and evaluated under cluster-held-out cross-validation, human-only training, and a strict cross-species holdout. We show that PalmDL exceeds the best previously reported human AUC on a benchmark with zero shared windows, and we release the split definitions so that future methods can be compared on identical, leakage-controlled folds.</w:t>
+        <w:t>Here we address all three. We build a versioned, evidence-stratified dataset from a single UniProt release and separate hard from background negatives. We quantify, with one fixed model, how much each splitting protocol inflates performance, and measure the fraction of test positives whose exact window appeared in training. We then develop PalmDL, a leakage-aware ensemble of a protein-language-model view (ESM-2) and a motif/physicochemical view (random forest), calibrated and evaluated under cluster-held-out cross-validation, human-only training, and a strict cross-species holdout. We report PalmDL's human AUC on a benchmark with zero shared windows alongside published values obtained on different data, and we release the split definitions so that future methods can be compared on identical, leakage-controlled folds.</w:t>
       </w:r>
     </w:p>
     <w:p>
@@ -183,7 +183,7 @@
         <w:t>4,424 positive sites</w:t>
       </w:r>
       <w:r>
-        <w:t>, 449 supported by experimental evidence codes and 3,975 inferred (mostly by similarity, 89.9%), from 786 organisms. Human (557 sites in 312 proteins) and mouse (511) are the largest contributors (Figure 1a,b). Of the annotated positives, 2,445 are cytoplasmic and only 27 extracellular (Figure 1c).</w:t>
+        <w:t>, 455 supported by experimental evidence codes and 3,969 inferred (mostly by similarity, 89.7%), from 786 organisms. Human (557 sites in 312 proteins) and mouse (511) are the largest contributors (Figure 1a,b). Of the annotated positives, 2,445 are cytoplasmic and only 27 extracellular (Figure 1c).</w:t>
       </w:r>
     </w:p>
     <w:p>
@@ -342,7 +342,7 @@
     </w:p>
     <w:p>
       <w:r>
-        <w:t>Probabilities from the calibrated ensemble are reliable at natural prevalence (mean fold ECE 0.025, pooled 10-bin ECE 0.021; Figure 5), whereas the uncalibrated forest has ECE ≈ 0.12 and over-confident tails. On the hard-negative benchmark (positives plus same-protein cysteines only, 1:1.95 ratio), PalmDL reaches AUC 0.952 and MCC 0.664, compared with 0.811/0.414 for the PWM baseline (Table 3), so the advantage is not an artefact of easy background negatives.</w:t>
+        <w:t>Probabilities from the calibrated ensemble are reliable at natural prevalence (mean fold ECE 0.024, pooled 10-bin ECE 0.018; Figure 5), whereas the uncalibrated forest has ECE ≈ 0.12 and over-confident tails. On the hard-negative benchmark (positives plus same-protein cysteines only, 1:1.95 ratio), PalmDL reaches AUC 0.952 and MCC 0.664, compared with 0.811/0.414 for the PWM baseline (Table 3), so the advantage is not an artefact of easy background negatives.</w:t>
       </w:r>
     </w:p>
     <w:p>
@@ -365,7 +365,7 @@
     </w:p>
     <w:p>
       <w:r>
-        <w:t>Table 4 places our results next to the numbers reported by previous methods. Three patterns are visible. First, classical MCC values (0.45–0.67) were obtained under protocols that either reuse the training literature or do not hold out proteins, and the only classical tool with an independent test (CSS-Palm 2.0) dropped from MCC 0.671 to 0.523 when it did so. Second, the deep-learning systems with published AUCs (GPS-Palm 0.900, pCysMod 0.807) report neither cross-species nor explicit protein-disjoint evaluation. Third, the highest published number (Deep-Palm 0.931) comes from a site-level split, precisely the protocol that our audit shows to leak 41–45% of windows. PalmDL's 0.938 is obtained with zero shared windows under nested member selection, and its human estimate, 0.910, is reported for context rather than as a paired superiority claim. Because we could not rerun GPS-Palm or the retired classical tools on our folds, Table 4 compares protocols as much as algorithms; the released fold files remove this obstacle for future work.</w:t>
+        <w:t>Table 4 places our results next to the numbers reported by previous methods. Three patterns are visible. First, classical MCC values (0.45–0.67) were obtained under protocols that either reuse the training literature or do not hold out proteins, and the only classical tool with an independent test (CSS-Palm 2.0) dropped from MCC 0.671 to 0.523 when it did so. Second, the deep-learning systems with published AUCs (GPS-Palm 0.900, pCysMod 0.807) report neither cross-species nor explicit protein-disjoint evaluation. Third, the highest published number (Deep-Palm 0.931) comes from a site-level split, precisely the protocol that our audit shows to leak 41–45% of windows. PalmDL's 0.938 is obtained with zero shared windows under nested member selection, and its human estimate, 0.910, is reported for context rather than as a paired superiority claim, because the published values come from different data, negatives and splits. Because we could not rerun GPS-Palm or the retired classical tools on our folds, Table 4 compares protocols as much as algorithms; the released fold files remove this obstacle for future work.</w:t>
       </w:r>
     </w:p>
     <w:p>
@@ -392,6 +392,9 @@
         <w:gridCol w:w="1904"/>
       </w:tblGrid>
       <w:tr>
+        <w:trPr>
+          <w:tblHeader w:val="true"/>
+        </w:trPr>
         <w:tc>
           <w:tcPr>
             <w:tcW w:type="dxa" w:w="1904"/>
@@ -1511,7 +1514,7 @@
         <w:t>heterogeneous</w:t>
       </w:r>
       <w:r>
-        <w:t xml:space="preserve">, not uniformly lossless. Most mammalian pairs fall between 0.83 and 0.95 (mean 0.896), with Pig→Human (0.834) the clear exception, 0.11 below the human diagonal and 0.14 below the pig diagonal. The plant model reaches 0.74–0.78 on mammals, whereas mammalian models reach 0.96–0.98 on </w:t>
+        <w:t xml:space="preserve">, not uniformly lossless. Most mammalian pairs fall between 0.83 and 0.95; the arithmetic mean of the 18 observable mammalian off-diagonal cells is 0.901. Pig→Human (0.834) is the clear exception, 0.084 below the human diagonal. Pig's own diagonal is empty (fewer than 20 eligible positives), so no diagonal comparison is made for that row. The plant model reaches 0.739–0.785 on mammals, whereas mammalian models reach 0.96–0.98 on </w:t>
       </w:r>
       <w:r>
         <w:rPr>
@@ -1525,7 +1528,7 @@
     </w:p>
     <w:p>
       <w:r>
-        <w:t>Two consequences follow. First, claims of a single shared eukaryotic code are not supported by this design: the pig exception and the plant asymmetry are as informative as the mammalian mean. Second, the strict human holdout (0.885) and the human CV estimate (0.910) differ by only 0.025 and use different model families and negative compositions, so they should not be read as a clean species-specific penalty. A paired design with matched negatives and a frozen target set would be needed to separate orthologue coverage from motif generalisation.</w:t>
+        <w:t>Two consequences follow. First, claims of a single shared eukaryotic code are not supported by this design: the pig exception and the plant asymmetry are as informative as the mammalian mean. For the human source only, the early-stopping split also contained 6,298 background negatives (the other sources use same-protein negatives), so the human row's model-selection condition is not fully matched; this is disclosed rather than corrected in this revision. Second, the strict human holdout (0.885) and the human CV estimate (0.910) differ by only 0.025 and use different model families and negative compositions, so they should not be read as a clean species-specific penalty. A paired design with matched negatives and a frozen target set would be needed to separate orthologue coverage from motif generalisation.</w:t>
       </w:r>
     </w:p>
     <w:p>
@@ -1554,6 +1557,9 @@
         <w:gridCol w:w="1360"/>
       </w:tblGrid>
       <w:tr>
+        <w:trPr>
+          <w:tblHeader w:val="true"/>
+        </w:trPr>
         <w:tc>
           <w:tcPr>
             <w:tcW w:type="dxa" w:w="1360"/>
@@ -2433,7 +2439,7 @@
     <w:p/>
     <w:p>
       <w:r>
-        <w:t xml:space="preserve">One model per source species is trained on its positives and same-protein negatives (no human background); 20% of source clusters are held out for the diagonal and another 15% for early stopping. Target cells use only positives and same-protein negatives, and rows whose cluster appears in either the fit or the validation split are removed. Off-diagonal cells therefore share the model of their row, as stated in Methods. Dashes mark cells with fewer than 20 eligible test positives (Human→Pig 13, Mouse→Pig 19, and the </w:t>
+        <w:t xml:space="preserve">One model per source species is trained on its positives and same-protein negatives (no human background); 20% of source clusters are held out for the diagonal and another 15% for early stopping. For the human source the early-stopping split also contained 6,298 background negatives, unlike the other rows; the 18-cell mammalian off-diagonal mean is 0.901. Target cells use only positives and same-protein negatives, and rows whose cluster appears in either the fit or the validation split are removed. Off-diagonal cells therefore share the model of their row, as stated in Methods. Dashes mark cells with fewer than 20 eligible test positives (Human→Pig 13, Mouse→Pig 19, and the </w:t>
       </w:r>
       <w:r>
         <w:rPr>
@@ -2460,12 +2466,12 @@
           <w:color w:val="000000"/>
           <w:sz w:val="22"/>
         </w:rPr>
-        <w:t>2.8 Error structure and FDR-controlled shortlists</w:t>
+        <w:t>2.8 Error structure and validation-target operating points</w:t>
       </w:r>
     </w:p>
     <w:p>
       <w:r>
-        <w:t xml:space="preserve">Because a predictor is only useful if its errors are predictable, we stratified the held-out predictions (Table 6). Discrimination remains better for inferred than for experimentally supported sites (AUC 0.947 versus 0.907). Evidence tiers now follow one rule: a site counts as experimental when </w:t>
+        <w:t xml:space="preserve">Because a predictor is only useful if its errors are predictable, we stratified the held-out predictions (Table 6). Discrimination remains better for inferred than for experimentally supported sites (pooled AUC 0.941 versus 0.902; each tier uses its positives plus all 62,842 negatives). Evidence tiers now follow one rule: a site counts as experimental when </w:t>
       </w:r>
       <w:r>
         <w:rPr>
@@ -2474,7 +2480,7 @@
         <w:t>any</w:t>
       </w:r>
       <w:r>
-        <w:t xml:space="preserve"> evidence clause is experimental (ECO:0000269, 0007744, 0007005 or 0006056), which gives 455 experimental and 3,969 inferred sites; six mixed-clause sites were previously misclassified by a comma-only split and are now aligned with Table 6. Performance is stable across annotated topologies (cytoplasmic 0.887, extracellular 0.855, topology unknown 0.898), with the lumenal class too small to interpret (14 positives). Topology is itself an input feature, so these strata describe where the model is accurate, not an independent validation of the topology signal.</w:t>
+        <w:t xml:space="preserve"> evidence clause is experimental (ECO:0000269, 0007744, 0007005 or 0006056), which gives 455 experimental and 3,969 inferred sites; six mixed-clause sites were previously misclassified by a comma-only split and are now aligned with Table 6. Pooled performance is stable across annotated topologies (cytoplasmic 0.858, extracellular 0.828, topology unknown 0.900); the extracellular estimate draws on three of five folds with both classes and the lumenal class (14 positives) is not interpretable. These pooled values differ from the unweighted fold means in Table 1, which are the primary estimates. Topology is itself an input feature, so these strata describe where the model is accurate, not an independent validation of the topology signal.</w:t>
       </w:r>
     </w:p>
     <w:p>
@@ -2488,7 +2494,7 @@
         <w:t>within each fold</w:t>
       </w:r>
       <w:r>
-        <w:t>, the lowest threshold whose complete score groups satisfy an empirical validation false-discovery target, and evaluated it on that fold's outer test rows (Figure 8b). The nominal targets are not achieved out of sample, and we report both sides: at a 1% validation target the held-out precision is 0.953, recall 0.201 and observed false-discovery proportion 4.7%; at 5%, 0.900/0.331/10.0%; at 10%, 0.849/0.398/15.1%; at 20%, 0.759/0.490/24.1%. These are empirically calibrated operating points, not a demonstrated FDR-controlling procedure; the gap between validation target and held-out FDP is the honest measure of their transferability.</w:t>
+        <w:t>, the lowest threshold whose complete score groups satisfy an empirical validation-target operating point, and evaluated it on that fold's outer test rows (Figure 8b). The nominal targets are not achieved out of sample, and we report both sides: at a 1% validation target the held-out precision is 0.953, recall 0.201 and observed false-discovery proportion 4.7%; at 5%, 0.900/0.331/10.0%; at 10%, 0.849/0.398/15.1%; at 20%, 0.759/0.490/24.1%. These are empirically calibrated operating points, not a demonstrated FDR-controlling procedure; the gap between validation target and held-out FDP is the honest measure of their transferability.</w:t>
       </w:r>
     </w:p>
     <w:p>
@@ -2514,6 +2520,9 @@
         <w:gridCol w:w="2379"/>
       </w:tblGrid>
       <w:tr>
+        <w:trPr>
+          <w:tblHeader w:val="true"/>
+        </w:trPr>
         <w:tc>
           <w:tcPr>
             <w:tcW w:type="dxa" w:w="2379"/>
@@ -2626,7 +2635,7 @@
               <w:rPr>
                 <w:sz w:val="16"/>
               </w:rPr>
-              <w:t>0.907</w:t>
+              <w:t>0.902</w:t>
             </w:r>
           </w:p>
         </w:tc>
@@ -2700,7 +2709,7 @@
               <w:rPr>
                 <w:sz w:val="16"/>
               </w:rPr>
-              <w:t>0.947</w:t>
+              <w:t>0.941</w:t>
             </w:r>
           </w:p>
         </w:tc>
@@ -2718,7 +2727,7 @@
               <w:rPr>
                 <w:sz w:val="16"/>
               </w:rPr>
-              <w:t>0.682</w:t>
+              <w:t>0.664</w:t>
             </w:r>
           </w:p>
         </w:tc>
@@ -2774,7 +2783,7 @@
               <w:rPr>
                 <w:sz w:val="16"/>
               </w:rPr>
-              <w:t>0.887</w:t>
+              <w:t>0.858</w:t>
             </w:r>
           </w:p>
         </w:tc>
@@ -2792,7 +2801,7 @@
               <w:rPr>
                 <w:sz w:val="16"/>
               </w:rPr>
-              <w:t>0.829</w:t>
+              <w:t>0.808</w:t>
             </w:r>
           </w:p>
         </w:tc>
@@ -2848,7 +2857,7 @@
               <w:rPr>
                 <w:sz w:val="16"/>
               </w:rPr>
-              <w:t>0.855</w:t>
+              <w:t>0.828</w:t>
             </w:r>
           </w:p>
         </w:tc>
@@ -2866,7 +2875,7 @@
               <w:rPr>
                 <w:sz w:val="16"/>
               </w:rPr>
-              <w:t>0.375</w:t>
+              <w:t>0.361</w:t>
             </w:r>
           </w:p>
         </w:tc>
@@ -2922,7 +2931,7 @@
               <w:rPr>
                 <w:sz w:val="16"/>
               </w:rPr>
-              <w:t>0.898</w:t>
+              <w:t>0.900</w:t>
             </w:r>
           </w:p>
         </w:tc>
@@ -2940,7 +2949,7 @@
               <w:rPr>
                 <w:sz w:val="16"/>
               </w:rPr>
-              <w:t>0.501</w:t>
+              <w:t>0.512</w:t>
             </w:r>
           </w:p>
         </w:tc>
@@ -3013,7 +3022,7 @@
     </w:p>
     <w:p>
       <w:r>
-        <w:t>To make sure this was not an extraction artefact, we curated all 136 sites by reading every sentence. Ninety-nine mentions could be assigned unambiguously to a protein and a cysteine — either because the sentence states the site explicitly or because a cysteine-to-serine/alanine mutant lost palmitoylation — while 37 were rejected as sites of a different protein in the same sentence, catalytic-site mutants of DHHC enzymes, predicted-only sites, negative results, or table rows with mismatched proteins. The curated subset behaves like the full set, so extraction noise is not the explanation.</w:t>
+        <w:t>To make sure this was not an extraction artefact, we curated all 136 sites by reading every sentence. Ninety-nine mentions could be assigned unambiguously to a protein and a cysteine — either because the sentence states the site explicitly or because a cysteine-to-serine/alanine mutant lost palmitoylation — while 37 were rejected as sites of a different protein in the same sentence, catalytic-site mutants of DHHC enzymes, predicted-only sites, negative results, or table rows with mismatched proteins. The curated subset also has little overlap with the candidate tiers (0/1/2 at 5%/20%/30%), consistent with the full set; extraction noise alone is not a sufficient explanation, but the curated set has no independent AUC of its own.</w:t>
       </w:r>
     </w:p>
     <w:p>
@@ -3027,12 +3036,12 @@
         <w:t>none of the 99 appears at the 5% tier, one at the 20% tier and two at the 30% tier</w:t>
       </w:r>
       <w:r>
-        <w:t xml:space="preserve"> (the same counts as the full 136-site set). The honest conclusion is a domain-shift limitation that applies to any annotation-trained predictor, including PalmDL: it reproduces and extends the UniProt consensus, but does not recognise the motif-atypical, transmembrane-proximal sites that mechanistic papers tend to characterise.</w:t>
+        <w:t xml:space="preserve"> (the same counts as the full 136-site set). For PalmDL, the honest conclusion is a domain-shift limitation: it reproduces and extends the UniProt consensus, but does not recognise the motif-atypical, transmembrane-proximal sites that mechanistic papers tend to characterise.</w:t>
       </w:r>
     </w:p>
     <w:p>
       <w:r>
-        <w:t>We therefore report this as an audit of the resource landscape rather than as a validation. It quantifies the statement in the Introduction: the field's headline numbers have never been checked on data that are simultaneously independent, site-level and motif-consistent, and automated literature mining does not yet close that gap.</w:t>
+        <w:t>We therefore report this as an audit of the resource landscape rather than as a validation. It quantifies the statement in the Introduction for our own model: its headline numbers have not been checked on data that are simultaneously independent, site-level and motif-consistent, and automated literature mining does not yet close that gap. A low motif score does not establish that a literature site is wrong; it shows that the site lies outside the motif distribution the model learned.</w:t>
       </w:r>
     </w:p>
     <w:p>
@@ -3058,6 +3067,9 @@
         <w:gridCol w:w="2379"/>
       </w:tblGrid>
       <w:tr>
+        <w:trPr>
+          <w:tblHeader w:val="true"/>
+        </w:trPr>
         <w:tc>
           <w:tcPr>
             <w:tcW w:type="dxa" w:w="2379"/>
@@ -3210,7 +3222,7 @@
           <w:color w:val="000000"/>
           <w:sz w:val="22"/>
         </w:rPr>
-        <w:t>2.11 A proteome-wide, FDR-controlled candidate list</w:t>
+        <w:t>2.11 A proteome-wide candidate list with empirical q-values</w:t>
       </w:r>
     </w:p>
     <w:p>
@@ -3224,7 +3236,7 @@
         <w:t>262,286 sites in 19,814 proteins</w:t>
       </w:r>
       <w:r>
-        <w:t xml:space="preserve"> — and controlled the false-discovery rate with 20,000 shuffled-flank decoys that keep the central cysteine but destroy the motif. (A C→A decoy is inappropriate: §2.9 shows that the model is deliberately insensitive to the identity of the centre.) At the 1% tier the scan yields 215 sites in 134 proteins; at 5%, 301 sites in 199 proteins (248 already annotated, 53 novel); at 10%, 396; at 20%, 615; and at 30%, 1,010 (Table 8, Figure 9).</w:t>
+        <w:t xml:space="preserve"> — and estimated empirical q-values against 20,000 shuffled-flank decoys that keep the central cysteine but destroy the motif. (A C→A decoy is inappropriate: §2.9 shows that the model is deliberately insensitive to the identity of the centre.) At the 1% tier the scan yields 215 sites in 134 proteins; at 5%, 301 sites in 199 proteins (248 already annotated, 53 novel); at 10%, 396; at 20%, 615; and at 30%, 1,010 (Table 8, Figure 9).</w:t>
       </w:r>
     </w:p>
     <w:p>
@@ -3243,7 +3255,7 @@
           <w:b/>
           <w:sz w:val="18"/>
         </w:rPr>
-        <w:t>Table 8. Proteome-wide scan of the reviewed human proteome (262,286 cysteines) at five FDR tiers.</w:t>
+        <w:t>Table 8. Proteome-wide scan of the reviewed human proteome (262,286 cysteines) at five empirical candidate tiers.</w:t>
       </w:r>
     </w:p>
     <w:tbl>
@@ -3263,6 +3275,9 @@
         <w:gridCol w:w="1360"/>
       </w:tblGrid>
       <w:tr>
+        <w:trPr>
+          <w:tblHeader w:val="true"/>
+        </w:trPr>
         <w:tc>
           <w:tcPr>
             <w:tcW w:type="dxa" w:w="1360"/>
@@ -4046,7 +4061,7 @@
     </w:p>
     <w:p>
       <w:r>
-        <w:t>It does not cure the domain shift of §2.10. The class of sites that literature studies characterise — often transmembrane-proximal, sometimes weakly structured — is not rescued by burial or flexibility alone. Structure therefore improves ranking where annotations already exist, but it is not by itself the missing piece for genuinely novel sites.</w:t>
+        <w:t>No structural model was run for the literature sites in this revision, so whether structure would help there is untested. The earlier claim that structure cannot close the domain shift is therefore withdrawn: the paired comparison only establishes a modest gain where annotated human sites have AlphaFold models.</w:t>
       </w:r>
     </w:p>
     <w:p>
@@ -4072,6 +4087,9 @@
         <w:gridCol w:w="2379"/>
       </w:tblGrid>
       <w:tr>
+        <w:trPr>
+          <w:tblHeader w:val="true"/>
+        </w:trPr>
         <w:tc>
           <w:tcPr>
             <w:tcW w:type="dxa" w:w="2379"/>
@@ -4222,6 +4240,9 @@
         <w:gridCol w:w="3173"/>
       </w:tblGrid>
       <w:tr>
+        <w:trPr>
+          <w:tblHeader w:val="true"/>
+        </w:trPr>
         <w:tc>
           <w:tcPr>
             <w:tcW w:type="dxa" w:w="3173"/>
@@ -4407,7 +4428,7 @@
     </w:p>
     <w:p>
       <w:r>
-        <w:t>The cross-species experiments are deliberately descriptive. With orthologues available, most mammalian pairs transfer at 0.83–0.95, but Pig→Human is 0.834 and the plant→mammal direction is 0.74–0.78; without human-homologous clusters, human performance is 0.885. The matrix therefore shows heterogeneous transfer among sampled species and negative-sampling protocols, not a uniform eukaryotic code, and it does not isolate orthologue coverage as the cause. Bacterial lipidation is excluded rather than compared: after the label correction the bacterial positives are N-palmitoyl cysteines, a different modification.</w:t>
+        <w:t>The cross-species experiments are deliberately descriptive. With orthologues available, most mammalian pairs transfer at 0.83–0.95 (18-cell mean 0.901), but Pig→Human is 0.834 and the plant→mammal direction is 0.739–0.785; without human-homologous clusters, human performance is 0.885. The matrix therefore shows heterogeneous transfer among sampled species and negative-sampling protocols, not a uniform eukaryotic code, and it does not isolate orthologue coverage as the cause. Bacterial lipidation is excluded rather than compared: after the label correction the bacterial positives are N-palmitoyl cysteines, a different modification.</w:t>
       </w:r>
     </w:p>
     <w:p>
@@ -4422,7 +4443,7 @@
     </w:p>
     <w:p>
       <w:r>
-        <w:t>Structure is a modest, real improvement rather than a cure. Three AlphaFold-derived numbers — pLDDT at the site, local pLDDT and C-alpha packing — improve the forest view from 0.890 to 0.911, consistently in four of five folds. pLDDT is a model-confidence measure that correlates with disorder, not a direct experimental measure of flexibility. The domain shift documented in §2.10 is not simply a burial-versus-exposure problem, and structure alone will not close it.</w:t>
+        <w:t>Structure is a modest, real improvement rather than a cure. Three AlphaFold-derived numbers — pLDDT at the site, local pLDDT and C-alpha packing — improve the forest view from 0.890 to 0.911, consistently in four of five folds. pLDDT is a model-confidence measure that correlates with disorder, not a direct experimental measure of flexibility. No structural model was available for the literature sites in this revision, so whether structure would help there remains untested rather than refuted.</w:t>
       </w:r>
     </w:p>
     <w:p>
@@ -4637,7 +4658,7 @@
           <w:color w:val="000000"/>
           <w:sz w:val="22"/>
         </w:rPr>
-        <w:t>4.8 FDR-controlled operating points</w:t>
+        <w:t>4.8 Empirical validation-target operating points</w:t>
       </w:r>
     </w:p>
     <w:p>
@@ -4759,7 +4780,7 @@
     </w:p>
     <w:p>
       <w:r>
-        <w:t>The corrected v2 code, processed data (including the canonical fold assignments), out-of-fold predictions and proteome-wide scores are available at https://github.com/opus940810/palm-dl (commit 758952f or later). The earlier v1.0.0 release is archived at Zenodo (DOI 10.5281/zenodo.23455873); it predates the label correction and must not be used for the results reported here, and a corrected Zenodo version will be deposited before publication. The prediction service is available at [SERVICE-URL]. Supplementary Tables S1–S7 accompany the manuscript. Raw data are from UniProt release 2026_03 and are freely available under CC BY 4.0; AlphaFold models are from the AlphaFold DB (CC BY 4.0).</w:t>
+        <w:t>The corrected v2 code, processed data (including the canonical fold assignments), out-of-fold predictions and proteome-wide scores are available at https://github.com/opus940810/palm-dl (release tag v2.1; the exact commit, file hashes and reproduction commands are listed in docs/REPRODUCE.md). The earlier v1.0.0 release is archived at Zenodo (DOI 10.5281/zenodo.23455873); it predates the label correction and must not be used for the results reported here, and a corrected Zenodo version will be deposited before publication. The prediction service is available at [SERVICE-URL]. Supplementary Tables S1–S7 accompany the manuscript. Raw data are from UniProt release 2026_03 and are freely available under CC BY 4.0; AlphaFold models are from the AlphaFold DB (CC BY 4.0).</w:t>
       </w:r>
     </w:p>
     <w:p>
@@ -4987,7 +5008,7 @@
         <w:pStyle w:val="ListNumber"/>
       </w:pPr>
       <w:r>
-        <w:t xml:space="preserve">Bandyopadhyay A, et al. RFCM-PALM: in-silico prediction of S-palmitoylation sites in the synaptic proteins for male/female mouse data. </w:t>
+        <w:t xml:space="preserve">Bandyopadhyay SS, et al. RFCM-PALM: in-silico prediction of S-palmitoylation sites in the synaptic proteins for male/female mouse data. </w:t>
       </w:r>
       <w:r>
         <w:rPr>
@@ -5021,7 +5042,7 @@
         <w:pStyle w:val="ListNumber"/>
       </w:pPr>
       <w:r>
-        <w:t xml:space="preserve">Meng Y, Zhang L, Zhang L, Wang Z, Wang X, Li C. CysModDB: a comprehensive platform with the integration of manually curated resources and analyses to facilitate the study of cysteine modifications. </w:t>
+        <w:t xml:space="preserve">Meng Y, Zhang L, Zhang L, Wang Z, Wang X, Li C. CysModDB: a comprehensive platform with the integration of manually curated resources and analysis tools to facilitate the study of cysteine modifications. </w:t>
       </w:r>
       <w:r>
         <w:rPr>
@@ -5109,7 +5130,7 @@
         <w:rPr>
           <w:sz w:val="18"/>
         </w:rPr>
-        <w:t xml:space="preserve"> (a) Organisms contributing the largest numbers of annotated S-palmitoyl cysteine sites (human and mouse highlighted; remaining 784 organisms pooled). (b) Evidence tier of positive sites (log scale): 449 experimentally supported versus 3,975 inferred, mostly by similarity. (c) Annotated topology of positive sites.</w:t>
+        <w:t xml:space="preserve"> (a) Organisms contributing the largest numbers of annotated S-palmitoyl cysteine sites (human and mouse highlighted; remaining 784 organisms pooled). (b) Evidence tier of positive sites (log scale): 455 experimentally supported versus 3,969 inferred, mostly by similarity. (c) Annotated topology of positive sites.</w:t>
       </w:r>
     </w:p>
     <w:p>
@@ -5214,7 +5235,7 @@
         <w:rPr>
           <w:sz w:val="18"/>
         </w:rPr>
-        <w:t xml:space="preserve"> (a) Mean change in predicted probability when each position of 300 human positive windows is mutated to each amino acid (forest view). Cysteine at ±1 increases the score (cysteine clusters), acidic residues at −1/−2 decrease it, and the central position is neutral because every candidate is a cysteine. (b) FDR-controlled operating points: precision against recall on the outer test folds when the threshold is chosen on validation at estimated FDR 1%, 5%, 10% and 20%.</w:t>
+        <w:t xml:space="preserve"> (a) Mean change in predicted probability when each position of 300 human positive windows is mutated to each amino acid (forest view). Cysteine at ±1 increases the score (cysteine clusters), acidic residues at −1/−2 decrease it, and the central position is neutral because every candidate is a cysteine. (b) Validation-target operating points: precision against recall on the outer test folds when the threshold is chosen on validation at empirical targets of 1%, 5%, 10% and 20%; observed held-out false-discovery proportions are 4.7%, 10.0%, 15.1% and 24.1%.</w:t>
       </w:r>
     </w:p>
     <w:p>
@@ -5406,6 +5427,9 @@
         <w:gridCol w:w="1190"/>
       </w:tblGrid>
       <w:tr>
+        <w:trPr>
+          <w:tblHeader w:val="true"/>
+        </w:trPr>
         <w:tc>
           <w:tcPr>
             <w:tcW w:type="dxa" w:w="1190"/>
@@ -6438,6 +6462,9 @@
         <w:gridCol w:w="1360"/>
       </w:tblGrid>
       <w:tr>
+        <w:trPr>
+          <w:tblHeader w:val="true"/>
+        </w:trPr>
         <w:tc>
           <w:tcPr>
             <w:tcW w:type="dxa" w:w="1360"/>
@@ -7091,6 +7118,9 @@
         <w:gridCol w:w="1360"/>
       </w:tblGrid>
       <w:tr>
+        <w:trPr>
+          <w:tblHeader w:val="true"/>
+        </w:trPr>
         <w:tc>
           <w:tcPr>
             <w:tcW w:type="dxa" w:w="1360"/>

</xml_diff>

<commit_message>
Sync figure legends and Table 8 header
</commit_message>
<xml_diff>
--- a/manuscript/PalmDL_manuscript.docx
+++ b/manuscript/PalmDL_manuscript.docx
@@ -3289,7 +3289,7 @@
                 <w:b/>
                 <w:sz w:val="16"/>
               </w:rPr>
-              <w:t>FDR</w:t>
+              <w:t>empirical tier</w:t>
             </w:r>
           </w:p>
         </w:tc>
@@ -8351,7 +8351,7 @@
           <w:i/>
           <w:sz w:val="18"/>
         </w:rPr>
-        <w:t>Figure 7. The palmitoylation code is eukaryotic.</w:t>
+        <w:t>Figure 7. Cross-species transfer is heterogeneous.</w:t>
       </w:r>
     </w:p>
     <w:p>
@@ -8361,7 +8361,7 @@
       <w:r>
         <w:drawing>
           <wp:inline xmlns:a="http://schemas.openxmlformats.org/drawingml/2006/main" xmlns:pic="http://schemas.openxmlformats.org/drawingml/2006/picture">
-            <wp:extent cx="5940000" cy="2137201"/>
+            <wp:extent cx="5940000" cy="1949334"/>
             <wp:docPr id="8" name="Picture 8"/>
             <wp:cNvGraphicFramePr>
               <a:graphicFrameLocks noChangeAspect="1"/>
@@ -8382,7 +8382,7 @@
                   <pic:spPr>
                     <a:xfrm>
                       <a:off x="0" y="0"/>
-                      <a:ext cx="5940000" cy="2137201"/>
+                      <a:ext cx="5940000" cy="1949334"/>
                     </a:xfrm>
                     <a:prstGeom prst="rect"/>
                   </pic:spPr>
@@ -8447,7 +8447,7 @@
           <w:i/>
           <w:sz w:val="18"/>
         </w:rPr>
-        <w:t>Figure 9. Proteome-wide scan and FDR-controlled shortlist.</w:t>
+        <w:t>Figure 9. Proteome-wide scan and candidate shortlist with empirical q-values.</w:t>
       </w:r>
     </w:p>
     <w:sectPr>

</xml_diff>

<commit_message>
Release v2.1: reproduce manifest, README entry, server UI cleanup
</commit_message>
<xml_diff>
--- a/manuscript/PalmDL_manuscript.docx
+++ b/manuscript/PalmDL_manuscript.docx
@@ -79,7 +79,7 @@
         <w:t>Results.</w:t>
       </w:r>
       <w:r>
-        <w:t xml:space="preserve"> We assembled a versioned, evidence-stratified dataset from UniProt release 2026_03 comprising 67,266 labelled cysteine sites (4,424 S-palmitoyl cysteine sites, of which 455 are experimentally supported; 786 organisms; 557 human sites in 312 proteins) with explicitly separated hard (same-protein) and background negatives. Restricting positives to S-palmitoyl cysteine excluded 2,381 N-/O-palmitoyl annotations that a permissive text filter had admitted, and the corrected folds share no identical 31-residue window between training and test. Using a single model across four protocols we show that conventional benchmarks leak severely: 41.1% of test positives share an identical window with a training positive under a random site-level split and 45.2% under a protein-level split, inflating AUC from 0.944 to 0.985 and MCC from 0.720 to 0.810. PalmDL, a two-view ensemble of ESM-2 embeddings and motif/physicochemical features whose member combination is chosen inside each outer fold, reaches AUC 0.938 (cluster-bootstrap 95% CI 0.917–0.954), AUPR 0.697 and MCC 0.590 under cluster-held-out cross-validation; on held-out human sites it reaches 0.910 (0.890–0.929) and 0.885 on a strict species holdout. It improves on each single view (ΔAUC +0.008 over ESM-2, +0.007 over the forest, whose interval includes zero). Probabilities are Platt-calibrated (mean fold ECE 0.024; pooled ECE 0.018). A six-species transfer matrix shows heterogeneous transfer rather than a universal code: most mammalian pairs transfer at 0.83–0.95, the plant model reaches 0.74–0.78 on mammals, and bacterial lipidation is excluded as a different modification. In-silico mutagenesis recovers the cysteine-cluster rule, and empirical validation-target operating points support candidate shortlists. A literature-mined external set of 136 sites from 91 papers remains motif-atypical (within-protein AUC 0.585), which we report as a domain-shift limitation rather than as validation.</w:t>
+        <w:t xml:space="preserve"> We assembled a versioned, evidence-stratified dataset from UniProt release 2026_03 comprising 67,266 labelled cysteine sites (4,424 S-palmitoyl cysteine sites, of which 455 are experimentally supported; 786 organisms; 557 human sites in 312 proteins) with explicitly separated hard (same-protein) and background negatives. Restricting positives to S-palmitoyl cysteine excluded 2,381 N-/O-palmitoyl annotations that a permissive text filter had admitted, and the corrected folds share no identical 31-residue window between training and test. Using a single model across four protocols we show that conventional benchmarks leak severely: 41.1% of test positives share an identical window with a training positive under a random site-level split and 45.2% under a protein-level split, inflating AUC from 0.944 to 0.985 and MCC from 0.720 to 0.810. PalmDL, a two-view ensemble of ESM-2 embeddings and motif/physicochemical features whose member combination is chosen inside each outer fold, reaches AUC 0.938 (cluster-bootstrap 95% CI 0.917–0.954), AUPR 0.697 and MCC 0.590 under cluster-held-out cross-validation; on held-out human sites it reaches 0.910 (0.890–0.929) and 0.885 on a strict species holdout. It improves on each single view (ΔAUC +0.008 over ESM-2, +0.007 over the forest, whose interval includes zero). Probabilities are Platt-calibrated (mean fold ECE 0.024; pooled ECE 0.018). A six-species transfer matrix shows heterogeneous transfer rather than a universal code: most mammalian pairs transfer at 0.83–0.95, the plant model reaches 0.739–0.785 on mammals, and bacterial lipidation is excluded as a different modification. In-silico mutagenesis recovers the cysteine-cluster rule, and empirical validation-target operating points support candidate shortlists. A literature-mined external set of 136 sites from 91 papers remains motif-atypical (within-protein AUC 0.585), which we report as a domain-shift limitation rather than as validation.</w:t>
       </w:r>
     </w:p>
     <w:p>
@@ -2439,7 +2439,7 @@
     <w:p/>
     <w:p>
       <w:r>
-        <w:t xml:space="preserve">One model per source species is trained on its positives and same-protein negatives (no human background); 20% of source clusters are held out for the diagonal and another 15% for early stopping. For the human source the early-stopping split also contained 6,298 background negatives, unlike the other rows; the 18-cell mammalian off-diagonal mean is 0.901. Target cells use only positives and same-protein negatives, and rows whose cluster appears in either the fit or the validation split are removed. Off-diagonal cells therefore share the model of their row, as stated in Methods. Dashes mark cells with fewer than 20 eligible test positives (Human→Pig 13, Mouse→Pig 19, and the </w:t>
+        <w:t xml:space="preserve">Fit and target rows exclude human background negatives; the human early-stopping split additionally contains 6,298 background negatives, unlike the other rows. Twenty percent of source clusters are held out for the diagonal and another 15% for early stopping. For the human source the early-stopping split also contained 6,298 background negatives, unlike the other rows; the 18-cell mammalian off-diagonal mean is 0.901. Target cells use only positives and same-protein negatives, and rows whose cluster appears in either the fit or the validation split are removed. Off-diagonal cells therefore share the model of their row, as stated in Methods. Dashes mark cells with fewer than 20 eligible test positives (Human→Pig 13, Mouse→Pig 19, and the </w:t>
       </w:r>
       <w:r>
         <w:rPr>
@@ -2449,11 +2449,6 @@
       </w:r>
       <w:r>
         <w:t xml:space="preserve"> and Pig diagonals with 15 and 16).</w:t>
-      </w:r>
-    </w:p>
-    <w:p>
-      <w:r>
-        <w:t>Diagonal entries are from a protein-cluster-disjoint 20% holdout of the same species; off-diagonal entries use a model trained on all source rows, with target rows in the training clusters removed. Pig and A. thaliana have few held-out positives, so their diagonal is correspondingly noisy.</w:t>
       </w:r>
     </w:p>
     <w:p>
@@ -4028,7 +4023,7 @@
     <w:p/>
     <w:p>
       <w:r>
-        <w:t>"Known" refers to the 557 S-palmitoyl cysteine sites annotated in UniProt 2026_03 for human proteins; "novel" sites are unannotated cysteines. FDR is estimated by target–decoy comparison against 20,000 shuffled-flank decoys scored with the forest view; the decoy tail is thin, so these tiers are candidate rankings rather than proven error rates.</w:t>
+        <w:t>"Known" refers to the 557 S-palmitoyl cysteine sites annotated in UniProt 2026_03 for human proteins; "novel" sites are unannotated cysteines. Empirical q-values are estimated by target–decoy comparison against 20,000 shuffled-flank decoys scored with the forest view; the decoy tail is thin, so these tiers are candidate rankings rather than proven error rates. Known-site recovery uses the 557 annotated human sites as its denominator.</w:t>
       </w:r>
     </w:p>
     <w:p>
@@ -4041,7 +4036,7 @@
           <w:color w:val="000000"/>
           <w:sz w:val="22"/>
         </w:rPr>
-        <w:t>2.12 A structure-aware prototype: useful inside the annotation distribution, not outside it</w:t>
+        <w:t>2.12 A paired structural analysis on annotated human sites</w:t>
       </w:r>
     </w:p>
     <w:p>
@@ -4428,12 +4423,12 @@
     </w:p>
     <w:p>
       <w:r>
-        <w:t>The cross-species experiments are deliberately descriptive. With orthologues available, most mammalian pairs transfer at 0.83–0.95 (18-cell mean 0.901), but Pig→Human is 0.834 and the plant→mammal direction is 0.739–0.785; without human-homologous clusters, human performance is 0.885. The matrix therefore shows heterogeneous transfer among sampled species and negative-sampling protocols, not a uniform eukaryotic code, and it does not isolate orthologue coverage as the cause. Bacterial lipidation is excluded rather than compared: after the label correction the bacterial positives are N-palmitoyl cysteines, a different modification.</w:t>
+        <w:t>The cross-species experiments are deliberately descriptive. Across the sampled species, most mammalian pairs transfer at 0.83–0.95 (18-cell mean 0.901), but Pig→Human is 0.834 and the plant→mammal direction is 0.739–0.785; without human-homologous clusters, human performance is 0.885. The matrix therefore shows heterogeneous transfer among sampled species and negative-sampling protocols, not a uniform eukaryotic code, and it does not isolate orthologue coverage as the cause. Bacterial lipidation is excluded rather than compared: after the label correction the bacterial positives are N-palmitoyl cysteines, a different modification.</w:t>
       </w:r>
     </w:p>
     <w:p>
       <w:r>
-        <w:t>Two design choices follow from the error analysis. First, the gap between inferred (AUC 0.947) and experimental sites (0.907) is an annotation-memory effect that any user should know about. Second, reporting a fixed 0.5 cut-off is less useful than reporting empirical operating points, provided their transfer is shown: at a 5% validation target the held-out precision is 0.900 and the observed false-discovery proportion 10.0%, so the nominal target is not a guarantee.</w:t>
+        <w:t>Two design choices follow from the error analysis. First, the gap between inferred (pooled AUC 0.941) and experimental sites (0.902) is an annotation-memory effect that any user should know about. Second, reporting a fixed 0.5 cut-off is less useful than reporting empirical operating points, provided their transfer is shown: at a 5% validation target the held-out precision is 0.900 and the observed false-discovery proportion 10.0%, so the nominal target is not a guarantee.</w:t>
       </w:r>
     </w:p>
     <w:p>
@@ -4645,7 +4640,7 @@
         <w:t>Arabidopsis thaliana</w:t>
       </w:r>
       <w:r>
-        <w:t>. For each source species one model (random forest plus ESM head) was trained on that species' positives and its same-protein negatives; human background negatives were excluded. Twenty percent of the source clusters were held out for the diagonal and another 15% for early stopping. Off-diagonal cells use the same model as their row. Target rows were restricted to positives and same-protein negatives and removed if their cluster appeared in either the fit or the validation split. Cells with fewer than 20 eligible test positives are reported as empty rather than estimated.</w:t>
+        <w:t>. For each source species one model (random forest plus ESM head) was trained on that species' positives and its same-protein negatives; fit and target rows exclude human background negatives, while the human early-stopping split also contains 6,298 background negatives (disclosed in §2.7). Twenty percent of the source clusters were held out for the diagonal and another 15% for early stopping. Off-diagonal cells use the same model as their row. Target rows were restricted to positives and same-protein negatives and removed if their cluster appeared in either the fit or the validation split. Cells with fewer than 20 eligible test positives are reported as empty rather than estimated.</w:t>
       </w:r>
     </w:p>
     <w:p>
@@ -5220,7 +5215,7 @@
         <w:rPr>
           <w:sz w:val="18"/>
         </w:rPr>
-        <w:t xml:space="preserve"> AUC of single-species PalmDL models, rows = training species, columns = test species, for the six species with at least 85 S-palmitoyl cysteine sites. Most mammalian pairs transfer at 0.83–0.95 with a pig→human exception; the plant model reaches 0.74–0.78 on mammals. Empty cells have fewer than 20 eligible test positives after cluster removal. Diagonal entries come from a protein-cluster-disjoint 20% holdout of the same species.</w:t>
+        <w:t xml:space="preserve"> AUC of single-species PalmDL models, rows = training species, columns = test species, for the six species with at least 85 S-palmitoyl cysteine sites. Most mammalian pairs transfer at 0.83–0.95 with a pig→human exception; the plant model reaches 0.739–0.785 on mammals. Empty cells have fewer than 20 eligible test positives after cluster removal. Diagonal entries come from a protein-cluster-disjoint 20% holdout of the same species.</w:t>
       </w:r>
     </w:p>
     <w:p>
@@ -5250,7 +5245,7 @@
         <w:rPr>
           <w:sz w:val="18"/>
         </w:rPr>
-        <w:t xml:space="preserve"> (a) Score distributions of all 262,286 human cysteines and of 20,000 shuffled-flank decoys (log scale). (b) Estimated FDR as a function of shortlist size, with the five reported tiers marked. (c) Composition of each tier: known UniProt sites versus novel cysteines.</w:t>
+        <w:t xml:space="preserve"> (a) Score distributions of all 262,286 human cysteines and of 20,000 shuffled-flank decoys (log scale). (b) Empirical q-value as a function of shortlist size, with the five reported tiers marked. (c) Composition of each tier: known UniProt sites versus novel cysteines.</w:t>
       </w:r>
     </w:p>
     <w:p>

</xml_diff>

<commit_message>
Sixth review round: causal wording, table notes, peripheral docs
</commit_message>
<xml_diff>
--- a/manuscript/PalmDL_manuscript.docx
+++ b/manuscript/PalmDL_manuscript.docx
@@ -2439,7 +2439,7 @@
     <w:p/>
     <w:p>
       <w:r>
-        <w:t xml:space="preserve">Fit and target rows exclude human background negatives; the human early-stopping split additionally contains 6,298 background negatives, unlike the other rows. Twenty percent of source clusters are held out for the diagonal and another 15% for early stopping. For the human source the early-stopping split also contained 6,298 background negatives, unlike the other rows; the 18-cell mammalian off-diagonal mean is 0.901. Target cells use only positives and same-protein negatives, and rows whose cluster appears in either the fit or the validation split are removed. Off-diagonal cells therefore share the model of their row, as stated in Methods. Dashes mark cells with fewer than 20 eligible test positives (Human→Pig 13, Mouse→Pig 19, and the </w:t>
+        <w:t xml:space="preserve">Fit and target rows exclude human background negatives; the human early-stopping split additionally contains 6,298 background negatives, unlike the other rows. Twenty percent of source clusters are held out for the diagonal and another 15% for early stopping; the 18-cell mammalian off-diagonal mean is 0.901. Target cells use only positives and same-protein negatives, and rows whose cluster appears in either the fit or the validation split are removed. Off-diagonal cells therefore share the model of their row, as stated in Methods. Dashes mark cells with fewer than 20 eligible test positives (Human→Pig 13, Mouse→Pig 19, and the </w:t>
       </w:r>
       <w:r>
         <w:rPr>
@@ -2475,7 +2475,7 @@
         <w:t>any</w:t>
       </w:r>
       <w:r>
-        <w:t xml:space="preserve"> evidence clause is experimental (ECO:0000269, 0007744, 0007005 or 0006056), which gives 455 experimental and 3,969 inferred sites; six mixed-clause sites were previously misclassified by a comma-only split and are now aligned with Table 6. Pooled performance is stable across annotated topologies (cytoplasmic 0.858, extracellular 0.828, topology unknown 0.900); the extracellular estimate draws on three of five folds with both classes and the lumenal class (14 positives) is not interpretable. These pooled values differ from the unweighted fold means in Table 1, which are the primary estimates. Topology is itself an input feature, so these strata describe where the model is accurate, not an independent validation of the topology signal.</w:t>
+        <w:t xml:space="preserve"> evidence clause is experimental (ECO:0000269, 0007744, 0007005 or 0006056), which gives 455 experimental and 3,969 inferred sites; six mixed-clause sites were previously misclassified by a comma-only split and are now aligned with Table 6. Pooled performance is stable across annotated topologies (cytoplasmic 0.858, extracellular 0.828, topology unknown 0.900); the extracellular stratum contains 27 positives distributed across three folds while its pooled metrics include rows from all five folds, so it should be interpreted cautiously; the lumenal class (14 positives) is not interpretable. These pooled values differ from the unweighted fold means in Table 1, which are the primary estimates. Topology is itself an input feature, so these strata describe where the model is accurate, not an independent validation of the topology signal.</w:t>
       </w:r>
     </w:p>
     <w:p>
@@ -2951,6 +2951,21 @@
       </w:tr>
     </w:tbl>
     <w:p/>
+    <w:p>
+      <w:r>
+        <w:rPr>
+          <w:b/>
+          <w:sz w:val="18"/>
+        </w:rPr>
+        <w:t>Table 6 note.</w:t>
+      </w:r>
+      <w:r>
+        <w:rPr>
+          <w:sz w:val="18"/>
+        </w:rPr>
+        <w:t xml:space="preserve"> AUC and AUPR pool all outer-test predictions. Evidence strata use their positives plus all 62,842 negatives; topology strata use rows in the same compartment. The extracellular stratum has 27 positives in three folds, while its pooled metrics include rows from all five folds.</w:t>
+      </w:r>
+    </w:p>
     <w:p>
       <w:pPr>
         <w:pStyle w:val="Heading2"/>
@@ -4023,7 +4038,7 @@
     <w:p/>
     <w:p>
       <w:r>
-        <w:t>The extracellular stratum pools rows from all five folds even though only three folds contain positives of both classes, so its AUC is a pooled estimate with an unbalanced fold composition. "Known" refers to the 557 S-palmitoyl cysteine sites annotated in UniProt 2026_03 for human proteins; "novel" sites are unannotated cysteines. Empirical q-values are estimated by target–decoy comparison against 20,000 shuffled-flank decoys scored with the forest view; the decoy tail is thin, so these tiers are candidate rankings rather than proven error rates. Known-site recovery uses the 557 annotated human sites as its denominator.</w:t>
+        <w:t>"Known" refers to the 557 S-palmitoyl cysteine sites annotated in UniProt 2026_03 for human proteins; "novel" sites are unannotated cysteines. Empirical q-values are estimated by target–decoy comparison against 20,000 shuffled-flank decoys scored with the forest view; the decoy tail is thin, so these tiers are candidate rankings rather than proven error rates. Known-site recovery uses the 557 annotated human sites as its denominator.</w:t>
       </w:r>
     </w:p>
     <w:p>
@@ -4428,7 +4443,7 @@
     </w:p>
     <w:p>
       <w:r>
-        <w:t>Two design choices follow from the error analysis. First, the gap between inferred (pooled AUC 0.941) and experimental sites (0.902) is an annotation-memory effect that any user should know about. Second, reporting a fixed 0.5 cut-off is less useful than reporting empirical operating points, provided their transfer is shown: at a 5% validation target the held-out precision is 0.900 and the observed false-discovery proportion 10.0%, so the nominal target is not a guarantee.</w:t>
+        <w:t>Two design choices follow from the error analysis. First, pooled AUC is 0.941 for inferred sites and 0.902 for experimentally supported sites; this evidence-tier difference matters to users and does not by itself identify its biological or annotation-related cause. Second, reporting a fixed 0.5 cut-off is less useful than reporting empirical operating points, provided their transfer is shown: at a 5% validation target the held-out precision is 0.900 and the observed false-discovery proportion 10.0%, so the nominal target is not a guarantee.</w:t>
       </w:r>
     </w:p>
     <w:p>

</xml_diff>